<commit_message>
Added the problem statement
</commit_message>
<xml_diff>
--- a/Docs/PED/PED v1.4.docx
+++ b/Docs/PED/PED v1.4.docx
@@ -10,6 +10,7 @@
           <w:docPartUnique/>
         </w:docPartObj>
       </w:sdtPr>
+      <w:sdtEndPr/>
       <w:sdtContent>
         <w:p/>
         <w:p>
@@ -94,6 +95,7 @@
                                     <w:dataBinding w:prefixMappings="xmlns:ns0='http://purl.org/dc/elements/1.1/' xmlns:ns1='http://schemas.openxmlformats.org/package/2006/metadata/core-properties' " w:xpath="/ns1:coreProperties[1]/ns0:title[1]" w:storeItemID="{6C3C8BC8-F283-45AE-878A-BAB7291924A1}"/>
                                     <w:text/>
                                   </w:sdtPr>
+                                  <w:sdtEndPr/>
                                   <w:sdtContent>
                                     <w:r>
                                       <w:rPr>
@@ -120,6 +122,7 @@
                                   <w:dataBinding w:prefixMappings="xmlns:ns0='http://purl.org/dc/elements/1.1/' xmlns:ns1='http://schemas.openxmlformats.org/package/2006/metadata/core-properties' " w:xpath="/ns1:coreProperties[1]/ns0:subject[1]" w:storeItemID="{6C3C8BC8-F283-45AE-878A-BAB7291924A1}"/>
                                   <w:text/>
                                 </w:sdtPr>
+                                <w:sdtEndPr/>
                                 <w:sdtContent>
                                   <w:p>
                                     <w:pPr>
@@ -234,6 +237,7 @@
                               <w:dataBinding w:prefixMappings="xmlns:ns0='http://purl.org/dc/elements/1.1/' xmlns:ns1='http://schemas.openxmlformats.org/package/2006/metadata/core-properties' " w:xpath="/ns1:coreProperties[1]/ns0:title[1]" w:storeItemID="{6C3C8BC8-F283-45AE-878A-BAB7291924A1}"/>
                               <w:text/>
                             </w:sdtPr>
+                            <w:sdtEndPr/>
                             <w:sdtContent>
                               <w:r>
                                 <w:rPr>
@@ -260,6 +264,7 @@
                             <w:dataBinding w:prefixMappings="xmlns:ns0='http://purl.org/dc/elements/1.1/' xmlns:ns1='http://schemas.openxmlformats.org/package/2006/metadata/core-properties' " w:xpath="/ns1:coreProperties[1]/ns0:subject[1]" w:storeItemID="{6C3C8BC8-F283-45AE-878A-BAB7291924A1}"/>
                             <w:text/>
                           </w:sdtPr>
+                          <w:sdtEndPr/>
                           <w:sdtContent>
                             <w:p>
                               <w:pPr>
@@ -416,6 +421,7 @@
                                     <w:calendar w:val="gregorian"/>
                                   </w:date>
                                 </w:sdtPr>
+                                <w:sdtEndPr/>
                                 <w:sdtContent>
                                   <w:p>
                                     <w:pPr>
@@ -482,6 +488,7 @@
                               <w:calendar w:val="gregorian"/>
                             </w:date>
                           </w:sdtPr>
+                          <w:sdtEndPr/>
                           <w:sdtContent>
                             <w:p>
                               <w:pPr>
@@ -573,7 +580,7 @@
           <w:r>
             <w:fldChar w:fldCharType="separate"/>
           </w:r>
-          <w:hyperlink w:anchor="_Toc239866562" w:history="1">
+          <w:hyperlink w:anchor="_Toc239871303" w:history="1">
             <w:r>
               <w:rPr>
                 <w:rStyle w:val="Hyperlink"/>
@@ -600,7 +607,7 @@
                 <w:noProof/>
                 <w:webHidden/>
               </w:rPr>
-              <w:instrText xml:space="preserve"> PAGEREF _Toc239866562 \h </w:instrText>
+              <w:instrText xml:space="preserve"> PAGEREF _Toc239871303 \h </w:instrText>
             </w:r>
             <w:r>
               <w:rPr>
@@ -644,7 +651,7 @@
               <w:lang w:eastAsia="en-ZA"/>
             </w:rPr>
           </w:pPr>
-          <w:hyperlink w:anchor="_Toc239866563" w:history="1">
+          <w:hyperlink w:anchor="_Toc239871304" w:history="1">
             <w:r>
               <w:rPr>
                 <w:rStyle w:val="Hyperlink"/>
@@ -671,7 +678,7 @@
                 <w:noProof/>
                 <w:webHidden/>
               </w:rPr>
-              <w:instrText xml:space="preserve"> PAGEREF _Toc239866563 \h </w:instrText>
+              <w:instrText xml:space="preserve"> PAGEREF _Toc239871304 \h </w:instrText>
             </w:r>
             <w:r>
               <w:rPr>
@@ -715,7 +722,7 @@
               <w:lang w:eastAsia="en-ZA"/>
             </w:rPr>
           </w:pPr>
-          <w:hyperlink w:anchor="_Toc239866564" w:history="1">
+          <w:hyperlink w:anchor="_Toc239871305" w:history="1">
             <w:r>
               <w:rPr>
                 <w:rStyle w:val="Hyperlink"/>
@@ -742,7 +749,7 @@
                 <w:noProof/>
                 <w:webHidden/>
               </w:rPr>
-              <w:instrText xml:space="preserve"> PAGEREF _Toc239866564 \h </w:instrText>
+              <w:instrText xml:space="preserve"> PAGEREF _Toc239871305 \h </w:instrText>
             </w:r>
             <w:r>
               <w:rPr>
@@ -786,7 +793,7 @@
               <w:lang w:eastAsia="en-ZA"/>
             </w:rPr>
           </w:pPr>
-          <w:hyperlink w:anchor="_Toc239866565" w:history="1">
+          <w:hyperlink w:anchor="_Toc239871306" w:history="1">
             <w:r>
               <w:rPr>
                 <w:rStyle w:val="Hyperlink"/>
@@ -813,7 +820,7 @@
                 <w:noProof/>
                 <w:webHidden/>
               </w:rPr>
-              <w:instrText xml:space="preserve"> PAGEREF _Toc239866565 \h </w:instrText>
+              <w:instrText xml:space="preserve"> PAGEREF _Toc239871306 \h </w:instrText>
             </w:r>
             <w:r>
               <w:rPr>
@@ -833,7 +840,7 @@
                 <w:noProof/>
                 <w:webHidden/>
               </w:rPr>
-              <w:t>3</w:t>
+              <w:t>4</w:t>
             </w:r>
             <w:r>
               <w:rPr>
@@ -857,7 +864,7 @@
               <w:lang w:eastAsia="en-ZA"/>
             </w:rPr>
           </w:pPr>
-          <w:hyperlink w:anchor="_Toc239866566" w:history="1">
+          <w:hyperlink w:anchor="_Toc239871307" w:history="1">
             <w:r>
               <w:rPr>
                 <w:rStyle w:val="Hyperlink"/>
@@ -884,7 +891,7 @@
                 <w:noProof/>
                 <w:webHidden/>
               </w:rPr>
-              <w:instrText xml:space="preserve"> PAGEREF _Toc239866566 \h </w:instrText>
+              <w:instrText xml:space="preserve"> PAGEREF _Toc239871307 \h </w:instrText>
             </w:r>
             <w:r>
               <w:rPr>
@@ -928,7 +935,7 @@
               <w:lang w:eastAsia="en-ZA"/>
             </w:rPr>
           </w:pPr>
-          <w:hyperlink w:anchor="_Toc239866567" w:history="1">
+          <w:hyperlink w:anchor="_Toc239871308" w:history="1">
             <w:r>
               <w:rPr>
                 <w:rStyle w:val="Hyperlink"/>
@@ -955,7 +962,7 @@
                 <w:noProof/>
                 <w:webHidden/>
               </w:rPr>
-              <w:instrText xml:space="preserve"> PAGEREF _Toc239866567 \h </w:instrText>
+              <w:instrText xml:space="preserve"> PAGEREF _Toc239871308 \h </w:instrText>
             </w:r>
             <w:r>
               <w:rPr>
@@ -999,7 +1006,7 @@
               <w:lang w:eastAsia="en-ZA"/>
             </w:rPr>
           </w:pPr>
-          <w:hyperlink w:anchor="_Toc239866568" w:history="1">
+          <w:hyperlink w:anchor="_Toc239871309" w:history="1">
             <w:r>
               <w:rPr>
                 <w:rStyle w:val="Hyperlink"/>
@@ -1026,7 +1033,7 @@
                 <w:noProof/>
                 <w:webHidden/>
               </w:rPr>
-              <w:instrText xml:space="preserve"> PAGEREF _Toc239866568 \h </w:instrText>
+              <w:instrText xml:space="preserve"> PAGEREF _Toc239871309 \h </w:instrText>
             </w:r>
             <w:r>
               <w:rPr>
@@ -1070,7 +1077,7 @@
               <w:lang w:eastAsia="en-ZA"/>
             </w:rPr>
           </w:pPr>
-          <w:hyperlink w:anchor="_Toc239866569" w:history="1">
+          <w:hyperlink w:anchor="_Toc239871310" w:history="1">
             <w:r>
               <w:rPr>
                 <w:rStyle w:val="Hyperlink"/>
@@ -1097,7 +1104,7 @@
                 <w:noProof/>
                 <w:webHidden/>
               </w:rPr>
-              <w:instrText xml:space="preserve"> PAGEREF _Toc239866569 \h </w:instrText>
+              <w:instrText xml:space="preserve"> PAGEREF _Toc239871310 \h </w:instrText>
             </w:r>
             <w:r>
               <w:rPr>
@@ -1141,7 +1148,7 @@
               <w:lang w:eastAsia="en-ZA"/>
             </w:rPr>
           </w:pPr>
-          <w:hyperlink w:anchor="_Toc239866570" w:history="1">
+          <w:hyperlink w:anchor="_Toc239871311" w:history="1">
             <w:r>
               <w:rPr>
                 <w:rStyle w:val="Hyperlink"/>
@@ -1168,7 +1175,7 @@
                 <w:noProof/>
                 <w:webHidden/>
               </w:rPr>
-              <w:instrText xml:space="preserve"> PAGEREF _Toc239866570 \h </w:instrText>
+              <w:instrText xml:space="preserve"> PAGEREF _Toc239871311 \h </w:instrText>
             </w:r>
             <w:r>
               <w:rPr>
@@ -1188,7 +1195,7 @@
                 <w:noProof/>
                 <w:webHidden/>
               </w:rPr>
-              <w:t>6</w:t>
+              <w:t>7</w:t>
             </w:r>
             <w:r>
               <w:rPr>
@@ -1212,7 +1219,7 @@
               <w:lang w:eastAsia="en-ZA"/>
             </w:rPr>
           </w:pPr>
-          <w:hyperlink w:anchor="_Toc239866571" w:history="1">
+          <w:hyperlink w:anchor="_Toc239871312" w:history="1">
             <w:r>
               <w:rPr>
                 <w:rStyle w:val="Hyperlink"/>
@@ -1239,7 +1246,7 @@
                 <w:noProof/>
                 <w:webHidden/>
               </w:rPr>
-              <w:instrText xml:space="preserve"> PAGEREF _Toc239866571 \h </w:instrText>
+              <w:instrText xml:space="preserve"> PAGEREF _Toc239871312 \h </w:instrText>
             </w:r>
             <w:r>
               <w:rPr>
@@ -1283,7 +1290,7 @@
               <w:lang w:eastAsia="en-ZA"/>
             </w:rPr>
           </w:pPr>
-          <w:hyperlink w:anchor="_Toc239866572" w:history="1">
+          <w:hyperlink w:anchor="_Toc239871313" w:history="1">
             <w:r>
               <w:rPr>
                 <w:rStyle w:val="Hyperlink"/>
@@ -1310,7 +1317,7 @@
                 <w:noProof/>
                 <w:webHidden/>
               </w:rPr>
-              <w:instrText xml:space="preserve"> PAGEREF _Toc239866572 \h </w:instrText>
+              <w:instrText xml:space="preserve"> PAGEREF _Toc239871313 \h </w:instrText>
             </w:r>
             <w:r>
               <w:rPr>
@@ -1330,7 +1337,7 @@
                 <w:noProof/>
                 <w:webHidden/>
               </w:rPr>
-              <w:t>9</w:t>
+              <w:t>10</w:t>
             </w:r>
             <w:r>
               <w:rPr>
@@ -1354,7 +1361,7 @@
               <w:lang w:eastAsia="en-ZA"/>
             </w:rPr>
           </w:pPr>
-          <w:hyperlink w:anchor="_Toc239866573" w:history="1">
+          <w:hyperlink w:anchor="_Toc239871314" w:history="1">
             <w:r>
               <w:rPr>
                 <w:rStyle w:val="Hyperlink"/>
@@ -1381,7 +1388,7 @@
                 <w:noProof/>
                 <w:webHidden/>
               </w:rPr>
-              <w:instrText xml:space="preserve"> PAGEREF _Toc239866573 \h </w:instrText>
+              <w:instrText xml:space="preserve"> PAGEREF _Toc239871314 \h </w:instrText>
             </w:r>
             <w:r>
               <w:rPr>
@@ -1401,7 +1408,7 @@
                 <w:noProof/>
                 <w:webHidden/>
               </w:rPr>
-              <w:t>9</w:t>
+              <w:t>10</w:t>
             </w:r>
             <w:r>
               <w:rPr>
@@ -1425,7 +1432,7 @@
               <w:lang w:eastAsia="en-ZA"/>
             </w:rPr>
           </w:pPr>
-          <w:hyperlink w:anchor="_Toc239866574" w:history="1">
+          <w:hyperlink w:anchor="_Toc239871315" w:history="1">
             <w:r>
               <w:rPr>
                 <w:rStyle w:val="Hyperlink"/>
@@ -1452,7 +1459,7 @@
                 <w:noProof/>
                 <w:webHidden/>
               </w:rPr>
-              <w:instrText xml:space="preserve"> PAGEREF _Toc239866574 \h </w:instrText>
+              <w:instrText xml:space="preserve"> PAGEREF _Toc239871315 \h </w:instrText>
             </w:r>
             <w:r>
               <w:rPr>
@@ -1496,7 +1503,7 @@
               <w:lang w:eastAsia="en-ZA"/>
             </w:rPr>
           </w:pPr>
-          <w:hyperlink w:anchor="_Toc239866575" w:history="1">
+          <w:hyperlink w:anchor="_Toc239871316" w:history="1">
             <w:r>
               <w:rPr>
                 <w:rStyle w:val="Hyperlink"/>
@@ -1523,7 +1530,7 @@
                 <w:noProof/>
                 <w:webHidden/>
               </w:rPr>
-              <w:instrText xml:space="preserve"> PAGEREF _Toc239866575 \h </w:instrText>
+              <w:instrText xml:space="preserve"> PAGEREF _Toc239871316 \h </w:instrText>
             </w:r>
             <w:r>
               <w:rPr>
@@ -1543,7 +1550,7 @@
                 <w:noProof/>
                 <w:webHidden/>
               </w:rPr>
-              <w:t>10</w:t>
+              <w:t>11</w:t>
             </w:r>
             <w:r>
               <w:rPr>
@@ -1567,7 +1574,7 @@
               <w:lang w:eastAsia="en-ZA"/>
             </w:rPr>
           </w:pPr>
-          <w:hyperlink w:anchor="_Toc239866576" w:history="1">
+          <w:hyperlink w:anchor="_Toc239871317" w:history="1">
             <w:r>
               <w:rPr>
                 <w:rStyle w:val="Hyperlink"/>
@@ -1594,7 +1601,7 @@
                 <w:noProof/>
                 <w:webHidden/>
               </w:rPr>
-              <w:instrText xml:space="preserve"> PAGEREF _Toc239866576 \h </w:instrText>
+              <w:instrText xml:space="preserve"> PAGEREF _Toc239871317 \h </w:instrText>
             </w:r>
             <w:r>
               <w:rPr>
@@ -1614,7 +1621,433 @@
                 <w:noProof/>
                 <w:webHidden/>
               </w:rPr>
-              <w:t>10</w:t>
+              <w:t>11</w:t>
+            </w:r>
+            <w:r>
+              <w:rPr>
+                <w:noProof/>
+                <w:webHidden/>
+              </w:rPr>
+              <w:fldChar w:fldCharType="end"/>
+            </w:r>
+          </w:hyperlink>
+        </w:p>
+        <w:p>
+          <w:pPr>
+            <w:pStyle w:val="TOC2"/>
+            <w:tabs>
+              <w:tab w:val="right" w:leader="dot" w:pos="9016"/>
+            </w:tabs>
+            <w:rPr>
+              <w:rFonts w:asciiTheme="minorHAnsi" w:eastAsiaTheme="minorEastAsia" w:hAnsiTheme="minorHAnsi"/>
+              <w:noProof/>
+              <w:szCs w:val="24"/>
+              <w:lang w:eastAsia="en-ZA"/>
+            </w:rPr>
+          </w:pPr>
+          <w:hyperlink w:anchor="_Toc239871318" w:history="1">
+            <w:r>
+              <w:rPr>
+                <w:rStyle w:val="Hyperlink"/>
+                <w:noProof/>
+              </w:rPr>
+              <w:t>RSK-001</w:t>
+            </w:r>
+            <w:r>
+              <w:rPr>
+                <w:noProof/>
+                <w:webHidden/>
+              </w:rPr>
+              <w:tab/>
+            </w:r>
+            <w:r>
+              <w:rPr>
+                <w:noProof/>
+                <w:webHidden/>
+              </w:rPr>
+              <w:fldChar w:fldCharType="begin"/>
+            </w:r>
+            <w:r>
+              <w:rPr>
+                <w:noProof/>
+                <w:webHidden/>
+              </w:rPr>
+              <w:instrText xml:space="preserve"> PAGEREF _Toc239871318 \h </w:instrText>
+            </w:r>
+            <w:r>
+              <w:rPr>
+                <w:noProof/>
+                <w:webHidden/>
+              </w:rPr>
+            </w:r>
+            <w:r>
+              <w:rPr>
+                <w:noProof/>
+                <w:webHidden/>
+              </w:rPr>
+              <w:fldChar w:fldCharType="separate"/>
+            </w:r>
+            <w:r>
+              <w:rPr>
+                <w:noProof/>
+                <w:webHidden/>
+              </w:rPr>
+              <w:t>11</w:t>
+            </w:r>
+            <w:r>
+              <w:rPr>
+                <w:noProof/>
+                <w:webHidden/>
+              </w:rPr>
+              <w:fldChar w:fldCharType="end"/>
+            </w:r>
+          </w:hyperlink>
+        </w:p>
+        <w:p>
+          <w:pPr>
+            <w:pStyle w:val="TOC2"/>
+            <w:tabs>
+              <w:tab w:val="right" w:leader="dot" w:pos="9016"/>
+            </w:tabs>
+            <w:rPr>
+              <w:rFonts w:asciiTheme="minorHAnsi" w:eastAsiaTheme="minorEastAsia" w:hAnsiTheme="minorHAnsi"/>
+              <w:noProof/>
+              <w:szCs w:val="24"/>
+              <w:lang w:eastAsia="en-ZA"/>
+            </w:rPr>
+          </w:pPr>
+          <w:hyperlink w:anchor="_Toc239871319" w:history="1">
+            <w:r>
+              <w:rPr>
+                <w:rStyle w:val="Hyperlink"/>
+                <w:noProof/>
+              </w:rPr>
+              <w:t>RSK-002</w:t>
+            </w:r>
+            <w:r>
+              <w:rPr>
+                <w:noProof/>
+                <w:webHidden/>
+              </w:rPr>
+              <w:tab/>
+            </w:r>
+            <w:r>
+              <w:rPr>
+                <w:noProof/>
+                <w:webHidden/>
+              </w:rPr>
+              <w:fldChar w:fldCharType="begin"/>
+            </w:r>
+            <w:r>
+              <w:rPr>
+                <w:noProof/>
+                <w:webHidden/>
+              </w:rPr>
+              <w:instrText xml:space="preserve"> PAGEREF _Toc239871319 \h </w:instrText>
+            </w:r>
+            <w:r>
+              <w:rPr>
+                <w:noProof/>
+                <w:webHidden/>
+              </w:rPr>
+            </w:r>
+            <w:r>
+              <w:rPr>
+                <w:noProof/>
+                <w:webHidden/>
+              </w:rPr>
+              <w:fldChar w:fldCharType="separate"/>
+            </w:r>
+            <w:r>
+              <w:rPr>
+                <w:noProof/>
+                <w:webHidden/>
+              </w:rPr>
+              <w:t>11</w:t>
+            </w:r>
+            <w:r>
+              <w:rPr>
+                <w:noProof/>
+                <w:webHidden/>
+              </w:rPr>
+              <w:fldChar w:fldCharType="end"/>
+            </w:r>
+          </w:hyperlink>
+        </w:p>
+        <w:p>
+          <w:pPr>
+            <w:pStyle w:val="TOC2"/>
+            <w:tabs>
+              <w:tab w:val="right" w:leader="dot" w:pos="9016"/>
+            </w:tabs>
+            <w:rPr>
+              <w:rFonts w:asciiTheme="minorHAnsi" w:eastAsiaTheme="minorEastAsia" w:hAnsiTheme="minorHAnsi"/>
+              <w:noProof/>
+              <w:szCs w:val="24"/>
+              <w:lang w:eastAsia="en-ZA"/>
+            </w:rPr>
+          </w:pPr>
+          <w:hyperlink w:anchor="_Toc239871320" w:history="1">
+            <w:r>
+              <w:rPr>
+                <w:rStyle w:val="Hyperlink"/>
+                <w:noProof/>
+              </w:rPr>
+              <w:t>RSK-003</w:t>
+            </w:r>
+            <w:r>
+              <w:rPr>
+                <w:noProof/>
+                <w:webHidden/>
+              </w:rPr>
+              <w:tab/>
+            </w:r>
+            <w:r>
+              <w:rPr>
+                <w:noProof/>
+                <w:webHidden/>
+              </w:rPr>
+              <w:fldChar w:fldCharType="begin"/>
+            </w:r>
+            <w:r>
+              <w:rPr>
+                <w:noProof/>
+                <w:webHidden/>
+              </w:rPr>
+              <w:instrText xml:space="preserve"> PAGEREF _Toc239871320 \h </w:instrText>
+            </w:r>
+            <w:r>
+              <w:rPr>
+                <w:noProof/>
+                <w:webHidden/>
+              </w:rPr>
+            </w:r>
+            <w:r>
+              <w:rPr>
+                <w:noProof/>
+                <w:webHidden/>
+              </w:rPr>
+              <w:fldChar w:fldCharType="separate"/>
+            </w:r>
+            <w:r>
+              <w:rPr>
+                <w:noProof/>
+                <w:webHidden/>
+              </w:rPr>
+              <w:t>12</w:t>
+            </w:r>
+            <w:r>
+              <w:rPr>
+                <w:noProof/>
+                <w:webHidden/>
+              </w:rPr>
+              <w:fldChar w:fldCharType="end"/>
+            </w:r>
+          </w:hyperlink>
+        </w:p>
+        <w:p>
+          <w:pPr>
+            <w:pStyle w:val="TOC2"/>
+            <w:tabs>
+              <w:tab w:val="right" w:leader="dot" w:pos="9016"/>
+            </w:tabs>
+            <w:rPr>
+              <w:rFonts w:asciiTheme="minorHAnsi" w:eastAsiaTheme="minorEastAsia" w:hAnsiTheme="minorHAnsi"/>
+              <w:noProof/>
+              <w:szCs w:val="24"/>
+              <w:lang w:eastAsia="en-ZA"/>
+            </w:rPr>
+          </w:pPr>
+          <w:hyperlink w:anchor="_Toc239871321" w:history="1">
+            <w:r>
+              <w:rPr>
+                <w:rStyle w:val="Hyperlink"/>
+                <w:noProof/>
+              </w:rPr>
+              <w:t>RSK-004</w:t>
+            </w:r>
+            <w:r>
+              <w:rPr>
+                <w:noProof/>
+                <w:webHidden/>
+              </w:rPr>
+              <w:tab/>
+            </w:r>
+            <w:r>
+              <w:rPr>
+                <w:noProof/>
+                <w:webHidden/>
+              </w:rPr>
+              <w:fldChar w:fldCharType="begin"/>
+            </w:r>
+            <w:r>
+              <w:rPr>
+                <w:noProof/>
+                <w:webHidden/>
+              </w:rPr>
+              <w:instrText xml:space="preserve"> PAGEREF _Toc239871321 \h </w:instrText>
+            </w:r>
+            <w:r>
+              <w:rPr>
+                <w:noProof/>
+                <w:webHidden/>
+              </w:rPr>
+            </w:r>
+            <w:r>
+              <w:rPr>
+                <w:noProof/>
+                <w:webHidden/>
+              </w:rPr>
+              <w:fldChar w:fldCharType="separate"/>
+            </w:r>
+            <w:r>
+              <w:rPr>
+                <w:noProof/>
+                <w:webHidden/>
+              </w:rPr>
+              <w:t>12</w:t>
+            </w:r>
+            <w:r>
+              <w:rPr>
+                <w:noProof/>
+                <w:webHidden/>
+              </w:rPr>
+              <w:fldChar w:fldCharType="end"/>
+            </w:r>
+          </w:hyperlink>
+        </w:p>
+        <w:p>
+          <w:pPr>
+            <w:pStyle w:val="TOC2"/>
+            <w:tabs>
+              <w:tab w:val="right" w:leader="dot" w:pos="9016"/>
+            </w:tabs>
+            <w:rPr>
+              <w:rFonts w:asciiTheme="minorHAnsi" w:eastAsiaTheme="minorEastAsia" w:hAnsiTheme="minorHAnsi"/>
+              <w:noProof/>
+              <w:szCs w:val="24"/>
+              <w:lang w:eastAsia="en-ZA"/>
+            </w:rPr>
+          </w:pPr>
+          <w:hyperlink w:anchor="_Toc239871322" w:history="1">
+            <w:r>
+              <w:rPr>
+                <w:rStyle w:val="Hyperlink"/>
+                <w:noProof/>
+              </w:rPr>
+              <w:t>RSK-005</w:t>
+            </w:r>
+            <w:r>
+              <w:rPr>
+                <w:noProof/>
+                <w:webHidden/>
+              </w:rPr>
+              <w:tab/>
+            </w:r>
+            <w:r>
+              <w:rPr>
+                <w:noProof/>
+                <w:webHidden/>
+              </w:rPr>
+              <w:fldChar w:fldCharType="begin"/>
+            </w:r>
+            <w:r>
+              <w:rPr>
+                <w:noProof/>
+                <w:webHidden/>
+              </w:rPr>
+              <w:instrText xml:space="preserve"> PAGEREF _Toc239871322 \h </w:instrText>
+            </w:r>
+            <w:r>
+              <w:rPr>
+                <w:noProof/>
+                <w:webHidden/>
+              </w:rPr>
+            </w:r>
+            <w:r>
+              <w:rPr>
+                <w:noProof/>
+                <w:webHidden/>
+              </w:rPr>
+              <w:fldChar w:fldCharType="separate"/>
+            </w:r>
+            <w:r>
+              <w:rPr>
+                <w:noProof/>
+                <w:webHidden/>
+              </w:rPr>
+              <w:t>13</w:t>
+            </w:r>
+            <w:r>
+              <w:rPr>
+                <w:noProof/>
+                <w:webHidden/>
+              </w:rPr>
+              <w:fldChar w:fldCharType="end"/>
+            </w:r>
+          </w:hyperlink>
+        </w:p>
+        <w:p>
+          <w:pPr>
+            <w:pStyle w:val="TOC2"/>
+            <w:tabs>
+              <w:tab w:val="right" w:leader="dot" w:pos="9016"/>
+            </w:tabs>
+            <w:rPr>
+              <w:rFonts w:asciiTheme="minorHAnsi" w:eastAsiaTheme="minorEastAsia" w:hAnsiTheme="minorHAnsi"/>
+              <w:noProof/>
+              <w:szCs w:val="24"/>
+              <w:lang w:eastAsia="en-ZA"/>
+            </w:rPr>
+          </w:pPr>
+          <w:hyperlink w:anchor="_Toc239871323" w:history="1">
+            <w:r>
+              <w:rPr>
+                <w:rStyle w:val="Hyperlink"/>
+                <w:noProof/>
+              </w:rPr>
+              <w:t>RSK-006</w:t>
+            </w:r>
+            <w:r>
+              <w:rPr>
+                <w:noProof/>
+                <w:webHidden/>
+              </w:rPr>
+              <w:tab/>
+            </w:r>
+            <w:r>
+              <w:rPr>
+                <w:noProof/>
+                <w:webHidden/>
+              </w:rPr>
+              <w:fldChar w:fldCharType="begin"/>
+            </w:r>
+            <w:r>
+              <w:rPr>
+                <w:noProof/>
+                <w:webHidden/>
+              </w:rPr>
+              <w:instrText xml:space="preserve"> PAGEREF _Toc239871323 \h </w:instrText>
+            </w:r>
+            <w:r>
+              <w:rPr>
+                <w:noProof/>
+                <w:webHidden/>
+              </w:rPr>
+            </w:r>
+            <w:r>
+              <w:rPr>
+                <w:noProof/>
+                <w:webHidden/>
+              </w:rPr>
+              <w:fldChar w:fldCharType="separate"/>
+            </w:r>
+            <w:r>
+              <w:rPr>
+                <w:noProof/>
+                <w:webHidden/>
+              </w:rPr>
+              <w:t>13</w:t>
             </w:r>
             <w:r>
               <w:rPr>
@@ -1638,7 +2071,7 @@
               <w:lang w:eastAsia="en-ZA"/>
             </w:rPr>
           </w:pPr>
-          <w:hyperlink w:anchor="_Toc239866577" w:history="1">
+          <w:hyperlink w:anchor="_Toc239871324" w:history="1">
             <w:r>
               <w:rPr>
                 <w:rStyle w:val="Hyperlink"/>
@@ -1665,7 +2098,7 @@
                 <w:noProof/>
                 <w:webHidden/>
               </w:rPr>
-              <w:instrText xml:space="preserve"> PAGEREF _Toc239866577 \h </w:instrText>
+              <w:instrText xml:space="preserve"> PAGEREF _Toc239871324 \h </w:instrText>
             </w:r>
             <w:r>
               <w:rPr>
@@ -1685,7 +2118,7 @@
                 <w:noProof/>
                 <w:webHidden/>
               </w:rPr>
-              <w:t>11</w:t>
+              <w:t>14</w:t>
             </w:r>
             <w:r>
               <w:rPr>
@@ -1709,13 +2142,13 @@
               <w:lang w:eastAsia="en-ZA"/>
             </w:rPr>
           </w:pPr>
-          <w:hyperlink w:anchor="_Toc239866578" w:history="1">
+          <w:hyperlink w:anchor="_Toc239871325" w:history="1">
             <w:r>
               <w:rPr>
                 <w:rStyle w:val="Hyperlink"/>
                 <w:noProof/>
               </w:rPr>
-              <w:t>Governance</w:t>
+              <w:t>References</w:t>
             </w:r>
             <w:r>
               <w:rPr>
@@ -1736,7 +2169,7 @@
                 <w:noProof/>
                 <w:webHidden/>
               </w:rPr>
-              <w:instrText xml:space="preserve"> PAGEREF _Toc239866578 \h </w:instrText>
+              <w:instrText xml:space="preserve"> PAGEREF _Toc239871325 \h </w:instrText>
             </w:r>
             <w:r>
               <w:rPr>
@@ -1756,149 +2189,7 @@
                 <w:noProof/>
                 <w:webHidden/>
               </w:rPr>
-              <w:t>11</w:t>
-            </w:r>
-            <w:r>
-              <w:rPr>
-                <w:noProof/>
-                <w:webHidden/>
-              </w:rPr>
-              <w:fldChar w:fldCharType="end"/>
-            </w:r>
-          </w:hyperlink>
-        </w:p>
-        <w:p>
-          <w:pPr>
-            <w:pStyle w:val="TOC1"/>
-            <w:tabs>
-              <w:tab w:val="right" w:leader="dot" w:pos="9016"/>
-            </w:tabs>
-            <w:rPr>
-              <w:rFonts w:asciiTheme="minorHAnsi" w:eastAsiaTheme="minorEastAsia" w:hAnsiTheme="minorHAnsi"/>
-              <w:noProof/>
-              <w:szCs w:val="24"/>
-              <w:lang w:eastAsia="en-ZA"/>
-            </w:rPr>
-          </w:pPr>
-          <w:hyperlink w:anchor="_Toc239866579" w:history="1">
-            <w:r>
-              <w:rPr>
-                <w:rStyle w:val="Hyperlink"/>
-                <w:noProof/>
-              </w:rPr>
-              <w:t>Baseline</w:t>
-            </w:r>
-            <w:r>
-              <w:rPr>
-                <w:noProof/>
-                <w:webHidden/>
-              </w:rPr>
-              <w:tab/>
-            </w:r>
-            <w:r>
-              <w:rPr>
-                <w:noProof/>
-                <w:webHidden/>
-              </w:rPr>
-              <w:fldChar w:fldCharType="begin"/>
-            </w:r>
-            <w:r>
-              <w:rPr>
-                <w:noProof/>
-                <w:webHidden/>
-              </w:rPr>
-              <w:instrText xml:space="preserve"> PAGEREF _Toc239866579 \h </w:instrText>
-            </w:r>
-            <w:r>
-              <w:rPr>
-                <w:noProof/>
-                <w:webHidden/>
-              </w:rPr>
-            </w:r>
-            <w:r>
-              <w:rPr>
-                <w:noProof/>
-                <w:webHidden/>
-              </w:rPr>
-              <w:fldChar w:fldCharType="separate"/>
-            </w:r>
-            <w:r>
-              <w:rPr>
-                <w:noProof/>
-                <w:webHidden/>
-              </w:rPr>
-              <w:t>11</w:t>
-            </w:r>
-            <w:r>
-              <w:rPr>
-                <w:noProof/>
-                <w:webHidden/>
-              </w:rPr>
-              <w:fldChar w:fldCharType="end"/>
-            </w:r>
-          </w:hyperlink>
-        </w:p>
-        <w:p>
-          <w:pPr>
-            <w:pStyle w:val="TOC1"/>
-            <w:tabs>
-              <w:tab w:val="right" w:leader="dot" w:pos="9016"/>
-            </w:tabs>
-            <w:rPr>
-              <w:rFonts w:asciiTheme="minorHAnsi" w:eastAsiaTheme="minorEastAsia" w:hAnsiTheme="minorHAnsi"/>
-              <w:noProof/>
-              <w:szCs w:val="24"/>
-              <w:lang w:eastAsia="en-ZA"/>
-            </w:rPr>
-          </w:pPr>
-          <w:hyperlink w:anchor="_Toc239866580" w:history="1">
-            <w:r>
-              <w:rPr>
-                <w:rStyle w:val="Hyperlink"/>
-                <w:noProof/>
-              </w:rPr>
-              <w:t>References</w:t>
-            </w:r>
-            <w:r>
-              <w:rPr>
-                <w:noProof/>
-                <w:webHidden/>
-              </w:rPr>
-              <w:tab/>
-            </w:r>
-            <w:r>
-              <w:rPr>
-                <w:noProof/>
-                <w:webHidden/>
-              </w:rPr>
-              <w:fldChar w:fldCharType="begin"/>
-            </w:r>
-            <w:r>
-              <w:rPr>
-                <w:noProof/>
-                <w:webHidden/>
-              </w:rPr>
-              <w:instrText xml:space="preserve"> PAGEREF _Toc239866580 \h </w:instrText>
-            </w:r>
-            <w:r>
-              <w:rPr>
-                <w:noProof/>
-                <w:webHidden/>
-              </w:rPr>
-            </w:r>
-            <w:r>
-              <w:rPr>
-                <w:noProof/>
-                <w:webHidden/>
-              </w:rPr>
-              <w:fldChar w:fldCharType="separate"/>
-            </w:r>
-            <w:r>
-              <w:rPr>
-                <w:noProof/>
-                <w:webHidden/>
-              </w:rPr>
-              <w:t>12</w:t>
+              <w:t>15</w:t>
             </w:r>
             <w:r>
               <w:rPr>
@@ -1934,19 +2225,195 @@
       <w:pPr>
         <w:pStyle w:val="Heading1"/>
       </w:pPr>
-      <w:bookmarkStart w:id="0" w:name="_Toc239866562"/>
+      <w:bookmarkStart w:id="0" w:name="_Toc239871303"/>
       <w:r>
         <w:lastRenderedPageBreak/>
         <w:t>Problem</w:t>
       </w:r>
       <w:bookmarkEnd w:id="0"/>
     </w:p>
-    <w:p/>
+    <w:p>
+      <w:proofErr w:type="spellStart"/>
+      <w:r>
+        <w:t>CivicConnect</w:t>
+      </w:r>
+      <w:proofErr w:type="spellEnd"/>
+      <w:r>
+        <w:t xml:space="preserve"> currently manages community service</w:t>
+      </w:r>
+      <w:r>
+        <w:t xml:space="preserve"> request</w:t>
+      </w:r>
+      <w:r>
+        <w:t>s through an unco</w:t>
+      </w:r>
+      <w:r>
+        <w:t xml:space="preserve">ordinated, ad-hoc mix of email, phone calls, WhatsApp messages and unlinked spreadsheets. No central </w:t>
+      </w:r>
+      <w:r>
+        <w:t xml:space="preserve">channel owns the full lifecycle of a request. </w:t>
+      </w:r>
+      <w:r>
+        <w:t>As such the organization lacks a reliable, verifiable m</w:t>
+      </w:r>
+      <w:r>
+        <w:t>ethod to answer three fundamental operational questions</w:t>
+      </w:r>
+      <w:r>
+        <w:t>:</w:t>
+      </w:r>
+    </w:p>
+    <w:p>
+      <w:pPr>
+        <w:pStyle w:val="ListParagraph"/>
+        <w:numPr>
+          <w:ilvl w:val="0"/>
+          <w:numId w:val="3"/>
+        </w:numPr>
+      </w:pPr>
+      <w:r>
+        <w:t>What has been requested?</w:t>
+      </w:r>
+    </w:p>
+    <w:p>
+      <w:pPr>
+        <w:pStyle w:val="ListParagraph"/>
+        <w:numPr>
+          <w:ilvl w:val="0"/>
+          <w:numId w:val="3"/>
+        </w:numPr>
+      </w:pPr>
+      <w:r>
+        <w:t xml:space="preserve">Who is accountable for acting on </w:t>
+      </w:r>
+      <w:r>
+        <w:t>the issue</w:t>
+      </w:r>
+      <w:r>
+        <w:t>?</w:t>
+      </w:r>
+    </w:p>
+    <w:p>
+      <w:pPr>
+        <w:pStyle w:val="ListParagraph"/>
+        <w:numPr>
+          <w:ilvl w:val="0"/>
+          <w:numId w:val="3"/>
+        </w:numPr>
+      </w:pPr>
+      <w:r>
+        <w:t>Has</w:t>
+      </w:r>
+      <w:r>
+        <w:t xml:space="preserve"> the issue actually been resolved?</w:t>
+      </w:r>
+    </w:p>
+    <w:p>
+      <w:r>
+        <w:t>Recent empirical research in public sector digital transformation highlights that replacing fragmented, message-based administrative processes with centralized, controlled request management platforms is critical for establishing operational transparency, resolving service bottlenecks, and rebuilding stakeholder trust</w:t>
+      </w:r>
+      <w:sdt>
+        <w:sdtPr>
+          <w:id w:val="-977990515"/>
+          <w:citation/>
+        </w:sdtPr>
+        <w:sdtContent>
+          <w:r>
+            <w:fldChar w:fldCharType="begin"/>
+          </w:r>
+          <w:r>
+            <w:instrText xml:space="preserve"> CITATION Gon20 \l 7177 </w:instrText>
+          </w:r>
+          <w:r>
+            <w:fldChar w:fldCharType="separate"/>
+          </w:r>
+          <w:r>
+            <w:rPr>
+              <w:noProof/>
+            </w:rPr>
+            <w:t xml:space="preserve"> </w:t>
+          </w:r>
+          <w:r>
+            <w:rPr>
+              <w:noProof/>
+            </w:rPr>
+            <w:t>(Gong, 2020)</w:t>
+          </w:r>
+          <w:r>
+            <w:fldChar w:fldCharType="end"/>
+          </w:r>
+        </w:sdtContent>
+      </w:sdt>
+      <w:sdt>
+        <w:sdtPr>
+          <w:id w:val="-2132241184"/>
+          <w:citation/>
+        </w:sdtPr>
+        <w:sdtContent>
+          <w:r>
+            <w:fldChar w:fldCharType="begin"/>
+          </w:r>
+          <w:r>
+            <w:instrText xml:space="preserve"> CITATION Mer19 \l 7177 </w:instrText>
+          </w:r>
+          <w:r>
+            <w:fldChar w:fldCharType="separate"/>
+          </w:r>
+          <w:r>
+            <w:rPr>
+              <w:noProof/>
+            </w:rPr>
+            <w:t xml:space="preserve"> </w:t>
+          </w:r>
+          <w:r>
+            <w:rPr>
+              <w:noProof/>
+            </w:rPr>
+            <w:t>(Mergel, 2019)</w:t>
+          </w:r>
+          <w:r>
+            <w:fldChar w:fldCharType="end"/>
+          </w:r>
+        </w:sdtContent>
+      </w:sdt>
+      <w:r>
+        <w:t>.</w:t>
+      </w:r>
+    </w:p>
+    <w:p>
+      <w:r>
+        <w:t>Thus,</w:t>
+      </w:r>
+      <w:r>
+        <w:t xml:space="preserve"> the</w:t>
+      </w:r>
+      <w:r>
+        <w:t xml:space="preserve"> underlying business need</w:t>
+      </w:r>
+      <w:r>
+        <w:t xml:space="preserve"> is</w:t>
+      </w:r>
+      <w:r>
+        <w:t xml:space="preserve"> not merely "a website to log requests," but a </w:t>
+      </w:r>
+      <w:r>
+        <w:t>single, controlled record of the request lifecycle</w:t>
+      </w:r>
+      <w:r>
+        <w:t>. This platform must grant requesters real-time visibility, provide operational staff with an accountable queue, and supply management with auditable, reportable performance data—all achieved without introducing unsustainable cost, complexity, or technical risk</w:t>
+      </w:r>
+      <w:r>
+        <w:t>.</w:t>
+      </w:r>
+      <w:r>
+        <w:t xml:space="preserve"> </w:t>
+      </w:r>
+    </w:p>
     <w:p>
       <w:pPr>
         <w:pStyle w:val="Heading1"/>
       </w:pPr>
-      <w:bookmarkStart w:id="1" w:name="_Toc239866563"/>
+      <w:bookmarkStart w:id="1" w:name="_Toc239871304"/>
       <w:proofErr w:type="spellStart"/>
       <w:r>
         <w:t>CivicConnect</w:t>
@@ -1964,7 +2431,7 @@
       <w:pPr>
         <w:pStyle w:val="Heading2"/>
       </w:pPr>
-      <w:bookmarkStart w:id="2" w:name="_Toc239866564"/>
+      <w:bookmarkStart w:id="2" w:name="_Toc239871305"/>
       <w:r>
         <w:t>Stakeholder Profiles</w:t>
       </w:r>
@@ -2089,7 +2556,11 @@
           </w:tcPr>
           <w:p>
             <w:r>
-              <w:t>Community/staff member who logs a request (fault, equipment, security, IT, maintenance, lost property…). Primary user for these FR</w:t>
+              <w:t xml:space="preserve">Community/staff member who logs a request (fault, equipment, security, IT, maintenance, lost property…). </w:t>
+            </w:r>
+            <w:r>
+              <w:lastRenderedPageBreak/>
+              <w:t>Primary user for these FR</w:t>
             </w:r>
             <w:r>
               <w:t>’</w:t>
@@ -2105,6 +2576,7 @@
           </w:tcPr>
           <w:p>
             <w:r>
+              <w:lastRenderedPageBreak/>
               <w:t>Easy submit; receipt; status; history; feedback.</w:t>
             </w:r>
           </w:p>
@@ -2264,7 +2736,6 @@
           </w:tcPr>
           <w:p>
             <w:r>
-              <w:lastRenderedPageBreak/>
               <w:t>ST-4</w:t>
             </w:r>
           </w:p>
@@ -2406,8 +2877,9 @@
       <w:pPr>
         <w:pStyle w:val="Heading2"/>
       </w:pPr>
-      <w:bookmarkStart w:id="3" w:name="_Toc239866565"/>
+      <w:bookmarkStart w:id="3" w:name="_Toc239871306"/>
       <w:r>
+        <w:lastRenderedPageBreak/>
         <w:t>Stakeholder Conflicts</w:t>
       </w:r>
       <w:bookmarkEnd w:id="3"/>
@@ -2666,7 +3138,6 @@
           </w:tcPr>
           <w:p>
             <w:r>
-              <w:lastRenderedPageBreak/>
               <w:t>C-4</w:t>
             </w:r>
           </w:p>
@@ -2720,7 +3191,7 @@
       <w:pPr>
         <w:pStyle w:val="Heading1"/>
       </w:pPr>
-      <w:bookmarkStart w:id="4" w:name="_Toc239866566"/>
+      <w:bookmarkStart w:id="4" w:name="_Toc239871307"/>
       <w:r>
         <w:t>Scope</w:t>
       </w:r>
@@ -2731,7 +3202,7 @@
       <w:pPr>
         <w:pStyle w:val="Heading1"/>
       </w:pPr>
-      <w:bookmarkStart w:id="5" w:name="_Toc239866567"/>
+      <w:bookmarkStart w:id="5" w:name="_Toc239871308"/>
       <w:r>
         <w:t>Requester Functional Requirements</w:t>
       </w:r>
@@ -2831,7 +3302,11 @@
           </w:tcPr>
           <w:p>
             <w:r>
-              <w:t>Submit a new service request with the information needed to action it.</w:t>
+              <w:t xml:space="preserve">Submit a new service request with </w:t>
+            </w:r>
+            <w:r>
+              <w:lastRenderedPageBreak/>
+              <w:t>the information needed to action it.</w:t>
             </w:r>
           </w:p>
         </w:tc>
@@ -2841,6 +3316,7 @@
           </w:tcPr>
           <w:p>
             <w:r>
+              <w:lastRenderedPageBreak/>
               <w:t>ST-1</w:t>
             </w:r>
           </w:p>
@@ -2867,7 +3343,11 @@
               <w:t>, etc</w:t>
             </w:r>
             <w:r>
-              <w:t xml:space="preserve">), when submitted, then saved with a unique reference ID </w:t>
+              <w:t xml:space="preserve">), when submitted, then saved with a </w:t>
+            </w:r>
+            <w:r>
+              <w:lastRenderedPageBreak/>
+              <w:t xml:space="preserve">unique reference ID </w:t>
             </w:r>
             <w:r>
               <w:t>with</w:t>
@@ -2896,6 +3376,7 @@
           </w:tcPr>
           <w:p>
             <w:r>
+              <w:lastRenderedPageBreak/>
               <w:t>FR-002</w:t>
             </w:r>
           </w:p>
@@ -2962,7 +3443,6 @@
           </w:tcPr>
           <w:p>
             <w:r>
-              <w:lastRenderedPageBreak/>
               <w:t>FR-003</w:t>
             </w:r>
           </w:p>
@@ -3089,6 +3569,7 @@
           </w:p>
           <w:p>
             <w:r>
+              <w:lastRenderedPageBreak/>
               <w:t>AC-004.2 Given requester</w:t>
             </w:r>
             <w:r>
@@ -3107,6 +3588,7 @@
           </w:tcPr>
           <w:p>
             <w:r>
+              <w:lastRenderedPageBreak/>
               <w:t>FR-005</w:t>
             </w:r>
           </w:p>
@@ -3233,11 +3715,7 @@
           </w:tcPr>
           <w:p>
             <w:r>
-              <w:t xml:space="preserve">Receive feedback when a request is </w:t>
-            </w:r>
-            <w:r>
-              <w:lastRenderedPageBreak/>
-              <w:t>accepted, rejected, updated or completed.</w:t>
+              <w:t>Receive feedback when a request is accepted, rejected, updated or completed.</w:t>
             </w:r>
           </w:p>
         </w:tc>
@@ -3247,7 +3725,6 @@
           </w:tcPr>
           <w:p>
             <w:r>
-              <w:lastRenderedPageBreak/>
               <w:t>ST-1</w:t>
             </w:r>
           </w:p>
@@ -3268,11 +3745,7 @@
           </w:tcPr>
           <w:p>
             <w:r>
-              <w:t>AC-007.1 Given a status change to Accepted/Rejected/Updated/Completed, when the requester next visits, then an in-</w:t>
-            </w:r>
-            <w:r>
-              <w:lastRenderedPageBreak/>
-              <w:t>app feedback item with timestamp appears.</w:t>
+              <w:t>AC-007.1 Given a status change to Accepted/Rejected/Updated/Completed, when the requester next visits, then an in-app feedback item with timestamp appears.</w:t>
             </w:r>
           </w:p>
           <w:p>
@@ -3288,7 +3761,7 @@
       <w:pPr>
         <w:pStyle w:val="Heading2"/>
       </w:pPr>
-      <w:bookmarkStart w:id="6" w:name="_Toc239866568"/>
+      <w:bookmarkStart w:id="6" w:name="_Toc239871309"/>
       <w:r>
         <w:t>Requester NFR candidates and open items</w:t>
       </w:r>
@@ -3368,7 +3841,7 @@
       <w:pPr>
         <w:pStyle w:val="Heading2"/>
       </w:pPr>
-      <w:bookmarkStart w:id="7" w:name="_Toc239866569"/>
+      <w:bookmarkStart w:id="7" w:name="_Toc239871310"/>
       <w:r>
         <w:t xml:space="preserve">Confirm </w:t>
       </w:r>
@@ -3403,6 +3876,7 @@
         <w:spacing w:before="60" w:after="60" w:line="240" w:lineRule="auto"/>
       </w:pPr>
       <w:r>
+        <w:lastRenderedPageBreak/>
         <w:t>Confirm the controlled category list.</w:t>
       </w:r>
     </w:p>
@@ -3427,7 +3901,7 @@
         <w:pStyle w:val="Heading1"/>
       </w:pPr>
       <w:bookmarkStart w:id="8" w:name="_Hlk239779181"/>
-      <w:bookmarkStart w:id="9" w:name="_Toc239866570"/>
+      <w:bookmarkStart w:id="9" w:name="_Toc239871311"/>
       <w:r>
         <w:t>CivicConnect</w:t>
       </w:r>
@@ -3617,11 +4091,7 @@
           </w:tcPr>
           <w:p>
             <w:r>
-              <w:t xml:space="preserve">Categorise the request from a controlled </w:t>
-            </w:r>
-            <w:r>
-              <w:lastRenderedPageBreak/>
-              <w:t>category list (not free text).</w:t>
+              <w:t>Categorise the request from a controlled category list (not free text).</w:t>
             </w:r>
           </w:p>
         </w:tc>
@@ -3631,7 +4101,6 @@
           </w:tcPr>
           <w:p>
             <w:r>
-              <w:lastRenderedPageBreak/>
               <w:t>AC-002.1; AC-002.2</w:t>
             </w:r>
           </w:p>
@@ -3850,6 +4319,7 @@
           </w:tcPr>
           <w:p>
             <w:r>
+              <w:lastRenderedPageBreak/>
               <w:t>FR-006</w:t>
             </w:r>
           </w:p>
@@ -3974,7 +4444,6 @@
           </w:tcPr>
           <w:p>
             <w:r>
-              <w:lastRenderedPageBreak/>
               <w:t>NFR-001</w:t>
             </w:r>
           </w:p>
@@ -4055,6 +4524,7 @@
           </w:tcPr>
           <w:p>
             <w:r>
+              <w:lastRenderedPageBreak/>
               <w:t>NFR-002</w:t>
             </w:r>
           </w:p>
@@ -4147,11 +4617,7 @@
           </w:tcPr>
           <w:p>
             <w:r>
-              <w:t xml:space="preserve">A requester cannot access another requester's request (access-control test; </w:t>
-            </w:r>
-            <w:r>
-              <w:lastRenderedPageBreak/>
-              <w:t>supports AC-004.2).</w:t>
+              <w:t>A requester cannot access another requester's request (access-control test; supports AC-004.2).</w:t>
             </w:r>
           </w:p>
         </w:tc>
@@ -4161,7 +4627,6 @@
           </w:tcPr>
           <w:p>
             <w:r>
-              <w:lastRenderedPageBreak/>
               <w:t>Must</w:t>
             </w:r>
           </w:p>
@@ -4182,7 +4647,7 @@
       <w:pPr>
         <w:pStyle w:val="Heading2"/>
       </w:pPr>
-      <w:bookmarkStart w:id="10" w:name="_Toc239866571"/>
+      <w:bookmarkStart w:id="10" w:name="_Toc239871312"/>
       <w:r>
         <w:t>Legend:</w:t>
       </w:r>
@@ -4221,8 +4686,9 @@
       <w:pPr>
         <w:pStyle w:val="Heading1"/>
       </w:pPr>
-      <w:bookmarkStart w:id="11" w:name="_Toc239866572"/>
+      <w:bookmarkStart w:id="11" w:name="_Toc239871313"/>
       <w:r>
+        <w:lastRenderedPageBreak/>
         <w:t>Technical Constraints and Assumptions</w:t>
       </w:r>
       <w:bookmarkEnd w:id="11"/>
@@ -4264,7 +4730,7 @@
           <w:szCs w:val="22"/>
         </w:rPr>
       </w:pPr>
-      <w:bookmarkStart w:id="12" w:name="_Toc239866573"/>
+      <w:bookmarkStart w:id="12" w:name="_Toc239871314"/>
       <w:r>
         <w:rPr>
           <w:szCs w:val="24"/>
@@ -4292,7 +4758,6 @@
         <w:pStyle w:val="NormalWeb"/>
       </w:pPr>
       <w:r>
-        <w:lastRenderedPageBreak/>
         <w:t>The architecture is directional at M1. Backend framework, database technology, API style, authentication and deployment decisions will be confirmed during M2 following further analysis.</w:t>
       </w:r>
     </w:p>
@@ -4300,7 +4765,7 @@
       <w:pPr>
         <w:pStyle w:val="Heading2"/>
       </w:pPr>
-      <w:bookmarkStart w:id="13" w:name="_Toc239866574"/>
+      <w:bookmarkStart w:id="13" w:name="_Toc239871315"/>
       <w:r>
         <w:t>Engineering Decision Log</w:t>
       </w:r>
@@ -4634,8 +5099,9 @@
       <w:pPr>
         <w:pStyle w:val="Heading2"/>
       </w:pPr>
-      <w:bookmarkStart w:id="14" w:name="_Toc239866575"/>
+      <w:bookmarkStart w:id="14" w:name="_Toc239871316"/>
       <w:r>
+        <w:lastRenderedPageBreak/>
         <w:t>Technical Constraints</w:t>
       </w:r>
       <w:bookmarkEnd w:id="14"/>
@@ -4785,46 +5251,1247 @@
       <w:pPr>
         <w:pStyle w:val="Heading1"/>
       </w:pPr>
-      <w:bookmarkStart w:id="15" w:name="_Toc239866576"/>
+      <w:bookmarkStart w:id="15" w:name="_Toc239871317"/>
       <w:r>
         <w:t>Risk</w:t>
       </w:r>
       <w:bookmarkEnd w:id="15"/>
     </w:p>
-    <w:p/>
-    <w:p>
-      <w:pPr>
-        <w:pStyle w:val="Heading1"/>
-      </w:pPr>
-      <w:bookmarkStart w:id="16" w:name="_Toc239866577"/>
-      <w:r>
-        <w:lastRenderedPageBreak/>
-        <w:t>Process</w:t>
-      </w:r>
-      <w:bookmarkEnd w:id="16"/>
-    </w:p>
-    <w:p/>
-    <w:p>
-      <w:pPr>
-        <w:pStyle w:val="Heading1"/>
-      </w:pPr>
-      <w:bookmarkStart w:id="17" w:name="_Toc239866578"/>
-      <w:r>
-        <w:t>Governance</w:t>
-      </w:r>
-      <w:bookmarkEnd w:id="17"/>
-    </w:p>
-    <w:p/>
-    <w:p>
-      <w:pPr>
-        <w:pStyle w:val="Heading1"/>
-      </w:pPr>
-      <w:bookmarkStart w:id="18" w:name="_Toc239866579"/>
-      <w:r>
-        <w:t>Baseline</w:t>
-      </w:r>
-      <w:bookmarkEnd w:id="18"/>
-    </w:p>
+    <w:tbl>
+      <w:tblPr>
+        <w:tblStyle w:val="TableGrid"/>
+        <w:tblpPr w:leftFromText="180" w:rightFromText="180" w:vertAnchor="text" w:tblpXSpec="center" w:tblpY="1"/>
+        <w:tblOverlap w:val="never"/>
+        <w:tblW w:w="10689" w:type="dxa"/>
+        <w:tblLook w:val="04A0" w:firstRow="1" w:lastRow="0" w:firstColumn="1" w:lastColumn="0" w:noHBand="0" w:noVBand="1"/>
+      </w:tblPr>
+      <w:tblGrid>
+        <w:gridCol w:w="763"/>
+        <w:gridCol w:w="2199"/>
+        <w:gridCol w:w="1283"/>
+        <w:gridCol w:w="1093"/>
+        <w:gridCol w:w="1130"/>
+        <w:gridCol w:w="1625"/>
+        <w:gridCol w:w="1130"/>
+        <w:gridCol w:w="1466"/>
+      </w:tblGrid>
+      <w:tr>
+        <w:trPr>
+          <w:cantSplit/>
+          <w:tblHeader/>
+        </w:trPr>
+        <w:tc>
+          <w:tcPr>
+            <w:tcW w:w="737" w:type="dxa"/>
+            <w:vAlign w:val="center"/>
+          </w:tcPr>
+          <w:p>
+            <w:r>
+              <w:t>Risk ID</w:t>
+            </w:r>
+          </w:p>
+        </w:tc>
+        <w:tc>
+          <w:tcPr>
+            <w:tcW w:w="2199" w:type="dxa"/>
+            <w:vAlign w:val="center"/>
+          </w:tcPr>
+          <w:p>
+            <w:r>
+              <w:t>Description &amp; Cause</w:t>
+            </w:r>
+          </w:p>
+        </w:tc>
+        <w:tc>
+          <w:tcPr>
+            <w:tcW w:w="1283" w:type="dxa"/>
+            <w:vAlign w:val="center"/>
+          </w:tcPr>
+          <w:p>
+            <w:r>
+              <w:t>Probability</w:t>
+            </w:r>
+          </w:p>
+        </w:tc>
+        <w:tc>
+          <w:tcPr>
+            <w:tcW w:w="1096" w:type="dxa"/>
+            <w:vAlign w:val="center"/>
+          </w:tcPr>
+          <w:p>
+            <w:r>
+              <w:t>Impact</w:t>
+            </w:r>
+          </w:p>
+        </w:tc>
+        <w:tc>
+          <w:tcPr>
+            <w:tcW w:w="1130" w:type="dxa"/>
+            <w:vAlign w:val="center"/>
+          </w:tcPr>
+          <w:p>
+            <w:r>
+              <w:t>Exposure / Priority</w:t>
+            </w:r>
+          </w:p>
+        </w:tc>
+        <w:tc>
+          <w:tcPr>
+            <w:tcW w:w="1631" w:type="dxa"/>
+            <w:vAlign w:val="center"/>
+          </w:tcPr>
+          <w:p>
+            <w:r>
+              <w:t>Mitigation Strategy</w:t>
+            </w:r>
+          </w:p>
+        </w:tc>
+        <w:tc>
+          <w:tcPr>
+            <w:tcW w:w="1132" w:type="dxa"/>
+            <w:vAlign w:val="center"/>
+          </w:tcPr>
+          <w:p>
+            <w:r>
+              <w:t>Owner</w:t>
+            </w:r>
+          </w:p>
+        </w:tc>
+        <w:tc>
+          <w:tcPr>
+            <w:tcW w:w="1481" w:type="dxa"/>
+            <w:vAlign w:val="center"/>
+          </w:tcPr>
+          <w:p>
+            <w:r>
+              <w:t>Status</w:t>
+            </w:r>
+          </w:p>
+        </w:tc>
+      </w:tr>
+      <w:tr>
+        <w:trPr>
+          <w:cantSplit/>
+        </w:trPr>
+        <w:tc>
+          <w:tcPr>
+            <w:tcW w:w="737" w:type="dxa"/>
+          </w:tcPr>
+          <w:p>
+            <w:pPr>
+              <w:pStyle w:val="Heading2"/>
+            </w:pPr>
+            <w:bookmarkStart w:id="16" w:name="_Toc239800795"/>
+            <w:bookmarkStart w:id="17" w:name="_Toc239871318"/>
+            <w:r>
+              <w:t>RSK-001</w:t>
+            </w:r>
+            <w:bookmarkEnd w:id="16"/>
+            <w:bookmarkEnd w:id="17"/>
+          </w:p>
+        </w:tc>
+        <w:tc>
+          <w:tcPr>
+            <w:tcW w:w="2199" w:type="dxa"/>
+          </w:tcPr>
+          <w:p>
+            <w:r>
+              <w:rPr>
+                <w:b/>
+                <w:bCs/>
+              </w:rPr>
+              <w:t>Unfamiliarity with the technology stack selected</w:t>
+            </w:r>
+            <w:r>
+              <w:t>: The framework and database must be selected under tight schedule constraints</w:t>
+            </w:r>
+          </w:p>
+        </w:tc>
+        <w:tc>
+          <w:tcPr>
+            <w:tcW w:w="1283" w:type="dxa"/>
+          </w:tcPr>
+          <w:p>
+            <w:r>
+              <w:t>Medium</w:t>
+            </w:r>
+          </w:p>
+        </w:tc>
+        <w:tc>
+          <w:tcPr>
+            <w:tcW w:w="1096" w:type="dxa"/>
+          </w:tcPr>
+          <w:p>
+            <w:r>
+              <w:t>High</w:t>
+            </w:r>
+          </w:p>
+        </w:tc>
+        <w:tc>
+          <w:tcPr>
+            <w:tcW w:w="1130" w:type="dxa"/>
+          </w:tcPr>
+          <w:p>
+            <w:r>
+              <w:t>High</w:t>
+            </w:r>
+          </w:p>
+        </w:tc>
+        <w:tc>
+          <w:tcPr>
+            <w:tcW w:w="1631" w:type="dxa"/>
+          </w:tcPr>
+          <w:p>
+            <w:r>
+              <w:t>Conduct small technical Proof-of-Concept spikes during M1 and M2 before committing</w:t>
+            </w:r>
+          </w:p>
+        </w:tc>
+        <w:tc>
+          <w:tcPr>
+            <w:tcW w:w="1132" w:type="dxa"/>
+          </w:tcPr>
+          <w:p>
+            <w:r>
+              <w:t>All team members</w:t>
+            </w:r>
+          </w:p>
+        </w:tc>
+        <w:tc>
+          <w:tcPr>
+            <w:tcW w:w="1481" w:type="dxa"/>
+          </w:tcPr>
+          <w:p>
+            <w:sdt>
+              <w:sdtPr>
+                <w:id w:val="-324212897"/>
+                <w14:checkbox>
+                  <w14:checked w14:val="1"/>
+                  <w14:checkedState w14:val="2612" w14:font="MS Gothic"/>
+                  <w14:uncheckedState w14:val="2610" w14:font="MS Gothic"/>
+                </w14:checkbox>
+              </w:sdtPr>
+              <w:sdtContent>
+                <w:r>
+                  <w:rPr>
+                    <w:rFonts w:ascii="MS Gothic" w:eastAsia="MS Gothic" w:hAnsi="MS Gothic" w:hint="eastAsia"/>
+                  </w:rPr>
+                  <w:t>☒</w:t>
+                </w:r>
+              </w:sdtContent>
+            </w:sdt>
+            <w:r>
+              <w:t>Open</w:t>
+            </w:r>
+          </w:p>
+          <w:p>
+            <w:sdt>
+              <w:sdtPr>
+                <w:id w:val="2133287621"/>
+                <w14:checkbox>
+                  <w14:checked w14:val="0"/>
+                  <w14:checkedState w14:val="2612" w14:font="MS Gothic"/>
+                  <w14:uncheckedState w14:val="2610" w14:font="MS Gothic"/>
+                </w14:checkbox>
+              </w:sdtPr>
+              <w:sdtContent>
+                <w:r>
+                  <w:rPr>
+                    <w:rFonts w:ascii="MS Gothic" w:eastAsia="MS Gothic" w:hAnsi="MS Gothic" w:hint="eastAsia"/>
+                  </w:rPr>
+                  <w:t>☐</w:t>
+                </w:r>
+              </w:sdtContent>
+            </w:sdt>
+            <w:r>
+              <w:t>Mitigated</w:t>
+            </w:r>
+          </w:p>
+          <w:p>
+            <w:sdt>
+              <w:sdtPr>
+                <w:id w:val="51043938"/>
+                <w14:checkbox>
+                  <w14:checked w14:val="0"/>
+                  <w14:checkedState w14:val="2612" w14:font="MS Gothic"/>
+                  <w14:uncheckedState w14:val="2610" w14:font="MS Gothic"/>
+                </w14:checkbox>
+              </w:sdtPr>
+              <w:sdtContent>
+                <w:r>
+                  <w:rPr>
+                    <w:rFonts w:ascii="MS Gothic" w:eastAsia="MS Gothic" w:hAnsi="MS Gothic" w:hint="eastAsia"/>
+                  </w:rPr>
+                  <w:t>☐</w:t>
+                </w:r>
+              </w:sdtContent>
+            </w:sdt>
+            <w:r>
+              <w:t>Realised</w:t>
+            </w:r>
+            <w:r>
+              <w:fldChar w:fldCharType="begin"/>
+            </w:r>
+            <w:r>
+              <w:instrText xml:space="preserve"> =NAME </w:instrText>
+            </w:r>
+            <w:r>
+              <w:fldChar w:fldCharType="separate"/>
+            </w:r>
+            <w:r>
+              <w:fldChar w:fldCharType="end"/>
+            </w:r>
+          </w:p>
+        </w:tc>
+      </w:tr>
+      <w:tr>
+        <w:trPr>
+          <w:cantSplit/>
+        </w:trPr>
+        <w:tc>
+          <w:tcPr>
+            <w:tcW w:w="737" w:type="dxa"/>
+          </w:tcPr>
+          <w:p>
+            <w:pPr>
+              <w:pStyle w:val="Heading2"/>
+            </w:pPr>
+            <w:bookmarkStart w:id="18" w:name="_Toc239800796"/>
+            <w:bookmarkStart w:id="19" w:name="_Toc239871319"/>
+            <w:r>
+              <w:t>RSK-002</w:t>
+            </w:r>
+            <w:bookmarkEnd w:id="18"/>
+            <w:bookmarkEnd w:id="19"/>
+          </w:p>
+        </w:tc>
+        <w:tc>
+          <w:tcPr>
+            <w:tcW w:w="2199" w:type="dxa"/>
+          </w:tcPr>
+          <w:p>
+            <w:r>
+              <w:rPr>
+                <w:b/>
+                <w:bCs/>
+              </w:rPr>
+              <w:t>Merge Conflicts &amp; Baseline Desynchronisation:</w:t>
+            </w:r>
+            <w:r>
+              <w:t xml:space="preserve"> Multiple members editing shared documents or code simultaneously without coordination</w:t>
+            </w:r>
+          </w:p>
+        </w:tc>
+        <w:tc>
+          <w:tcPr>
+            <w:tcW w:w="1283" w:type="dxa"/>
+          </w:tcPr>
+          <w:p>
+            <w:r>
+              <w:t>High</w:t>
+            </w:r>
+          </w:p>
+        </w:tc>
+        <w:tc>
+          <w:tcPr>
+            <w:tcW w:w="1096" w:type="dxa"/>
+          </w:tcPr>
+          <w:p>
+            <w:r>
+              <w:t>Medium</w:t>
+            </w:r>
+          </w:p>
+        </w:tc>
+        <w:tc>
+          <w:tcPr>
+            <w:tcW w:w="1130" w:type="dxa"/>
+          </w:tcPr>
+          <w:p>
+            <w:r>
+              <w:t>High</w:t>
+            </w:r>
+          </w:p>
+        </w:tc>
+        <w:tc>
+          <w:tcPr>
+            <w:tcW w:w="1631" w:type="dxa"/>
+          </w:tcPr>
+          <w:p>
+            <w:r>
+              <w:t xml:space="preserve">Enforce strict 24-hour pull request reviews, modularise document sections by author, and mandate two </w:t>
+            </w:r>
+            <w:r>
+              <w:lastRenderedPageBreak/>
+              <w:t>peer approvals on GitHub before merging.</w:t>
+            </w:r>
+          </w:p>
+        </w:tc>
+        <w:tc>
+          <w:tcPr>
+            <w:tcW w:w="1132" w:type="dxa"/>
+          </w:tcPr>
+          <w:p>
+            <w:r>
+              <w:lastRenderedPageBreak/>
+              <w:t>All team members</w:t>
+            </w:r>
+          </w:p>
+        </w:tc>
+        <w:tc>
+          <w:tcPr>
+            <w:tcW w:w="1481" w:type="dxa"/>
+          </w:tcPr>
+          <w:p>
+            <w:sdt>
+              <w:sdtPr>
+                <w:id w:val="2030216631"/>
+                <w14:checkbox>
+                  <w14:checked w14:val="0"/>
+                  <w14:checkedState w14:val="2612" w14:font="MS Gothic"/>
+                  <w14:uncheckedState w14:val="2610" w14:font="MS Gothic"/>
+                </w14:checkbox>
+              </w:sdtPr>
+              <w:sdtContent>
+                <w:r>
+                  <w:rPr>
+                    <w:rFonts w:ascii="MS Gothic" w:eastAsia="MS Gothic" w:hAnsi="MS Gothic" w:hint="eastAsia"/>
+                  </w:rPr>
+                  <w:t>☐</w:t>
+                </w:r>
+              </w:sdtContent>
+            </w:sdt>
+            <w:r>
+              <w:t>Open</w:t>
+            </w:r>
+          </w:p>
+          <w:p>
+            <w:sdt>
+              <w:sdtPr>
+                <w:id w:val="-1339923993"/>
+                <w14:checkbox>
+                  <w14:checked w14:val="1"/>
+                  <w14:checkedState w14:val="2612" w14:font="MS Gothic"/>
+                  <w14:uncheckedState w14:val="2610" w14:font="MS Gothic"/>
+                </w14:checkbox>
+              </w:sdtPr>
+              <w:sdtContent>
+                <w:r>
+                  <w:rPr>
+                    <w:rFonts w:ascii="MS Gothic" w:eastAsia="MS Gothic" w:hAnsi="MS Gothic" w:hint="eastAsia"/>
+                  </w:rPr>
+                  <w:t>☒</w:t>
+                </w:r>
+              </w:sdtContent>
+            </w:sdt>
+            <w:r>
+              <w:t>Mitigated</w:t>
+            </w:r>
+          </w:p>
+          <w:p>
+            <w:sdt>
+              <w:sdtPr>
+                <w:id w:val="820323020"/>
+                <w14:checkbox>
+                  <w14:checked w14:val="0"/>
+                  <w14:checkedState w14:val="2612" w14:font="MS Gothic"/>
+                  <w14:uncheckedState w14:val="2610" w14:font="MS Gothic"/>
+                </w14:checkbox>
+              </w:sdtPr>
+              <w:sdtContent>
+                <w:r>
+                  <w:rPr>
+                    <w:rFonts w:ascii="MS Gothic" w:eastAsia="MS Gothic" w:hAnsi="MS Gothic" w:hint="eastAsia"/>
+                  </w:rPr>
+                  <w:t>☐</w:t>
+                </w:r>
+              </w:sdtContent>
+            </w:sdt>
+            <w:r>
+              <w:t>Realised</w:t>
+            </w:r>
+            <w:r>
+              <w:fldChar w:fldCharType="begin"/>
+            </w:r>
+            <w:r>
+              <w:instrText xml:space="preserve"> =NAME </w:instrText>
+            </w:r>
+            <w:r>
+              <w:fldChar w:fldCharType="separate"/>
+            </w:r>
+            <w:r>
+              <w:fldChar w:fldCharType="end"/>
+            </w:r>
+          </w:p>
+        </w:tc>
+      </w:tr>
+      <w:tr>
+        <w:trPr>
+          <w:cantSplit/>
+        </w:trPr>
+        <w:tc>
+          <w:tcPr>
+            <w:tcW w:w="737" w:type="dxa"/>
+          </w:tcPr>
+          <w:p>
+            <w:pPr>
+              <w:pStyle w:val="Heading2"/>
+            </w:pPr>
+            <w:bookmarkStart w:id="20" w:name="_Toc239800797"/>
+            <w:bookmarkStart w:id="21" w:name="_Toc239871320"/>
+            <w:r>
+              <w:t>RSK-003</w:t>
+            </w:r>
+            <w:bookmarkEnd w:id="20"/>
+            <w:bookmarkEnd w:id="21"/>
+          </w:p>
+        </w:tc>
+        <w:tc>
+          <w:tcPr>
+            <w:tcW w:w="2199" w:type="dxa"/>
+          </w:tcPr>
+          <w:p>
+            <w:pPr>
+              <w:rPr>
+                <w:rFonts w:cs="Times New Roman"/>
+                <w:lang w:eastAsia="en-ZA"/>
+              </w:rPr>
+            </w:pPr>
+            <w:r>
+              <w:rPr>
+                <w:b/>
+                <w:bCs/>
+                <w:lang w:eastAsia="en-ZA"/>
+              </w:rPr>
+              <w:t>Scope Creep vs. Fixed Delivery Schedule:</w:t>
+            </w:r>
+            <w:r>
+              <w:rPr>
+                <w:lang w:eastAsia="en-ZA"/>
+              </w:rPr>
+              <w:t xml:space="preserve"> Attempting to build overly complex custom features beyond the minimum</w:t>
+            </w:r>
+            <w:r>
+              <w:rPr>
+                <w:lang w:eastAsia="en-ZA"/>
+              </w:rPr>
+              <w:t xml:space="preserve"> </w:t>
+            </w:r>
+            <w:r>
+              <w:rPr>
+                <w:lang w:eastAsia="en-ZA"/>
+              </w:rPr>
+              <w:t>capabilities</w:t>
+            </w:r>
+          </w:p>
+        </w:tc>
+        <w:tc>
+          <w:tcPr>
+            <w:tcW w:w="1283" w:type="dxa"/>
+          </w:tcPr>
+          <w:p>
+            <w:r>
+              <w:t>Medium</w:t>
+            </w:r>
+          </w:p>
+        </w:tc>
+        <w:tc>
+          <w:tcPr>
+            <w:tcW w:w="1096" w:type="dxa"/>
+          </w:tcPr>
+          <w:p>
+            <w:r>
+              <w:t>High</w:t>
+            </w:r>
+          </w:p>
+          <w:p/>
+        </w:tc>
+        <w:tc>
+          <w:tcPr>
+            <w:tcW w:w="1130" w:type="dxa"/>
+          </w:tcPr>
+          <w:p>
+            <w:r>
+              <w:t>High</w:t>
+            </w:r>
+          </w:p>
+        </w:tc>
+        <w:tc>
+          <w:tcPr>
+            <w:tcW w:w="1631" w:type="dxa"/>
+          </w:tcPr>
+          <w:p>
+            <w:r>
+              <w:t>Strictly baseline core requirements in M1 and enforce formal Change Request &amp; Impact Analysis procedures for any requested scope additions.</w:t>
+            </w:r>
+          </w:p>
+        </w:tc>
+        <w:tc>
+          <w:tcPr>
+            <w:tcW w:w="1132" w:type="dxa"/>
+          </w:tcPr>
+          <w:p>
+            <w:r>
+              <w:t>All team members</w:t>
+            </w:r>
+          </w:p>
+        </w:tc>
+        <w:tc>
+          <w:tcPr>
+            <w:tcW w:w="1481" w:type="dxa"/>
+          </w:tcPr>
+          <w:p>
+            <w:sdt>
+              <w:sdtPr>
+                <w:id w:val="-365373089"/>
+                <w14:checkbox>
+                  <w14:checked w14:val="1"/>
+                  <w14:checkedState w14:val="2612" w14:font="MS Gothic"/>
+                  <w14:uncheckedState w14:val="2610" w14:font="MS Gothic"/>
+                </w14:checkbox>
+              </w:sdtPr>
+              <w:sdtContent>
+                <w:r>
+                  <w:rPr>
+                    <w:rFonts w:ascii="MS Gothic" w:eastAsia="MS Gothic" w:hAnsi="MS Gothic" w:hint="eastAsia"/>
+                  </w:rPr>
+                  <w:t>☒</w:t>
+                </w:r>
+              </w:sdtContent>
+            </w:sdt>
+            <w:r>
+              <w:t>Open</w:t>
+            </w:r>
+          </w:p>
+          <w:p>
+            <w:sdt>
+              <w:sdtPr>
+                <w:id w:val="-2002109357"/>
+                <w14:checkbox>
+                  <w14:checked w14:val="0"/>
+                  <w14:checkedState w14:val="2612" w14:font="MS Gothic"/>
+                  <w14:uncheckedState w14:val="2610" w14:font="MS Gothic"/>
+                </w14:checkbox>
+              </w:sdtPr>
+              <w:sdtContent>
+                <w:r>
+                  <w:rPr>
+                    <w:rFonts w:ascii="MS Gothic" w:eastAsia="MS Gothic" w:hAnsi="MS Gothic" w:hint="eastAsia"/>
+                    <w:lang w:val="en-US"/>
+                  </w:rPr>
+                  <w:t>☐</w:t>
+                </w:r>
+              </w:sdtContent>
+            </w:sdt>
+            <w:r>
+              <w:t>Mitigated</w:t>
+            </w:r>
+          </w:p>
+          <w:p>
+            <w:sdt>
+              <w:sdtPr>
+                <w:id w:val="-2001184468"/>
+                <w14:checkbox>
+                  <w14:checked w14:val="0"/>
+                  <w14:checkedState w14:val="2612" w14:font="MS Gothic"/>
+                  <w14:uncheckedState w14:val="2610" w14:font="MS Gothic"/>
+                </w14:checkbox>
+              </w:sdtPr>
+              <w:sdtContent>
+                <w:r>
+                  <w:rPr>
+                    <w:rFonts w:ascii="MS Gothic" w:eastAsia="MS Gothic" w:hAnsi="MS Gothic" w:hint="eastAsia"/>
+                    <w:lang w:val="en-US"/>
+                  </w:rPr>
+                  <w:t>☐</w:t>
+                </w:r>
+              </w:sdtContent>
+            </w:sdt>
+            <w:r>
+              <w:t>Realised</w:t>
+            </w:r>
+            <w:r>
+              <w:fldChar w:fldCharType="begin"/>
+            </w:r>
+            <w:r>
+              <w:instrText xml:space="preserve"> =NAME </w:instrText>
+            </w:r>
+            <w:r>
+              <w:fldChar w:fldCharType="separate"/>
+            </w:r>
+            <w:r>
+              <w:fldChar w:fldCharType="end"/>
+            </w:r>
+          </w:p>
+        </w:tc>
+      </w:tr>
+      <w:tr>
+        <w:trPr>
+          <w:cantSplit/>
+        </w:trPr>
+        <w:tc>
+          <w:tcPr>
+            <w:tcW w:w="737" w:type="dxa"/>
+          </w:tcPr>
+          <w:p>
+            <w:pPr>
+              <w:pStyle w:val="Heading2"/>
+            </w:pPr>
+            <w:bookmarkStart w:id="22" w:name="_Toc239800798"/>
+            <w:bookmarkStart w:id="23" w:name="_Toc239871321"/>
+            <w:r>
+              <w:t>RSK-004</w:t>
+            </w:r>
+            <w:bookmarkEnd w:id="22"/>
+            <w:bookmarkEnd w:id="23"/>
+          </w:p>
+        </w:tc>
+        <w:tc>
+          <w:tcPr>
+            <w:tcW w:w="2199" w:type="dxa"/>
+          </w:tcPr>
+          <w:p>
+            <w:pPr>
+              <w:rPr>
+                <w:rFonts w:ascii="Arial" w:eastAsia="Times New Roman" w:hAnsi="Arial" w:cs="Arial"/>
+                <w:b/>
+                <w:bCs/>
+                <w:kern w:val="0"/>
+                <w:lang w:eastAsia="en-ZA"/>
+                <w14:ligatures w14:val="none"/>
+              </w:rPr>
+            </w:pPr>
+            <w:r>
+              <w:rPr>
+                <w:b/>
+                <w:bCs/>
+              </w:rPr>
+              <w:t>Unverified AI Code/Content Generation:</w:t>
+            </w:r>
+            <w:r>
+              <w:t xml:space="preserve"> AI generates subtle logical flaws, non-functional code, or incorrect architectural assumptions</w:t>
+            </w:r>
+          </w:p>
+        </w:tc>
+        <w:tc>
+          <w:tcPr>
+            <w:tcW w:w="1283" w:type="dxa"/>
+          </w:tcPr>
+          <w:p>
+            <w:r>
+              <w:t>Medium</w:t>
+            </w:r>
+          </w:p>
+        </w:tc>
+        <w:tc>
+          <w:tcPr>
+            <w:tcW w:w="1096" w:type="dxa"/>
+          </w:tcPr>
+          <w:p>
+            <w:r>
+              <w:t>High</w:t>
+            </w:r>
+          </w:p>
+        </w:tc>
+        <w:tc>
+          <w:tcPr>
+            <w:tcW w:w="1130" w:type="dxa"/>
+          </w:tcPr>
+          <w:p>
+            <w:r>
+              <w:t>High</w:t>
+            </w:r>
+          </w:p>
+        </w:tc>
+        <w:tc>
+          <w:tcPr>
+            <w:tcW w:w="1631" w:type="dxa"/>
+          </w:tcPr>
+          <w:p>
+            <w:r>
+              <w:t>Mandate independent human verification for every AI output and log all prompts, reviews, and decisions in the AI Usage Register.</w:t>
+            </w:r>
+          </w:p>
+        </w:tc>
+        <w:tc>
+          <w:tcPr>
+            <w:tcW w:w="1132" w:type="dxa"/>
+          </w:tcPr>
+          <w:p>
+            <w:r>
+              <w:t>All team members</w:t>
+            </w:r>
+          </w:p>
+        </w:tc>
+        <w:tc>
+          <w:tcPr>
+            <w:tcW w:w="1481" w:type="dxa"/>
+          </w:tcPr>
+          <w:p>
+            <w:sdt>
+              <w:sdtPr>
+                <w:id w:val="2024974692"/>
+                <w14:checkbox>
+                  <w14:checked w14:val="0"/>
+                  <w14:checkedState w14:val="2612" w14:font="MS Gothic"/>
+                  <w14:uncheckedState w14:val="2610" w14:font="MS Gothic"/>
+                </w14:checkbox>
+              </w:sdtPr>
+              <w:sdtContent>
+                <w:r>
+                  <w:rPr>
+                    <w:rFonts w:ascii="MS Gothic" w:eastAsia="MS Gothic" w:hAnsi="MS Gothic" w:hint="eastAsia"/>
+                  </w:rPr>
+                  <w:t>☐</w:t>
+                </w:r>
+              </w:sdtContent>
+            </w:sdt>
+            <w:r>
+              <w:t>Open</w:t>
+            </w:r>
+          </w:p>
+          <w:p>
+            <w:sdt>
+              <w:sdtPr>
+                <w:id w:val="-791516411"/>
+                <w14:checkbox>
+                  <w14:checked w14:val="1"/>
+                  <w14:checkedState w14:val="2612" w14:font="MS Gothic"/>
+                  <w14:uncheckedState w14:val="2610" w14:font="MS Gothic"/>
+                </w14:checkbox>
+              </w:sdtPr>
+              <w:sdtContent>
+                <w:r>
+                  <w:rPr>
+                    <w:rFonts w:ascii="MS Gothic" w:eastAsia="MS Gothic" w:hAnsi="MS Gothic" w:hint="eastAsia"/>
+                  </w:rPr>
+                  <w:t>☒</w:t>
+                </w:r>
+              </w:sdtContent>
+            </w:sdt>
+            <w:r>
+              <w:t>Mitigated</w:t>
+            </w:r>
+          </w:p>
+          <w:p>
+            <w:sdt>
+              <w:sdtPr>
+                <w:id w:val="13885053"/>
+                <w14:checkbox>
+                  <w14:checked w14:val="0"/>
+                  <w14:checkedState w14:val="2612" w14:font="MS Gothic"/>
+                  <w14:uncheckedState w14:val="2610" w14:font="MS Gothic"/>
+                </w14:checkbox>
+              </w:sdtPr>
+              <w:sdtContent>
+                <w:r>
+                  <w:rPr>
+                    <w:rFonts w:ascii="MS Gothic" w:eastAsia="MS Gothic" w:hAnsi="MS Gothic" w:hint="eastAsia"/>
+                  </w:rPr>
+                  <w:t>☐</w:t>
+                </w:r>
+              </w:sdtContent>
+            </w:sdt>
+            <w:r>
+              <w:t>Realised</w:t>
+            </w:r>
+            <w:r>
+              <w:fldChar w:fldCharType="begin"/>
+            </w:r>
+            <w:r>
+              <w:instrText xml:space="preserve"> =NAME </w:instrText>
+            </w:r>
+            <w:r>
+              <w:fldChar w:fldCharType="separate"/>
+            </w:r>
+            <w:r>
+              <w:fldChar w:fldCharType="end"/>
+            </w:r>
+          </w:p>
+        </w:tc>
+      </w:tr>
+      <w:tr>
+        <w:trPr>
+          <w:cantSplit/>
+        </w:trPr>
+        <w:tc>
+          <w:tcPr>
+            <w:tcW w:w="737" w:type="dxa"/>
+          </w:tcPr>
+          <w:p>
+            <w:pPr>
+              <w:pStyle w:val="Heading2"/>
+            </w:pPr>
+            <w:bookmarkStart w:id="24" w:name="_Toc239800799"/>
+            <w:bookmarkStart w:id="25" w:name="_Toc239871322"/>
+            <w:r>
+              <w:lastRenderedPageBreak/>
+              <w:t>RSK-005</w:t>
+            </w:r>
+            <w:bookmarkEnd w:id="24"/>
+            <w:bookmarkEnd w:id="25"/>
+          </w:p>
+        </w:tc>
+        <w:tc>
+          <w:tcPr>
+            <w:tcW w:w="2199" w:type="dxa"/>
+          </w:tcPr>
+          <w:p>
+            <w:pPr>
+              <w:rPr>
+                <w:b/>
+                <w:bCs/>
+              </w:rPr>
+            </w:pPr>
+            <w:r>
+              <w:rPr>
+                <w:b/>
+                <w:bCs/>
+              </w:rPr>
+              <w:t>Exposure of Secrets or Credentials:</w:t>
+            </w:r>
+            <w:r>
+              <w:t xml:space="preserve"> API keys, database connection strings, or passwords accidentally committed to the public GitHub repository.</w:t>
+            </w:r>
+          </w:p>
+        </w:tc>
+        <w:tc>
+          <w:tcPr>
+            <w:tcW w:w="1283" w:type="dxa"/>
+          </w:tcPr>
+          <w:p>
+            <w:r>
+              <w:t>Low</w:t>
+            </w:r>
+          </w:p>
+        </w:tc>
+        <w:tc>
+          <w:tcPr>
+            <w:tcW w:w="1096" w:type="dxa"/>
+          </w:tcPr>
+          <w:p>
+            <w:r>
+              <w:t>High</w:t>
+            </w:r>
+          </w:p>
+        </w:tc>
+        <w:tc>
+          <w:tcPr>
+            <w:tcW w:w="1130" w:type="dxa"/>
+          </w:tcPr>
+          <w:p>
+            <w:r>
+              <w:t>Medium</w:t>
+            </w:r>
+          </w:p>
+        </w:tc>
+        <w:tc>
+          <w:tcPr>
+            <w:tcW w:w="1631" w:type="dxa"/>
+          </w:tcPr>
+          <w:p>
+            <w:r>
+              <w:t xml:space="preserve">Configure </w:t>
+            </w:r>
+            <w:r>
+              <w:rPr>
+                <w:rStyle w:val="HTMLCode"/>
+                <w:rFonts w:eastAsiaTheme="minorHAnsi"/>
+              </w:rPr>
+              <w:t>.</w:t>
+            </w:r>
+            <w:proofErr w:type="spellStart"/>
+            <w:r>
+              <w:rPr>
+                <w:rStyle w:val="HTMLCode"/>
+                <w:rFonts w:eastAsiaTheme="minorHAnsi"/>
+              </w:rPr>
+              <w:t>gitignore</w:t>
+            </w:r>
+            <w:proofErr w:type="spellEnd"/>
+            <w:r>
+              <w:t xml:space="preserve"> from day one, use environment variables,  and run automated secret-scanning pre-commit checks.</w:t>
+            </w:r>
+          </w:p>
+        </w:tc>
+        <w:tc>
+          <w:tcPr>
+            <w:tcW w:w="1132" w:type="dxa"/>
+          </w:tcPr>
+          <w:p>
+            <w:r>
+              <w:t>All team members</w:t>
+            </w:r>
+          </w:p>
+        </w:tc>
+        <w:tc>
+          <w:tcPr>
+            <w:tcW w:w="1481" w:type="dxa"/>
+          </w:tcPr>
+          <w:p>
+            <w:sdt>
+              <w:sdtPr>
+                <w:id w:val="1905251714"/>
+                <w14:checkbox>
+                  <w14:checked w14:val="0"/>
+                  <w14:checkedState w14:val="2612" w14:font="MS Gothic"/>
+                  <w14:uncheckedState w14:val="2610" w14:font="MS Gothic"/>
+                </w14:checkbox>
+              </w:sdtPr>
+              <w:sdtContent>
+                <w:r>
+                  <w:rPr>
+                    <w:rFonts w:ascii="MS Gothic" w:eastAsia="MS Gothic" w:hAnsi="MS Gothic" w:hint="eastAsia"/>
+                  </w:rPr>
+                  <w:t>☐</w:t>
+                </w:r>
+              </w:sdtContent>
+            </w:sdt>
+            <w:r>
+              <w:t>Open</w:t>
+            </w:r>
+          </w:p>
+          <w:p>
+            <w:sdt>
+              <w:sdtPr>
+                <w:id w:val="864789870"/>
+                <w14:checkbox>
+                  <w14:checked w14:val="1"/>
+                  <w14:checkedState w14:val="2612" w14:font="MS Gothic"/>
+                  <w14:uncheckedState w14:val="2610" w14:font="MS Gothic"/>
+                </w14:checkbox>
+              </w:sdtPr>
+              <w:sdtContent>
+                <w:r>
+                  <w:rPr>
+                    <w:rFonts w:ascii="MS Gothic" w:eastAsia="MS Gothic" w:hAnsi="MS Gothic" w:hint="eastAsia"/>
+                  </w:rPr>
+                  <w:t>☒</w:t>
+                </w:r>
+              </w:sdtContent>
+            </w:sdt>
+            <w:r>
+              <w:t>Mitigated</w:t>
+            </w:r>
+          </w:p>
+          <w:p>
+            <w:sdt>
+              <w:sdtPr>
+                <w:id w:val="-950933924"/>
+                <w14:checkbox>
+                  <w14:checked w14:val="0"/>
+                  <w14:checkedState w14:val="2612" w14:font="MS Gothic"/>
+                  <w14:uncheckedState w14:val="2610" w14:font="MS Gothic"/>
+                </w14:checkbox>
+              </w:sdtPr>
+              <w:sdtContent>
+                <w:r>
+                  <w:rPr>
+                    <w:rFonts w:ascii="MS Gothic" w:eastAsia="MS Gothic" w:hAnsi="MS Gothic" w:hint="eastAsia"/>
+                  </w:rPr>
+                  <w:t>☐</w:t>
+                </w:r>
+              </w:sdtContent>
+            </w:sdt>
+            <w:r>
+              <w:t>Realised</w:t>
+            </w:r>
+            <w:r>
+              <w:fldChar w:fldCharType="begin"/>
+            </w:r>
+            <w:r>
+              <w:instrText xml:space="preserve"> =NAME </w:instrText>
+            </w:r>
+            <w:r>
+              <w:fldChar w:fldCharType="separate"/>
+            </w:r>
+            <w:r>
+              <w:fldChar w:fldCharType="end"/>
+            </w:r>
+          </w:p>
+        </w:tc>
+      </w:tr>
+      <w:tr>
+        <w:trPr>
+          <w:cantSplit/>
+        </w:trPr>
+        <w:tc>
+          <w:tcPr>
+            <w:tcW w:w="737" w:type="dxa"/>
+          </w:tcPr>
+          <w:p>
+            <w:pPr>
+              <w:pStyle w:val="Heading2"/>
+            </w:pPr>
+            <w:bookmarkStart w:id="26" w:name="_Toc239800800"/>
+            <w:bookmarkStart w:id="27" w:name="_Toc239871323"/>
+            <w:r>
+              <w:t>RSK-006</w:t>
+            </w:r>
+            <w:bookmarkEnd w:id="26"/>
+            <w:bookmarkEnd w:id="27"/>
+          </w:p>
+        </w:tc>
+        <w:tc>
+          <w:tcPr>
+            <w:tcW w:w="2199" w:type="dxa"/>
+          </w:tcPr>
+          <w:p>
+            <w:pPr>
+              <w:rPr>
+                <w:b/>
+                <w:bCs/>
+              </w:rPr>
+            </w:pPr>
+            <w:r>
+              <w:rPr>
+                <w:b/>
+                <w:bCs/>
+              </w:rPr>
+              <w:t>Inconsistent Environment:</w:t>
+            </w:r>
+            <w:r>
+              <w:t xml:space="preserve"> Code runs correctly on a developer's local machine but fails in Staging or Production environments due to configuration drift.</w:t>
+            </w:r>
+          </w:p>
+        </w:tc>
+        <w:tc>
+          <w:tcPr>
+            <w:tcW w:w="1283" w:type="dxa"/>
+          </w:tcPr>
+          <w:p>
+            <w:r>
+              <w:t>Medium</w:t>
+            </w:r>
+          </w:p>
+        </w:tc>
+        <w:tc>
+          <w:tcPr>
+            <w:tcW w:w="1096" w:type="dxa"/>
+          </w:tcPr>
+          <w:p>
+            <w:r>
+              <w:t>High</w:t>
+            </w:r>
+          </w:p>
+        </w:tc>
+        <w:tc>
+          <w:tcPr>
+            <w:tcW w:w="1130" w:type="dxa"/>
+          </w:tcPr>
+          <w:p>
+            <w:r>
+              <w:t>High</w:t>
+            </w:r>
+          </w:p>
+        </w:tc>
+        <w:tc>
+          <w:tcPr>
+            <w:tcW w:w="1631" w:type="dxa"/>
+          </w:tcPr>
+          <w:p>
+            <w:r>
+              <w:t>Containerise application dependencies using Docker or maintain strict environment configuration files early in M2/M3.</w:t>
+            </w:r>
+          </w:p>
+        </w:tc>
+        <w:tc>
+          <w:tcPr>
+            <w:tcW w:w="1132" w:type="dxa"/>
+          </w:tcPr>
+          <w:p>
+            <w:r>
+              <w:t>All team members</w:t>
+            </w:r>
+          </w:p>
+        </w:tc>
+        <w:tc>
+          <w:tcPr>
+            <w:tcW w:w="1481" w:type="dxa"/>
+          </w:tcPr>
+          <w:p>
+            <w:sdt>
+              <w:sdtPr>
+                <w:id w:val="-827902978"/>
+                <w14:checkbox>
+                  <w14:checked w14:val="1"/>
+                  <w14:checkedState w14:val="2612" w14:font="MS Gothic"/>
+                  <w14:uncheckedState w14:val="2610" w14:font="MS Gothic"/>
+                </w14:checkbox>
+              </w:sdtPr>
+              <w:sdtContent>
+                <w:r>
+                  <w:rPr>
+                    <w:rFonts w:ascii="MS Gothic" w:eastAsia="MS Gothic" w:hAnsi="MS Gothic" w:hint="eastAsia"/>
+                  </w:rPr>
+                  <w:t>☒</w:t>
+                </w:r>
+              </w:sdtContent>
+            </w:sdt>
+            <w:r>
+              <w:t>Open</w:t>
+            </w:r>
+          </w:p>
+          <w:p>
+            <w:sdt>
+              <w:sdtPr>
+                <w:id w:val="-569963868"/>
+                <w14:checkbox>
+                  <w14:checked w14:val="0"/>
+                  <w14:checkedState w14:val="2612" w14:font="MS Gothic"/>
+                  <w14:uncheckedState w14:val="2610" w14:font="MS Gothic"/>
+                </w14:checkbox>
+              </w:sdtPr>
+              <w:sdtContent>
+                <w:r>
+                  <w:rPr>
+                    <w:rFonts w:ascii="MS Gothic" w:eastAsia="MS Gothic" w:hAnsi="MS Gothic" w:hint="eastAsia"/>
+                  </w:rPr>
+                  <w:t>☐</w:t>
+                </w:r>
+              </w:sdtContent>
+            </w:sdt>
+            <w:r>
+              <w:t>Mitigated</w:t>
+            </w:r>
+          </w:p>
+          <w:p>
+            <w:sdt>
+              <w:sdtPr>
+                <w:id w:val="-1826737260"/>
+                <w14:checkbox>
+                  <w14:checked w14:val="0"/>
+                  <w14:checkedState w14:val="2612" w14:font="MS Gothic"/>
+                  <w14:uncheckedState w14:val="2610" w14:font="MS Gothic"/>
+                </w14:checkbox>
+              </w:sdtPr>
+              <w:sdtContent>
+                <w:r>
+                  <w:rPr>
+                    <w:rFonts w:ascii="MS Gothic" w:eastAsia="MS Gothic" w:hAnsi="MS Gothic" w:hint="eastAsia"/>
+                  </w:rPr>
+                  <w:t>☐</w:t>
+                </w:r>
+              </w:sdtContent>
+            </w:sdt>
+            <w:r>
+              <w:t>Realised</w:t>
+            </w:r>
+            <w:r>
+              <w:fldChar w:fldCharType="begin"/>
+            </w:r>
+            <w:r>
+              <w:instrText xml:space="preserve"> =NAME </w:instrText>
+            </w:r>
+            <w:r>
+              <w:fldChar w:fldCharType="separate"/>
+            </w:r>
+            <w:r>
+              <w:fldChar w:fldCharType="end"/>
+            </w:r>
+          </w:p>
+        </w:tc>
+      </w:tr>
+    </w:tbl>
     <w:p/>
     <w:p>
       <w:pPr>
@@ -4834,7 +6501,24 @@
         <w:br w:type="page"/>
       </w:r>
     </w:p>
-    <w:bookmarkStart w:id="19" w:name="_Toc239866580" w:displacedByCustomXml="next"/>
+    <w:p>
+      <w:pPr>
+        <w:pStyle w:val="Heading1"/>
+      </w:pPr>
+      <w:bookmarkStart w:id="28" w:name="_Toc239871324"/>
+      <w:r>
+        <w:lastRenderedPageBreak/>
+        <w:t>Process</w:t>
+      </w:r>
+      <w:bookmarkEnd w:id="28"/>
+    </w:p>
+    <w:p/>
+    <w:p>
+      <w:r>
+        <w:br w:type="page"/>
+      </w:r>
+    </w:p>
+    <w:bookmarkStart w:id="29" w:name="_Toc239871325" w:displacedByCustomXml="next"/>
     <w:sdt>
       <w:sdtPr>
         <w:rPr>
@@ -4848,6 +6532,7 @@
           <w:docPartUnique/>
         </w:docPartObj>
       </w:sdtPr>
+      <w:sdtEndPr/>
       <w:sdtContent>
         <w:p>
           <w:pPr>
@@ -4856,15 +6541,25 @@
           <w:r>
             <w:t>References</w:t>
           </w:r>
-          <w:bookmarkEnd w:id="19"/>
+          <w:bookmarkEnd w:id="29"/>
         </w:p>
         <w:sdt>
           <w:sdtPr>
             <w:id w:val="-573587230"/>
             <w:bibliography/>
           </w:sdtPr>
+          <w:sdtEndPr/>
           <w:sdtContent>
             <w:p>
+              <w:pPr>
+                <w:pStyle w:val="Bibliography"/>
+                <w:rPr>
+                  <w:noProof/>
+                  <w:kern w:val="0"/>
+                  <w:szCs w:val="24"/>
+                  <w14:ligatures w14:val="none"/>
+                </w:rPr>
+              </w:pPr>
               <w:r>
                 <w:fldChar w:fldCharType="begin"/>
               </w:r>
@@ -4876,13 +6571,54 @@
               </w:r>
               <w:r>
                 <w:rPr>
-                  <w:b/>
-                  <w:bCs/>
                   <w:noProof/>
-                  <w:lang w:val="en-US"/>
                 </w:rPr>
-                <w:t>There are no sources in the current document.</w:t>
+                <w:t xml:space="preserve">Gong, Y. Y. J. a. S. X., 2020. Towards a comprehensive understanding of digital transformation in government: Analysis of flexibility and enterprise architecture.. </w:t>
               </w:r>
+              <w:r>
+                <w:rPr>
+                  <w:i/>
+                  <w:iCs/>
+                  <w:noProof/>
+                </w:rPr>
+                <w:t xml:space="preserve">Government information quarterly, </w:t>
+              </w:r>
+              <w:r>
+                <w:rPr>
+                  <w:noProof/>
+                </w:rPr>
+                <w:t>37(3), p. 101487.</w:t>
+              </w:r>
+            </w:p>
+            <w:p>
+              <w:pPr>
+                <w:pStyle w:val="Bibliography"/>
+                <w:rPr>
+                  <w:noProof/>
+                </w:rPr>
+              </w:pPr>
+              <w:r>
+                <w:rPr>
+                  <w:noProof/>
+                </w:rPr>
+                <w:t xml:space="preserve">Mergel, I. E. N. a. H. N., 2019. Defining digital transformation: Results from expert interviews.. </w:t>
+              </w:r>
+              <w:r>
+                <w:rPr>
+                  <w:i/>
+                  <w:iCs/>
+                  <w:noProof/>
+                </w:rPr>
+                <w:t xml:space="preserve">Government information quarterly, </w:t>
+              </w:r>
+              <w:r>
+                <w:rPr>
+                  <w:noProof/>
+                </w:rPr>
+                <w:t>36(4), p. 1101385.</w:t>
+              </w:r>
+            </w:p>
+            <w:p>
               <w:r>
                 <w:rPr>
                   <w:b/>
@@ -4902,8 +6638,9 @@
       </w:pPr>
     </w:p>
     <w:sectPr>
+      <w:footerReference w:type="default" r:id="rId9"/>
       <w:pgSz w:w="11906" w:h="16838"/>
-      <w:pgMar w:top="1440" w:right="1440" w:bottom="1440" w:left="1440" w:header="708" w:footer="708" w:gutter="0"/>
+      <w:pgMar w:top="1440" w:right="1440" w:bottom="1440" w:left="1440" w:header="708" w:footer="283" w:gutter="0"/>
       <w:pgNumType w:start="0"/>
       <w:cols w:space="708"/>
       <w:titlePg/>
@@ -4911,6 +6648,186 @@
     </w:sectPr>
   </w:body>
 </w:document>
+</file>
+
+<file path=word/endnotes.xml><?xml version="1.0" encoding="utf-8"?>
+<w:endnotes xmlns:wpc="http://schemas.microsoft.com/office/word/2010/wordprocessingCanvas" xmlns:cx="http://schemas.microsoft.com/office/drawing/2014/chartex" xmlns:cx1="http://schemas.microsoft.com/office/drawing/2015/9/8/chartex" xmlns:cx2="http://schemas.microsoft.com/office/drawing/2015/10/21/chartex" xmlns:cx3="http://schemas.microsoft.com/office/drawing/2016/5/9/chartex" xmlns:cx4="http://schemas.microsoft.com/office/drawing/2016/5/10/chartex" xmlns:cx5="http://schemas.microsoft.com/office/drawing/2016/5/11/chartex" xmlns:cx6="http://schemas.microsoft.com/office/drawing/2016/5/12/chartex" xmlns:cx7="http://schemas.microsoft.com/office/drawing/2016/5/13/chartex" xmlns:cx8="http://schemas.microsoft.com/office/drawing/2016/5/14/chartex" xmlns:mc="http://schemas.openxmlformats.org/markup-compatibility/2006" xmlns:aink="http://schemas.microsoft.com/office/drawing/2016/ink" xmlns:am3d="http://schemas.microsoft.com/office/drawing/2017/model3d" xmlns:o="urn:schemas-microsoft-com:office:office" xmlns:oel="http://schemas.microsoft.com/office/2019/extlst" xmlns:r="http://schemas.openxmlformats.org/officeDocument/2006/relationships" xmlns:m="http://schemas.openxmlformats.org/officeDocument/2006/math" xmlns:v="urn:schemas-microsoft-com:vml" xmlns:wp14="http://schemas.microsoft.com/office/word/2010/wordprocessingDrawing" xmlns:wp="http://schemas.openxmlformats.org/drawingml/2006/wordprocessingDrawing" xmlns:w10="urn:schemas-microsoft-com:office:word" xmlns:w="http://schemas.openxmlformats.org/wordprocessingml/2006/main" xmlns:w14="http://schemas.microsoft.com/office/word/2010/wordml" xmlns:w15="http://schemas.microsoft.com/office/word/2012/wordml" xmlns:w16cex="http://schemas.microsoft.com/office/word/2018/wordml/cex" xmlns:w16cid="http://schemas.microsoft.com/office/word/2016/wordml/cid" xmlns:w16="http://schemas.microsoft.com/office/word/2018/wordml" xmlns:w16du="http://schemas.microsoft.com/office/word/2023/wordml/word16du" xmlns:w16sdtdh="http://schemas.microsoft.com/office/word/2020/wordml/sdtdatahash" xmlns:w16sdtfl="http://schemas.microsoft.com/office/word/2024/wordml/sdtformatlock" xmlns:w16se="http://schemas.microsoft.com/office/word/2015/wordml/symex" xmlns:wpg="http://schemas.microsoft.com/office/word/2010/wordprocessingGroup" xmlns:wpi="http://schemas.microsoft.com/office/word/2010/wordprocessingInk" xmlns:wne="http://schemas.microsoft.com/office/word/2006/wordml" xmlns:wps="http://schemas.microsoft.com/office/word/2010/wordprocessingShape" mc:Ignorable="w14 w15 w16se w16cid w16 w16cex w16sdtdh w16sdtfl w16du wp14">
+  <w:endnote w:type="separator" w:id="-1">
+    <w:p>
+      <w:pPr>
+        <w:spacing w:before="0" w:after="0" w:line="240" w:lineRule="auto"/>
+      </w:pPr>
+      <w:r>
+        <w:separator/>
+      </w:r>
+    </w:p>
+  </w:endnote>
+  <w:endnote w:type="continuationSeparator" w:id="0">
+    <w:p>
+      <w:pPr>
+        <w:spacing w:before="0" w:after="0" w:line="240" w:lineRule="auto"/>
+      </w:pPr>
+      <w:r>
+        <w:continuationSeparator/>
+      </w:r>
+    </w:p>
+  </w:endnote>
+</w:endnotes>
+</file>
+
+<file path=word/footer1.xml><?xml version="1.0" encoding="utf-8"?>
+<w:ftr xmlns:wpc="http://schemas.microsoft.com/office/word/2010/wordprocessingCanvas" xmlns:cx="http://schemas.microsoft.com/office/drawing/2014/chartex" xmlns:cx1="http://schemas.microsoft.com/office/drawing/2015/9/8/chartex" xmlns:cx2="http://schemas.microsoft.com/office/drawing/2015/10/21/chartex" xmlns:cx3="http://schemas.microsoft.com/office/drawing/2016/5/9/chartex" xmlns:cx4="http://schemas.microsoft.com/office/drawing/2016/5/10/chartex" xmlns:cx5="http://schemas.microsoft.com/office/drawing/2016/5/11/chartex" xmlns:cx6="http://schemas.microsoft.com/office/drawing/2016/5/12/chartex" xmlns:cx7="http://schemas.microsoft.com/office/drawing/2016/5/13/chartex" xmlns:cx8="http://schemas.microsoft.com/office/drawing/2016/5/14/chartex" xmlns:mc="http://schemas.openxmlformats.org/markup-compatibility/2006" xmlns:aink="http://schemas.microsoft.com/office/drawing/2016/ink" xmlns:am3d="http://schemas.microsoft.com/office/drawing/2017/model3d" xmlns:o="urn:schemas-microsoft-com:office:office" xmlns:oel="http://schemas.microsoft.com/office/2019/extlst" xmlns:r="http://schemas.openxmlformats.org/officeDocument/2006/relationships" xmlns:m="http://schemas.openxmlformats.org/officeDocument/2006/math" xmlns:v="urn:schemas-microsoft-com:vml" xmlns:wp14="http://schemas.microsoft.com/office/word/2010/wordprocessingDrawing" xmlns:wp="http://schemas.openxmlformats.org/drawingml/2006/wordprocessingDrawing" xmlns:w10="urn:schemas-microsoft-com:office:word" xmlns:w="http://schemas.openxmlformats.org/wordprocessingml/2006/main" xmlns:w14="http://schemas.microsoft.com/office/word/2010/wordml" xmlns:w15="http://schemas.microsoft.com/office/word/2012/wordml" xmlns:w16cex="http://schemas.microsoft.com/office/word/2018/wordml/cex" xmlns:w16cid="http://schemas.microsoft.com/office/word/2016/wordml/cid" xmlns:w16="http://schemas.microsoft.com/office/word/2018/wordml" xmlns:w16du="http://schemas.microsoft.com/office/word/2023/wordml/word16du" xmlns:w16sdtdh="http://schemas.microsoft.com/office/word/2020/wordml/sdtdatahash" xmlns:w16sdtfl="http://schemas.microsoft.com/office/word/2024/wordml/sdtformatlock" xmlns:w16se="http://schemas.microsoft.com/office/word/2015/wordml/symex" xmlns:wpg="http://schemas.microsoft.com/office/word/2010/wordprocessingGroup" xmlns:wpi="http://schemas.microsoft.com/office/word/2010/wordprocessingInk" xmlns:wne="http://schemas.microsoft.com/office/word/2006/wordml" xmlns:wps="http://schemas.microsoft.com/office/word/2010/wordprocessingShape" mc:Ignorable="w14 w15 w16se w16cid w16 w16cex w16sdtdh w16sdtfl w16du wp14">
+  <w:tbl>
+    <w:tblPr>
+      <w:tblStyle w:val="TableGrid"/>
+      <w:tblW w:w="9072" w:type="dxa"/>
+      <w:jc w:val="center"/>
+      <w:tblBorders>
+        <w:top w:val="none" w:sz="0" w:space="0" w:color="auto"/>
+        <w:left w:val="none" w:sz="0" w:space="0" w:color="auto"/>
+        <w:bottom w:val="none" w:sz="0" w:space="0" w:color="auto"/>
+        <w:right w:val="none" w:sz="0" w:space="0" w:color="auto"/>
+        <w:insideH w:val="none" w:sz="0" w:space="0" w:color="auto"/>
+        <w:insideV w:val="none" w:sz="0" w:space="0" w:color="auto"/>
+      </w:tblBorders>
+      <w:tblLook w:val="04A0" w:firstRow="1" w:lastRow="0" w:firstColumn="1" w:lastColumn="0" w:noHBand="0" w:noVBand="1"/>
+    </w:tblPr>
+    <w:tblGrid>
+      <w:gridCol w:w="2835"/>
+      <w:gridCol w:w="3402"/>
+      <w:gridCol w:w="2835"/>
+    </w:tblGrid>
+    <w:tr>
+      <w:trPr>
+        <w:jc w:val="center"/>
+      </w:trPr>
+      <w:tc>
+        <w:tcPr>
+          <w:tcW w:w="2835" w:type="dxa"/>
+          <w:vAlign w:val="center"/>
+        </w:tcPr>
+        <w:p>
+          <w:pPr>
+            <w:pStyle w:val="Footer"/>
+          </w:pPr>
+          <w:r>
+            <w:rPr>
+              <w:szCs w:val="22"/>
+              <w:lang w:val="en-ZA"/>
+            </w:rPr>
+            <w:t>SEN381</w:t>
+          </w:r>
+        </w:p>
+      </w:tc>
+      <w:sdt>
+        <w:sdtPr>
+          <w:alias w:val="Author"/>
+          <w:tag w:val=""/>
+          <w:id w:val="-1848550216"/>
+          <w:placeholder>
+            <w:docPart w:val="AFEC7BAD283B4A5EAC8B3A140916473C"/>
+          </w:placeholder>
+          <w:dataBinding w:prefixMappings="xmlns:ns0='http://purl.org/dc/elements/1.1/' xmlns:ns1='http://schemas.openxmlformats.org/package/2006/metadata/core-properties' " w:xpath="/ns1:coreProperties[1]/ns0:creator[1]" w:storeItemID="{6C3C8BC8-F283-45AE-878A-BAB7291924A1}"/>
+          <w:text/>
+        </w:sdtPr>
+        <w:sdtContent>
+          <w:tc>
+            <w:tcPr>
+              <w:tcW w:w="3402" w:type="dxa"/>
+              <w:vAlign w:val="center"/>
+            </w:tcPr>
+            <w:p>
+              <w:pPr>
+                <w:pStyle w:val="Footer"/>
+                <w:jc w:val="center"/>
+              </w:pPr>
+              <w:r>
+                <w:t>GERALD ENRIGHT 577830 | KELETSO MAROTA 601632 | MOGAU MALOPE 600192</w:t>
+              </w:r>
+            </w:p>
+          </w:tc>
+        </w:sdtContent>
+      </w:sdt>
+      <w:tc>
+        <w:tcPr>
+          <w:tcW w:w="2835" w:type="dxa"/>
+          <w:vAlign w:val="center"/>
+        </w:tcPr>
+        <w:p>
+          <w:pPr>
+            <w:pStyle w:val="Footer"/>
+            <w:jc w:val="right"/>
+          </w:pPr>
+          <w:r>
+            <w:rPr>
+              <w:color w:val="7F7F7F" w:themeColor="background1" w:themeShade="7F"/>
+              <w:spacing w:val="60"/>
+            </w:rPr>
+            <w:t>Page</w:t>
+          </w:r>
+          <w:r>
+            <w:t xml:space="preserve"> | </w:t>
+          </w:r>
+          <w:r>
+            <w:fldChar w:fldCharType="begin"/>
+          </w:r>
+          <w:r>
+            <w:instrText xml:space="preserve"> PAGE   \* MERGEFORMAT </w:instrText>
+          </w:r>
+          <w:r>
+            <w:fldChar w:fldCharType="separate"/>
+          </w:r>
+          <w:r>
+            <w:rPr>
+              <w:b/>
+              <w:bCs/>
+              <w:noProof/>
+            </w:rPr>
+            <w:t>1</w:t>
+          </w:r>
+          <w:r>
+            <w:rPr>
+              <w:b/>
+              <w:bCs/>
+              <w:noProof/>
+            </w:rPr>
+            <w:fldChar w:fldCharType="end"/>
+          </w:r>
+        </w:p>
+      </w:tc>
+    </w:tr>
+  </w:tbl>
+  <w:p>
+    <w:pPr>
+      <w:pStyle w:val="Footer"/>
+    </w:pPr>
+  </w:p>
+</w:ftr>
+</file>
+
+<file path=word/footnotes.xml><?xml version="1.0" encoding="utf-8"?>
+<w:footnotes xmlns:wpc="http://schemas.microsoft.com/office/word/2010/wordprocessingCanvas" xmlns:cx="http://schemas.microsoft.com/office/drawing/2014/chartex" xmlns:cx1="http://schemas.microsoft.com/office/drawing/2015/9/8/chartex" xmlns:cx2="http://schemas.microsoft.com/office/drawing/2015/10/21/chartex" xmlns:cx3="http://schemas.microsoft.com/office/drawing/2016/5/9/chartex" xmlns:cx4="http://schemas.microsoft.com/office/drawing/2016/5/10/chartex" xmlns:cx5="http://schemas.microsoft.com/office/drawing/2016/5/11/chartex" xmlns:cx6="http://schemas.microsoft.com/office/drawing/2016/5/12/chartex" xmlns:cx7="http://schemas.microsoft.com/office/drawing/2016/5/13/chartex" xmlns:cx8="http://schemas.microsoft.com/office/drawing/2016/5/14/chartex" xmlns:mc="http://schemas.openxmlformats.org/markup-compatibility/2006" xmlns:aink="http://schemas.microsoft.com/office/drawing/2016/ink" xmlns:am3d="http://schemas.microsoft.com/office/drawing/2017/model3d" xmlns:o="urn:schemas-microsoft-com:office:office" xmlns:oel="http://schemas.microsoft.com/office/2019/extlst" xmlns:r="http://schemas.openxmlformats.org/officeDocument/2006/relationships" xmlns:m="http://schemas.openxmlformats.org/officeDocument/2006/math" xmlns:v="urn:schemas-microsoft-com:vml" xmlns:wp14="http://schemas.microsoft.com/office/word/2010/wordprocessingDrawing" xmlns:wp="http://schemas.openxmlformats.org/drawingml/2006/wordprocessingDrawing" xmlns:w10="urn:schemas-microsoft-com:office:word" xmlns:w="http://schemas.openxmlformats.org/wordprocessingml/2006/main" xmlns:w14="http://schemas.microsoft.com/office/word/2010/wordml" xmlns:w15="http://schemas.microsoft.com/office/word/2012/wordml" xmlns:w16cex="http://schemas.microsoft.com/office/word/2018/wordml/cex" xmlns:w16cid="http://schemas.microsoft.com/office/word/2016/wordml/cid" xmlns:w16="http://schemas.microsoft.com/office/word/2018/wordml" xmlns:w16du="http://schemas.microsoft.com/office/word/2023/wordml/word16du" xmlns:w16sdtdh="http://schemas.microsoft.com/office/word/2020/wordml/sdtdatahash" xmlns:w16sdtfl="http://schemas.microsoft.com/office/word/2024/wordml/sdtformatlock" xmlns:w16se="http://schemas.microsoft.com/office/word/2015/wordml/symex" xmlns:wpg="http://schemas.microsoft.com/office/word/2010/wordprocessingGroup" xmlns:wpi="http://schemas.microsoft.com/office/word/2010/wordprocessingInk" xmlns:wne="http://schemas.microsoft.com/office/word/2006/wordml" xmlns:wps="http://schemas.microsoft.com/office/word/2010/wordprocessingShape" mc:Ignorable="w14 w15 w16se w16cid w16 w16cex w16sdtdh w16sdtfl w16du wp14">
+  <w:footnote w:type="separator" w:id="-1">
+    <w:p>
+      <w:pPr>
+        <w:spacing w:before="0" w:after="0" w:line="240" w:lineRule="auto"/>
+      </w:pPr>
+      <w:r>
+        <w:separator/>
+      </w:r>
+    </w:p>
+  </w:footnote>
+  <w:footnote w:type="continuationSeparator" w:id="0">
+    <w:p>
+      <w:pPr>
+        <w:spacing w:before="0" w:after="0" w:line="240" w:lineRule="auto"/>
+      </w:pPr>
+      <w:r>
+        <w:continuationSeparator/>
+      </w:r>
+    </w:p>
+  </w:footnote>
+</w:footnotes>
 </file>
 
 <file path=word/numbering.xml><?xml version="1.0" encoding="utf-8"?>
@@ -5029,6 +6946,119 @@
     </w:lvl>
   </w:abstractNum>
   <w:abstractNum w:abstractNumId="1" w15:restartNumberingAfterBreak="0">
+    <w:nsid w:val="5C4D4984"/>
+    <w:multiLevelType w:val="hybridMultilevel"/>
+    <w:tmpl w:val="3294B574"/>
+    <w:lvl w:ilvl="0" w:tplc="1C090001">
+      <w:start w:val="1"/>
+      <w:numFmt w:val="bullet"/>
+      <w:lvlText w:val=""/>
+      <w:lvlJc w:val="left"/>
+      <w:pPr>
+        <w:ind w:left="720" w:hanging="360"/>
+      </w:pPr>
+      <w:rPr>
+        <w:rFonts w:ascii="Symbol" w:hAnsi="Symbol" w:hint="default"/>
+      </w:rPr>
+    </w:lvl>
+    <w:lvl w:ilvl="1" w:tplc="1C090003" w:tentative="1">
+      <w:start w:val="1"/>
+      <w:numFmt w:val="bullet"/>
+      <w:lvlText w:val="o"/>
+      <w:lvlJc w:val="left"/>
+      <w:pPr>
+        <w:ind w:left="1440" w:hanging="360"/>
+      </w:pPr>
+      <w:rPr>
+        <w:rFonts w:ascii="Courier New" w:hAnsi="Courier New" w:cs="Courier New" w:hint="default"/>
+      </w:rPr>
+    </w:lvl>
+    <w:lvl w:ilvl="2" w:tplc="1C090005" w:tentative="1">
+      <w:start w:val="1"/>
+      <w:numFmt w:val="bullet"/>
+      <w:lvlText w:val=""/>
+      <w:lvlJc w:val="left"/>
+      <w:pPr>
+        <w:ind w:left="2160" w:hanging="360"/>
+      </w:pPr>
+      <w:rPr>
+        <w:rFonts w:ascii="Wingdings" w:hAnsi="Wingdings" w:hint="default"/>
+      </w:rPr>
+    </w:lvl>
+    <w:lvl w:ilvl="3" w:tplc="1C090001" w:tentative="1">
+      <w:start w:val="1"/>
+      <w:numFmt w:val="bullet"/>
+      <w:lvlText w:val=""/>
+      <w:lvlJc w:val="left"/>
+      <w:pPr>
+        <w:ind w:left="2880" w:hanging="360"/>
+      </w:pPr>
+      <w:rPr>
+        <w:rFonts w:ascii="Symbol" w:hAnsi="Symbol" w:hint="default"/>
+      </w:rPr>
+    </w:lvl>
+    <w:lvl w:ilvl="4" w:tplc="1C090003" w:tentative="1">
+      <w:start w:val="1"/>
+      <w:numFmt w:val="bullet"/>
+      <w:lvlText w:val="o"/>
+      <w:lvlJc w:val="left"/>
+      <w:pPr>
+        <w:ind w:left="3600" w:hanging="360"/>
+      </w:pPr>
+      <w:rPr>
+        <w:rFonts w:ascii="Courier New" w:hAnsi="Courier New" w:cs="Courier New" w:hint="default"/>
+      </w:rPr>
+    </w:lvl>
+    <w:lvl w:ilvl="5" w:tplc="1C090005" w:tentative="1">
+      <w:start w:val="1"/>
+      <w:numFmt w:val="bullet"/>
+      <w:lvlText w:val=""/>
+      <w:lvlJc w:val="left"/>
+      <w:pPr>
+        <w:ind w:left="4320" w:hanging="360"/>
+      </w:pPr>
+      <w:rPr>
+        <w:rFonts w:ascii="Wingdings" w:hAnsi="Wingdings" w:hint="default"/>
+      </w:rPr>
+    </w:lvl>
+    <w:lvl w:ilvl="6" w:tplc="1C090001" w:tentative="1">
+      <w:start w:val="1"/>
+      <w:numFmt w:val="bullet"/>
+      <w:lvlText w:val=""/>
+      <w:lvlJc w:val="left"/>
+      <w:pPr>
+        <w:ind w:left="5040" w:hanging="360"/>
+      </w:pPr>
+      <w:rPr>
+        <w:rFonts w:ascii="Symbol" w:hAnsi="Symbol" w:hint="default"/>
+      </w:rPr>
+    </w:lvl>
+    <w:lvl w:ilvl="7" w:tplc="1C090003" w:tentative="1">
+      <w:start w:val="1"/>
+      <w:numFmt w:val="bullet"/>
+      <w:lvlText w:val="o"/>
+      <w:lvlJc w:val="left"/>
+      <w:pPr>
+        <w:ind w:left="5760" w:hanging="360"/>
+      </w:pPr>
+      <w:rPr>
+        <w:rFonts w:ascii="Courier New" w:hAnsi="Courier New" w:cs="Courier New" w:hint="default"/>
+      </w:rPr>
+    </w:lvl>
+    <w:lvl w:ilvl="8" w:tplc="1C090005" w:tentative="1">
+      <w:start w:val="1"/>
+      <w:numFmt w:val="bullet"/>
+      <w:lvlText w:val=""/>
+      <w:lvlJc w:val="left"/>
+      <w:pPr>
+        <w:ind w:left="6480" w:hanging="360"/>
+      </w:pPr>
+      <w:rPr>
+        <w:rFonts w:ascii="Wingdings" w:hAnsi="Wingdings" w:hint="default"/>
+      </w:rPr>
+    </w:lvl>
+  </w:abstractNum>
+  <w:abstractNum w:abstractNumId="2" w15:restartNumberingAfterBreak="0">
     <w:nsid w:val="7F140625"/>
     <w:multiLevelType w:val="hybridMultilevel"/>
     <w:tmpl w:val="E3224926"/>
@@ -5144,6 +7174,9 @@
     <w:abstractNumId w:val="0"/>
   </w:num>
   <w:num w:numId="2" w16cid:durableId="477041688">
+    <w:abstractNumId w:val="2"/>
+  </w:num>
+  <w:num w:numId="3" w16cid:durableId="1179583226">
     <w:abstractNumId w:val="1"/>
   </w:num>
 </w:numbering>
@@ -6296,7 +8329,672 @@
       <w:ind w:left="480"/>
     </w:pPr>
   </w:style>
+  <w:style w:type="character" w:styleId="HTMLCode">
+    <w:name w:val="HTML Code"/>
+    <w:basedOn w:val="DefaultParagraphFont"/>
+    <w:uiPriority w:val="99"/>
+    <w:semiHidden/>
+    <w:unhideWhenUsed/>
+    <w:rsid w:val="000E4D83"/>
+    <w:rPr>
+      <w:rFonts w:ascii="Courier New" w:eastAsia="Times New Roman" w:hAnsi="Courier New" w:cs="Courier New"/>
+      <w:sz w:val="20"/>
+      <w:szCs w:val="20"/>
+    </w:rPr>
+  </w:style>
+  <w:style w:type="paragraph" w:styleId="Header">
+    <w:name w:val="header"/>
+    <w:basedOn w:val="Normal"/>
+    <w:link w:val="HeaderChar"/>
+    <w:uiPriority w:val="99"/>
+    <w:unhideWhenUsed/>
+    <w:rsid w:val="00D42BBB"/>
+    <w:pPr>
+      <w:tabs>
+        <w:tab w:val="center" w:pos="4513"/>
+        <w:tab w:val="right" w:pos="9026"/>
+      </w:tabs>
+      <w:spacing w:before="0" w:after="0" w:line="240" w:lineRule="auto"/>
+    </w:pPr>
+  </w:style>
+  <w:style w:type="character" w:customStyle="1" w:styleId="HeaderChar">
+    <w:name w:val="Header Char"/>
+    <w:basedOn w:val="DefaultParagraphFont"/>
+    <w:link w:val="Header"/>
+    <w:uiPriority w:val="99"/>
+    <w:rsid w:val="00D42BBB"/>
+    <w:rPr>
+      <w:rFonts w:ascii="Times New Roman" w:hAnsi="Times New Roman"/>
+      <w:sz w:val="24"/>
+    </w:rPr>
+  </w:style>
+  <w:style w:type="paragraph" w:styleId="Footer">
+    <w:name w:val="footer"/>
+    <w:basedOn w:val="Normal"/>
+    <w:link w:val="FooterChar"/>
+    <w:uiPriority w:val="99"/>
+    <w:unhideWhenUsed/>
+    <w:rsid w:val="00D42BBB"/>
+    <w:pPr>
+      <w:tabs>
+        <w:tab w:val="center" w:pos="4513"/>
+        <w:tab w:val="right" w:pos="9026"/>
+      </w:tabs>
+      <w:spacing w:before="0" w:after="0" w:line="240" w:lineRule="auto"/>
+    </w:pPr>
+  </w:style>
+  <w:style w:type="character" w:customStyle="1" w:styleId="FooterChar">
+    <w:name w:val="Footer Char"/>
+    <w:basedOn w:val="DefaultParagraphFont"/>
+    <w:link w:val="Footer"/>
+    <w:uiPriority w:val="99"/>
+    <w:rsid w:val="00D42BBB"/>
+    <w:rPr>
+      <w:rFonts w:ascii="Times New Roman" w:hAnsi="Times New Roman"/>
+      <w:sz w:val="24"/>
+    </w:rPr>
+  </w:style>
+  <w:style w:type="character" w:styleId="PlaceholderText">
+    <w:name w:val="Placeholder Text"/>
+    <w:basedOn w:val="DefaultParagraphFont"/>
+    <w:uiPriority w:val="99"/>
+    <w:semiHidden/>
+    <w:rsid w:val="005D1A68"/>
+    <w:rPr>
+      <w:color w:val="666666"/>
+    </w:rPr>
+  </w:style>
+  <w:style w:type="paragraph" w:styleId="Bibliography">
+    <w:name w:val="Bibliography"/>
+    <w:basedOn w:val="Normal"/>
+    <w:next w:val="Normal"/>
+    <w:uiPriority w:val="37"/>
+    <w:unhideWhenUsed/>
+    <w:rsid w:val="00880D7D"/>
+  </w:style>
 </w:styles>
+</file>
+
+<file path=word/glossary/document.xml><?xml version="1.0" encoding="utf-8"?>
+<w:glossaryDocument xmlns:wpc="http://schemas.microsoft.com/office/word/2010/wordprocessingCanvas" xmlns:cx="http://schemas.microsoft.com/office/drawing/2014/chartex" xmlns:cx1="http://schemas.microsoft.com/office/drawing/2015/9/8/chartex" xmlns:cx2="http://schemas.microsoft.com/office/drawing/2015/10/21/chartex" xmlns:cx3="http://schemas.microsoft.com/office/drawing/2016/5/9/chartex" xmlns:cx4="http://schemas.microsoft.com/office/drawing/2016/5/10/chartex" xmlns:cx5="http://schemas.microsoft.com/office/drawing/2016/5/11/chartex" xmlns:cx6="http://schemas.microsoft.com/office/drawing/2016/5/12/chartex" xmlns:cx7="http://schemas.microsoft.com/office/drawing/2016/5/13/chartex" xmlns:cx8="http://schemas.microsoft.com/office/drawing/2016/5/14/chartex" xmlns:mc="http://schemas.openxmlformats.org/markup-compatibility/2006" xmlns:aink="http://schemas.microsoft.com/office/drawing/2016/ink" xmlns:am3d="http://schemas.microsoft.com/office/drawing/2017/model3d" xmlns:o="urn:schemas-microsoft-com:office:office" xmlns:oel="http://schemas.microsoft.com/office/2019/extlst" xmlns:r="http://schemas.openxmlformats.org/officeDocument/2006/relationships" xmlns:m="http://schemas.openxmlformats.org/officeDocument/2006/math" xmlns:v="urn:schemas-microsoft-com:vml" xmlns:wp14="http://schemas.microsoft.com/office/word/2010/wordprocessingDrawing" xmlns:wp="http://schemas.openxmlformats.org/drawingml/2006/wordprocessingDrawing" xmlns:w10="urn:schemas-microsoft-com:office:word" xmlns:w="http://schemas.openxmlformats.org/wordprocessingml/2006/main" xmlns:w14="http://schemas.microsoft.com/office/word/2010/wordml" xmlns:w15="http://schemas.microsoft.com/office/word/2012/wordml" xmlns:w16cex="http://schemas.microsoft.com/office/word/2018/wordml/cex" xmlns:w16cid="http://schemas.microsoft.com/office/word/2016/wordml/cid" xmlns:w16="http://schemas.microsoft.com/office/word/2018/wordml" xmlns:w16du="http://schemas.microsoft.com/office/word/2023/wordml/word16du" xmlns:w16sdtdh="http://schemas.microsoft.com/office/word/2020/wordml/sdtdatahash" xmlns:w16sdtfl="http://schemas.microsoft.com/office/word/2024/wordml/sdtformatlock" xmlns:w16se="http://schemas.microsoft.com/office/word/2015/wordml/symex" xmlns:wpg="http://schemas.microsoft.com/office/word/2010/wordprocessingGroup" xmlns:wpi="http://schemas.microsoft.com/office/word/2010/wordprocessingInk" xmlns:wne="http://schemas.microsoft.com/office/word/2006/wordml" xmlns:wps="http://schemas.microsoft.com/office/word/2010/wordprocessingShape" mc:Ignorable="w14 w15 w16se w16cid w16 w16cex w16sdtdh w16sdtfl w16du wp14">
+  <w:docParts>
+    <w:docPart>
+      <w:docPartPr>
+        <w:name w:val="AFEC7BAD283B4A5EAC8B3A140916473C"/>
+        <w:category>
+          <w:name w:val="General"/>
+          <w:gallery w:val="placeholder"/>
+        </w:category>
+        <w:types>
+          <w:type w:val="bbPlcHdr"/>
+        </w:types>
+        <w:behaviors>
+          <w:behavior w:val="content"/>
+        </w:behaviors>
+        <w:guid w:val="{C0FB0EC0-4C10-4FD9-8264-960D7B9ADA63}"/>
+      </w:docPartPr>
+      <w:docPartBody>
+        <w:p>
+          <w:r>
+            <w:rPr>
+              <w:rStyle w:val="PlaceholderText"/>
+            </w:rPr>
+            <w:t>[Author]</w:t>
+          </w:r>
+        </w:p>
+      </w:docPartBody>
+    </w:docPart>
+  </w:docParts>
+</w:glossaryDocument>
+</file>
+
+<file path=word/glossary/fontTable.xml><?xml version="1.0" encoding="utf-8"?>
+<w:fonts xmlns:mc="http://schemas.openxmlformats.org/markup-compatibility/2006" xmlns:r="http://schemas.openxmlformats.org/officeDocument/2006/relationships" xmlns:w="http://schemas.openxmlformats.org/wordprocessingml/2006/main" xmlns:w14="http://schemas.microsoft.com/office/word/2010/wordml" xmlns:w15="http://schemas.microsoft.com/office/word/2012/wordml" xmlns:w16cex="http://schemas.microsoft.com/office/word/2018/wordml/cex" xmlns:w16cid="http://schemas.microsoft.com/office/word/2016/wordml/cid" xmlns:w16="http://schemas.microsoft.com/office/word/2018/wordml" xmlns:w16du="http://schemas.microsoft.com/office/word/2023/wordml/word16du" xmlns:w16sdtdh="http://schemas.microsoft.com/office/word/2020/wordml/sdtdatahash" xmlns:w16sdtfl="http://schemas.microsoft.com/office/word/2024/wordml/sdtformatlock" xmlns:w16se="http://schemas.microsoft.com/office/word/2015/wordml/symex" mc:Ignorable="w14 w15 w16se w16cid w16 w16cex w16sdtdh w16sdtfl w16du">
+  <w:font w:name="Symbol">
+    <w:panose1 w:val="05050102010706020507"/>
+    <w:charset w:val="02"/>
+    <w:family w:val="roman"/>
+    <w:pitch w:val="variable"/>
+    <w:sig w:usb0="00000000" w:usb1="10000000" w:usb2="00000000" w:usb3="00000000" w:csb0="80000000" w:csb1="00000000"/>
+  </w:font>
+  <w:font w:name="Times New Roman">
+    <w:panose1 w:val="02020603050405020304"/>
+    <w:charset w:val="00"/>
+    <w:family w:val="roman"/>
+    <w:pitch w:val="variable"/>
+    <w:sig w:usb0="E0002EFF" w:usb1="C000785B" w:usb2="00000009" w:usb3="00000000" w:csb0="000001FF" w:csb1="00000000"/>
+  </w:font>
+  <w:font w:name="Courier New">
+    <w:panose1 w:val="02070309020205020404"/>
+    <w:charset w:val="00"/>
+    <w:family w:val="modern"/>
+    <w:pitch w:val="fixed"/>
+    <w:sig w:usb0="E0002EFF" w:usb1="C0007843" w:usb2="00000009" w:usb3="00000000" w:csb0="000001FF" w:csb1="00000000"/>
+  </w:font>
+  <w:font w:name="Wingdings">
+    <w:panose1 w:val="05000000000000000000"/>
+    <w:charset w:val="02"/>
+    <w:family w:val="auto"/>
+    <w:pitch w:val="variable"/>
+    <w:sig w:usb0="00000000" w:usb1="10000000" w:usb2="00000000" w:usb3="00000000" w:csb0="80000000" w:csb1="00000000"/>
+  </w:font>
+  <w:font w:name="Aptos">
+    <w:charset w:val="00"/>
+    <w:family w:val="swiss"/>
+    <w:pitch w:val="variable"/>
+    <w:sig w:usb0="20000287" w:usb1="00000003" w:usb2="00000000" w:usb3="00000000" w:csb0="0000019F" w:csb1="00000000"/>
+  </w:font>
+  <w:font w:name="Arial">
+    <w:panose1 w:val="020B0604020202020204"/>
+    <w:charset w:val="00"/>
+    <w:family w:val="swiss"/>
+    <w:pitch w:val="variable"/>
+    <w:sig w:usb0="E0002EFF" w:usb1="C000785B" w:usb2="00000009" w:usb3="00000000" w:csb0="000001FF" w:csb1="00000000"/>
+  </w:font>
+  <w:font w:name="Aptos Display">
+    <w:charset w:val="00"/>
+    <w:family w:val="swiss"/>
+    <w:pitch w:val="variable"/>
+    <w:sig w:usb0="20000287" w:usb1="00000003" w:usb2="00000000" w:usb3="00000000" w:csb0="0000019F" w:csb1="00000000"/>
+  </w:font>
+  <w:font w:name="MS Gothic">
+    <w:altName w:val="ＭＳ ゴシック"/>
+    <w:panose1 w:val="020B0609070205080204"/>
+    <w:charset w:val="80"/>
+    <w:family w:val="modern"/>
+    <w:pitch w:val="fixed"/>
+    <w:sig w:usb0="E00002FF" w:usb1="6AC7FDFB" w:usb2="08000012" w:usb3="00000000" w:csb0="0002009F" w:csb1="00000000"/>
+  </w:font>
+</w:fonts>
+</file>
+
+<file path=word/glossary/settings.xml><?xml version="1.0" encoding="utf-8"?>
+<w:settings xmlns:mc="http://schemas.openxmlformats.org/markup-compatibility/2006" xmlns:o="urn:schemas-microsoft-com:office:office" xmlns:r="http://schemas.openxmlformats.org/officeDocument/2006/relationships" xmlns:m="http://schemas.openxmlformats.org/officeDocument/2006/math" xmlns:v="urn:schemas-microsoft-com:vml" xmlns:w10="urn:schemas-microsoft-com:office:word" xmlns:w="http://schemas.openxmlformats.org/wordprocessingml/2006/main" xmlns:w14="http://schemas.microsoft.com/office/word/2010/wordml" xmlns:w15="http://schemas.microsoft.com/office/word/2012/wordml" xmlns:w16cex="http://schemas.microsoft.com/office/word/2018/wordml/cex" xmlns:w16cid="http://schemas.microsoft.com/office/word/2016/wordml/cid" xmlns:w16="http://schemas.microsoft.com/office/word/2018/wordml" xmlns:w16du="http://schemas.microsoft.com/office/word/2023/wordml/word16du" xmlns:w16sdtdh="http://schemas.microsoft.com/office/word/2020/wordml/sdtdatahash" xmlns:w16sdtfl="http://schemas.microsoft.com/office/word/2024/wordml/sdtformatlock" xmlns:w16se="http://schemas.microsoft.com/office/word/2015/wordml/symex" xmlns:sl="http://schemas.openxmlformats.org/schemaLibrary/2006/main" mc:Ignorable="w14 w15 w16se w16cid w16 w16cex w16sdtdh w16sdtfl w16du">
+  <w:view w:val="normal"/>
+  <w:defaultTabStop w:val="720"/>
+  <w:characterSpacingControl w:val="doNotCompress"/>
+  <w:compat>
+    <w:useFELayout/>
+    <w:compatSetting w:name="compatibilityMode" w:uri="http://schemas.microsoft.com/office/word" w:val="15"/>
+    <w:compatSetting w:name="overrideTableStyleFontSizeAndJustification" w:uri="http://schemas.microsoft.com/office/word" w:val="1"/>
+    <w:compatSetting w:name="enableOpenTypeFeatures" w:uri="http://schemas.microsoft.com/office/word" w:val="1"/>
+    <w:compatSetting w:name="doNotFlipMirrorIndents" w:uri="http://schemas.microsoft.com/office/word" w:val="1"/>
+    <w:compatSetting w:name="differentiateMultirowTableHeaders" w:uri="http://schemas.microsoft.com/office/word" w:val="1"/>
+    <w:compatSetting w:name="useWord2013TrackBottomHyphenation" w:uri="http://schemas.microsoft.com/office/word" w:val="0"/>
+  </w:compat>
+  <w:rsids>
+    <w:rsidRoot w:val="007C611A"/>
+    <w:rsid w:val="007C611A"/>
+    <w:rsid w:val="00C30A39"/>
+    <w:rsid w:val="00D44B7F"/>
+  </w:rsids>
+  <m:mathPr>
+    <m:mathFont m:val="Cambria Math"/>
+    <m:brkBin m:val="before"/>
+    <m:brkBinSub m:val="--"/>
+    <m:smallFrac m:val="0"/>
+    <m:dispDef/>
+    <m:lMargin m:val="0"/>
+    <m:rMargin m:val="0"/>
+    <m:defJc m:val="centerGroup"/>
+    <m:wrapIndent m:val="1440"/>
+    <m:intLim m:val="subSup"/>
+    <m:naryLim m:val="undOvr"/>
+  </m:mathPr>
+  <w:themeFontLang w:val="en-ZA"/>
+  <w:clrSchemeMapping w:bg1="light1" w:t1="dark1" w:bg2="light2" w:t2="dark2" w:accent1="accent1" w:accent2="accent2" w:accent3="accent3" w:accent4="accent4" w:accent5="accent5" w:accent6="accent6" w:hyperlink="hyperlink" w:followedHyperlink="followedHyperlink"/>
+  <w:decimalSymbol w:val="."/>
+  <w:listSeparator w:val=","/>
+  <w15:chartTrackingRefBased/>
+</w:settings>
+</file>
+
+<file path=word/glossary/styles.xml><?xml version="1.0" encoding="utf-8"?>
+<w:styles xmlns:mc="http://schemas.openxmlformats.org/markup-compatibility/2006" xmlns:r="http://schemas.openxmlformats.org/officeDocument/2006/relationships" xmlns:w="http://schemas.openxmlformats.org/wordprocessingml/2006/main" xmlns:w14="http://schemas.microsoft.com/office/word/2010/wordml" xmlns:w15="http://schemas.microsoft.com/office/word/2012/wordml" xmlns:w16cex="http://schemas.microsoft.com/office/word/2018/wordml/cex" xmlns:w16cid="http://schemas.microsoft.com/office/word/2016/wordml/cid" xmlns:w16="http://schemas.microsoft.com/office/word/2018/wordml" xmlns:w16du="http://schemas.microsoft.com/office/word/2023/wordml/word16du" xmlns:w16sdtdh="http://schemas.microsoft.com/office/word/2020/wordml/sdtdatahash" xmlns:w16sdtfl="http://schemas.microsoft.com/office/word/2024/wordml/sdtformatlock" xmlns:w16se="http://schemas.microsoft.com/office/word/2015/wordml/symex" mc:Ignorable="w14 w15 w16se w16cid w16 w16cex w16sdtdh w16sdtfl w16du">
+  <w:docDefaults>
+    <w:rPrDefault>
+      <w:rPr>
+        <w:rFonts w:asciiTheme="minorHAnsi" w:eastAsiaTheme="minorEastAsia" w:hAnsiTheme="minorHAnsi" w:cstheme="minorBidi"/>
+        <w:kern w:val="2"/>
+        <w:sz w:val="24"/>
+        <w:szCs w:val="24"/>
+        <w:lang w:val="en-ZA" w:eastAsia="en-ZA" w:bidi="ar-SA"/>
+        <w14:ligatures w14:val="standardContextual"/>
+      </w:rPr>
+    </w:rPrDefault>
+    <w:pPrDefault>
+      <w:pPr>
+        <w:spacing w:after="160" w:line="278" w:lineRule="auto"/>
+      </w:pPr>
+    </w:pPrDefault>
+  </w:docDefaults>
+  <w:latentStyles w:defLockedState="0" w:defUIPriority="99" w:defSemiHidden="0" w:defUnhideWhenUsed="0" w:defQFormat="0" w:count="376">
+    <w:lsdException w:name="Normal" w:uiPriority="0" w:qFormat="1"/>
+    <w:lsdException w:name="heading 1" w:uiPriority="9" w:qFormat="1"/>
+    <w:lsdException w:name="heading 2" w:semiHidden="1" w:uiPriority="9" w:unhideWhenUsed="1" w:qFormat="1"/>
+    <w:lsdException w:name="heading 3" w:semiHidden="1" w:uiPriority="9" w:unhideWhenUsed="1" w:qFormat="1"/>
+    <w:lsdException w:name="heading 4" w:semiHidden="1" w:uiPriority="9" w:unhideWhenUsed="1" w:qFormat="1"/>
+    <w:lsdException w:name="heading 5" w:semiHidden="1" w:uiPriority="9" w:unhideWhenUsed="1" w:qFormat="1"/>
+    <w:lsdException w:name="heading 6" w:semiHidden="1" w:uiPriority="9" w:unhideWhenUsed="1" w:qFormat="1"/>
+    <w:lsdException w:name="heading 7" w:semiHidden="1" w:uiPriority="9" w:unhideWhenUsed="1" w:qFormat="1"/>
+    <w:lsdException w:name="heading 8" w:semiHidden="1" w:uiPriority="9" w:unhideWhenUsed="1" w:qFormat="1"/>
+    <w:lsdException w:name="heading 9" w:semiHidden="1" w:uiPriority="9" w:unhideWhenUsed="1" w:qFormat="1"/>
+    <w:lsdException w:name="index 1" w:semiHidden="1" w:unhideWhenUsed="1"/>
+    <w:lsdException w:name="index 2" w:semiHidden="1" w:unhideWhenUsed="1"/>
+    <w:lsdException w:name="index 3" w:semiHidden="1" w:unhideWhenUsed="1"/>
+    <w:lsdException w:name="index 4" w:semiHidden="1" w:unhideWhenUsed="1"/>
+    <w:lsdException w:name="index 5" w:semiHidden="1" w:unhideWhenUsed="1"/>
+    <w:lsdException w:name="index 6" w:semiHidden="1" w:unhideWhenUsed="1"/>
+    <w:lsdException w:name="index 7" w:semiHidden="1" w:unhideWhenUsed="1"/>
+    <w:lsdException w:name="index 8" w:semiHidden="1" w:unhideWhenUsed="1"/>
+    <w:lsdException w:name="index 9" w:semiHidden="1" w:unhideWhenUsed="1"/>
+    <w:lsdException w:name="toc 1" w:semiHidden="1" w:uiPriority="39" w:unhideWhenUsed="1"/>
+    <w:lsdException w:name="toc 2" w:semiHidden="1" w:uiPriority="39" w:unhideWhenUsed="1"/>
+    <w:lsdException w:name="toc 3" w:semiHidden="1" w:uiPriority="39" w:unhideWhenUsed="1"/>
+    <w:lsdException w:name="toc 4" w:semiHidden="1" w:uiPriority="39" w:unhideWhenUsed="1"/>
+    <w:lsdException w:name="toc 5" w:semiHidden="1" w:uiPriority="39" w:unhideWhenUsed="1"/>
+    <w:lsdException w:name="toc 6" w:semiHidden="1" w:uiPriority="39" w:unhideWhenUsed="1"/>
+    <w:lsdException w:name="toc 7" w:semiHidden="1" w:uiPriority="39" w:unhideWhenUsed="1"/>
+    <w:lsdException w:name="toc 8" w:semiHidden="1" w:uiPriority="39" w:unhideWhenUsed="1"/>
+    <w:lsdException w:name="toc 9" w:semiHidden="1" w:uiPriority="39" w:unhideWhenUsed="1"/>
+    <w:lsdException w:name="Normal Indent" w:semiHidden="1" w:unhideWhenUsed="1"/>
+    <w:lsdException w:name="footnote text" w:semiHidden="1" w:unhideWhenUsed="1"/>
+    <w:lsdException w:name="annotation text" w:semiHidden="1" w:unhideWhenUsed="1"/>
+    <w:lsdException w:name="header" w:semiHidden="1" w:unhideWhenUsed="1"/>
+    <w:lsdException w:name="footer" w:semiHidden="1" w:unhideWhenUsed="1"/>
+    <w:lsdException w:name="index heading" w:semiHidden="1" w:unhideWhenUsed="1"/>
+    <w:lsdException w:name="caption" w:semiHidden="1" w:uiPriority="35" w:unhideWhenUsed="1" w:qFormat="1"/>
+    <w:lsdException w:name="table of figures" w:semiHidden="1" w:unhideWhenUsed="1"/>
+    <w:lsdException w:name="envelope address" w:semiHidden="1" w:unhideWhenUsed="1"/>
+    <w:lsdException w:name="envelope return" w:semiHidden="1" w:unhideWhenUsed="1"/>
+    <w:lsdException w:name="footnote reference" w:semiHidden="1" w:unhideWhenUsed="1"/>
+    <w:lsdException w:name="annotation reference" w:semiHidden="1" w:unhideWhenUsed="1"/>
+    <w:lsdException w:name="line number" w:semiHidden="1" w:unhideWhenUsed="1"/>
+    <w:lsdException w:name="page number" w:semiHidden="1" w:unhideWhenUsed="1"/>
+    <w:lsdException w:name="endnote reference" w:semiHidden="1" w:unhideWhenUsed="1"/>
+    <w:lsdException w:name="endnote text" w:semiHidden="1" w:unhideWhenUsed="1"/>
+    <w:lsdException w:name="table of authorities" w:semiHidden="1" w:unhideWhenUsed="1"/>
+    <w:lsdException w:name="macro" w:semiHidden="1" w:unhideWhenUsed="1"/>
+    <w:lsdException w:name="toa heading" w:semiHidden="1" w:unhideWhenUsed="1"/>
+    <w:lsdException w:name="List" w:semiHidden="1" w:unhideWhenUsed="1"/>
+    <w:lsdException w:name="List Bullet" w:semiHidden="1" w:unhideWhenUsed="1"/>
+    <w:lsdException w:name="List Number" w:semiHidden="1" w:unhideWhenUsed="1"/>
+    <w:lsdException w:name="List 2" w:semiHidden="1" w:unhideWhenUsed="1"/>
+    <w:lsdException w:name="List 3" w:semiHidden="1" w:unhideWhenUsed="1"/>
+    <w:lsdException w:name="List 4" w:semiHidden="1" w:unhideWhenUsed="1"/>
+    <w:lsdException w:name="List 5" w:semiHidden="1" w:unhideWhenUsed="1"/>
+    <w:lsdException w:name="List Bullet 2" w:semiHidden="1" w:unhideWhenUsed="1"/>
+    <w:lsdException w:name="List Bullet 3" w:semiHidden="1" w:unhideWhenUsed="1"/>
+    <w:lsdException w:name="List Bullet 4" w:semiHidden="1" w:unhideWhenUsed="1"/>
+    <w:lsdException w:name="List Bullet 5" w:semiHidden="1" w:unhideWhenUsed="1"/>
+    <w:lsdException w:name="List Number 2" w:semiHidden="1" w:unhideWhenUsed="1"/>
+    <w:lsdException w:name="List Number 3" w:semiHidden="1" w:unhideWhenUsed="1"/>
+    <w:lsdException w:name="List Number 4" w:semiHidden="1" w:unhideWhenUsed="1"/>
+    <w:lsdException w:name="List Number 5" w:semiHidden="1" w:unhideWhenUsed="1"/>
+    <w:lsdException w:name="Title" w:uiPriority="10" w:qFormat="1"/>
+    <w:lsdException w:name="Closing" w:semiHidden="1" w:unhideWhenUsed="1"/>
+    <w:lsdException w:name="Signature" w:semiHidden="1" w:unhideWhenUsed="1"/>
+    <w:lsdException w:name="Default Paragraph Font" w:semiHidden="1" w:uiPriority="1" w:unhideWhenUsed="1"/>
+    <w:lsdException w:name="Body Text" w:semiHidden="1" w:unhideWhenUsed="1"/>
+    <w:lsdException w:name="Body Text Indent" w:semiHidden="1" w:unhideWhenUsed="1"/>
+    <w:lsdException w:name="List Continue" w:semiHidden="1" w:unhideWhenUsed="1"/>
+    <w:lsdException w:name="List Continue 2" w:semiHidden="1" w:unhideWhenUsed="1"/>
+    <w:lsdException w:name="List Continue 3" w:semiHidden="1" w:unhideWhenUsed="1"/>
+    <w:lsdException w:name="List Continue 4" w:semiHidden="1" w:unhideWhenUsed="1"/>
+    <w:lsdException w:name="List Continue 5" w:semiHidden="1" w:unhideWhenUsed="1"/>
+    <w:lsdException w:name="Message Header" w:semiHidden="1" w:unhideWhenUsed="1"/>
+    <w:lsdException w:name="Subtitle" w:uiPriority="11" w:qFormat="1"/>
+    <w:lsdException w:name="Salutation" w:semiHidden="1" w:unhideWhenUsed="1"/>
+    <w:lsdException w:name="Date" w:semiHidden="1" w:unhideWhenUsed="1"/>
+    <w:lsdException w:name="Body Text First Indent" w:semiHidden="1" w:unhideWhenUsed="1"/>
+    <w:lsdException w:name="Body Text First Indent 2" w:semiHidden="1" w:unhideWhenUsed="1"/>
+    <w:lsdException w:name="Note Heading" w:semiHidden="1" w:unhideWhenUsed="1"/>
+    <w:lsdException w:name="Body Text 2" w:semiHidden="1" w:unhideWhenUsed="1"/>
+    <w:lsdException w:name="Body Text 3" w:semiHidden="1" w:unhideWhenUsed="1"/>
+    <w:lsdException w:name="Body Text Indent 2" w:semiHidden="1" w:unhideWhenUsed="1"/>
+    <w:lsdException w:name="Body Text Indent 3" w:semiHidden="1" w:unhideWhenUsed="1"/>
+    <w:lsdException w:name="Block Text" w:semiHidden="1" w:unhideWhenUsed="1"/>
+    <w:lsdException w:name="Hyperlink" w:semiHidden="1" w:unhideWhenUsed="1"/>
+    <w:lsdException w:name="FollowedHyperlink" w:semiHidden="1" w:unhideWhenUsed="1"/>
+    <w:lsdException w:name="Strong" w:uiPriority="22" w:qFormat="1"/>
+    <w:lsdException w:name="Emphasis" w:uiPriority="20" w:qFormat="1"/>
+    <w:lsdException w:name="Document Map" w:semiHidden="1" w:unhideWhenUsed="1"/>
+    <w:lsdException w:name="Plain Text" w:semiHidden="1" w:unhideWhenUsed="1"/>
+    <w:lsdException w:name="E-mail Signature" w:semiHidden="1" w:unhideWhenUsed="1"/>
+    <w:lsdException w:name="HTML Top of Form" w:semiHidden="1" w:unhideWhenUsed="1"/>
+    <w:lsdException w:name="HTML Bottom of Form" w:semiHidden="1" w:unhideWhenUsed="1"/>
+    <w:lsdException w:name="Normal (Web)" w:semiHidden="1" w:unhideWhenUsed="1"/>
+    <w:lsdException w:name="HTML Acronym" w:semiHidden="1" w:unhideWhenUsed="1"/>
+    <w:lsdException w:name="HTML Address" w:semiHidden="1" w:unhideWhenUsed="1"/>
+    <w:lsdException w:name="HTML Cite" w:semiHidden="1" w:unhideWhenUsed="1"/>
+    <w:lsdException w:name="HTML Code" w:semiHidden="1" w:unhideWhenUsed="1"/>
+    <w:lsdException w:name="HTML Definition" w:semiHidden="1" w:unhideWhenUsed="1"/>
+    <w:lsdException w:name="HTML Keyboard" w:semiHidden="1" w:unhideWhenUsed="1"/>
+    <w:lsdException w:name="HTML Preformatted" w:semiHidden="1" w:unhideWhenUsed="1"/>
+    <w:lsdException w:name="HTML Sample" w:semiHidden="1" w:unhideWhenUsed="1"/>
+    <w:lsdException w:name="HTML Typewriter" w:semiHidden="1" w:unhideWhenUsed="1"/>
+    <w:lsdException w:name="HTML Variable" w:semiHidden="1" w:unhideWhenUsed="1"/>
+    <w:lsdException w:name="Normal Table" w:semiHidden="1" w:unhideWhenUsed="1"/>
+    <w:lsdException w:name="annotation subject" w:semiHidden="1" w:unhideWhenUsed="1"/>
+    <w:lsdException w:name="No List" w:semiHidden="1" w:unhideWhenUsed="1"/>
+    <w:lsdException w:name="Outline List 1" w:semiHidden="1" w:unhideWhenUsed="1"/>
+    <w:lsdException w:name="Outline List 2" w:semiHidden="1" w:unhideWhenUsed="1"/>
+    <w:lsdException w:name="Outline List 3" w:semiHidden="1" w:unhideWhenUsed="1"/>
+    <w:lsdException w:name="Table Simple 1" w:semiHidden="1" w:unhideWhenUsed="1"/>
+    <w:lsdException w:name="Table Simple 2" w:semiHidden="1" w:unhideWhenUsed="1"/>
+    <w:lsdException w:name="Table Simple 3" w:semiHidden="1" w:unhideWhenUsed="1"/>
+    <w:lsdException w:name="Table Classic 1" w:semiHidden="1" w:unhideWhenUsed="1"/>
+    <w:lsdException w:name="Table Classic 2" w:semiHidden="1" w:unhideWhenUsed="1"/>
+    <w:lsdException w:name="Table Classic 3" w:semiHidden="1" w:unhideWhenUsed="1"/>
+    <w:lsdException w:name="Table Classic 4" w:semiHidden="1" w:unhideWhenUsed="1"/>
+    <w:lsdException w:name="Table Colorful 1" w:semiHidden="1" w:unhideWhenUsed="1"/>
+    <w:lsdException w:name="Table Colorful 2" w:semiHidden="1" w:unhideWhenUsed="1"/>
+    <w:lsdException w:name="Table Colorful 3" w:semiHidden="1" w:unhideWhenUsed="1"/>
+    <w:lsdException w:name="Table Columns 1" w:semiHidden="1" w:unhideWhenUsed="1"/>
+    <w:lsdException w:name="Table Columns 2" w:semiHidden="1" w:unhideWhenUsed="1"/>
+    <w:lsdException w:name="Table Columns 3" w:semiHidden="1" w:unhideWhenUsed="1"/>
+    <w:lsdException w:name="Table Columns 4" w:semiHidden="1" w:unhideWhenUsed="1"/>
+    <w:lsdException w:name="Table Columns 5" w:semiHidden="1" w:unhideWhenUsed="1"/>
+    <w:lsdException w:name="Table Grid 1" w:semiHidden="1" w:unhideWhenUsed="1"/>
+    <w:lsdException w:name="Table Grid 2" w:semiHidden="1" w:unhideWhenUsed="1"/>
+    <w:lsdException w:name="Table Grid 3" w:semiHidden="1" w:unhideWhenUsed="1"/>
+    <w:lsdException w:name="Table Grid 4" w:semiHidden="1" w:unhideWhenUsed="1"/>
+    <w:lsdException w:name="Table Grid 5" w:semiHidden="1" w:unhideWhenUsed="1"/>
+    <w:lsdException w:name="Table Grid 6" w:semiHidden="1" w:unhideWhenUsed="1"/>
+    <w:lsdException w:name="Table Grid 7" w:semiHidden="1" w:unhideWhenUsed="1"/>
+    <w:lsdException w:name="Table Grid 8" w:semiHidden="1" w:unhideWhenUsed="1"/>
+    <w:lsdException w:name="Table List 1" w:semiHidden="1" w:unhideWhenUsed="1"/>
+    <w:lsdException w:name="Table List 2" w:semiHidden="1" w:unhideWhenUsed="1"/>
+    <w:lsdException w:name="Table List 3" w:semiHidden="1" w:unhideWhenUsed="1"/>
+    <w:lsdException w:name="Table List 4" w:semiHidden="1" w:unhideWhenUsed="1"/>
+    <w:lsdException w:name="Table List 5" w:semiHidden="1" w:unhideWhenUsed="1"/>
+    <w:lsdException w:name="Table List 6" w:semiHidden="1" w:unhideWhenUsed="1"/>
+    <w:lsdException w:name="Table List 7" w:semiHidden="1" w:unhideWhenUsed="1"/>
+    <w:lsdException w:name="Table List 8" w:semiHidden="1" w:unhideWhenUsed="1"/>
+    <w:lsdException w:name="Table 3D effects 1" w:semiHidden="1" w:unhideWhenUsed="1"/>
+    <w:lsdException w:name="Table 3D effects 2" w:semiHidden="1" w:unhideWhenUsed="1"/>
+    <w:lsdException w:name="Table 3D effects 3" w:semiHidden="1" w:unhideWhenUsed="1"/>
+    <w:lsdException w:name="Table Contemporary" w:semiHidden="1" w:unhideWhenUsed="1"/>
+    <w:lsdException w:name="Table Elegant" w:semiHidden="1" w:unhideWhenUsed="1"/>
+    <w:lsdException w:name="Table Professional" w:semiHidden="1" w:unhideWhenUsed="1"/>
+    <w:lsdException w:name="Table Subtle 1" w:semiHidden="1" w:unhideWhenUsed="1"/>
+    <w:lsdException w:name="Table Subtle 2" w:semiHidden="1" w:unhideWhenUsed="1"/>
+    <w:lsdException w:name="Table Web 1" w:semiHidden="1" w:unhideWhenUsed="1"/>
+    <w:lsdException w:name="Table Web 2" w:semiHidden="1" w:unhideWhenUsed="1"/>
+    <w:lsdException w:name="Table Web 3" w:semiHidden="1" w:unhideWhenUsed="1"/>
+    <w:lsdException w:name="Balloon Text" w:semiHidden="1" w:unhideWhenUsed="1"/>
+    <w:lsdException w:name="Table Grid" w:uiPriority="39"/>
+    <w:lsdException w:name="Table Theme" w:semiHidden="1" w:unhideWhenUsed="1"/>
+    <w:lsdException w:name="Placeholder Text" w:semiHidden="1"/>
+    <w:lsdException w:name="No Spacing" w:uiPriority="1" w:qFormat="1"/>
+    <w:lsdException w:name="Light Shading" w:uiPriority="60"/>
+    <w:lsdException w:name="Light List" w:uiPriority="61"/>
+    <w:lsdException w:name="Light Grid" w:uiPriority="62"/>
+    <w:lsdException w:name="Medium Shading 1" w:uiPriority="63"/>
+    <w:lsdException w:name="Medium Shading 2" w:uiPriority="64"/>
+    <w:lsdException w:name="Medium List 1" w:uiPriority="65"/>
+    <w:lsdException w:name="Medium List 2" w:uiPriority="66"/>
+    <w:lsdException w:name="Medium Grid 1" w:uiPriority="67"/>
+    <w:lsdException w:name="Medium Grid 2" w:uiPriority="68"/>
+    <w:lsdException w:name="Medium Grid 3" w:uiPriority="69"/>
+    <w:lsdException w:name="Dark List" w:uiPriority="70"/>
+    <w:lsdException w:name="Colorful Shading" w:uiPriority="71"/>
+    <w:lsdException w:name="Colorful List" w:uiPriority="72"/>
+    <w:lsdException w:name="Colorful Grid" w:uiPriority="73"/>
+    <w:lsdException w:name="Light Shading Accent 1" w:uiPriority="60"/>
+    <w:lsdException w:name="Light List Accent 1" w:uiPriority="61"/>
+    <w:lsdException w:name="Light Grid Accent 1" w:uiPriority="62"/>
+    <w:lsdException w:name="Medium Shading 1 Accent 1" w:uiPriority="63"/>
+    <w:lsdException w:name="Medium Shading 2 Accent 1" w:uiPriority="64"/>
+    <w:lsdException w:name="Medium List 1 Accent 1" w:uiPriority="65"/>
+    <w:lsdException w:name="Revision" w:semiHidden="1"/>
+    <w:lsdException w:name="List Paragraph" w:uiPriority="34" w:qFormat="1"/>
+    <w:lsdException w:name="Quote" w:uiPriority="29" w:qFormat="1"/>
+    <w:lsdException w:name="Intense Quote" w:uiPriority="30" w:qFormat="1"/>
+    <w:lsdException w:name="Medium List 2 Accent 1" w:uiPriority="66"/>
+    <w:lsdException w:name="Medium Grid 1 Accent 1" w:uiPriority="67"/>
+    <w:lsdException w:name="Medium Grid 2 Accent 1" w:uiPriority="68"/>
+    <w:lsdException w:name="Medium Grid 3 Accent 1" w:uiPriority="69"/>
+    <w:lsdException w:name="Dark List Accent 1" w:uiPriority="70"/>
+    <w:lsdException w:name="Colorful Shading Accent 1" w:uiPriority="71"/>
+    <w:lsdException w:name="Colorful List Accent 1" w:uiPriority="72"/>
+    <w:lsdException w:name="Colorful Grid Accent 1" w:uiPriority="73"/>
+    <w:lsdException w:name="Light Shading Accent 2" w:uiPriority="60"/>
+    <w:lsdException w:name="Light List Accent 2" w:uiPriority="61"/>
+    <w:lsdException w:name="Light Grid Accent 2" w:uiPriority="62"/>
+    <w:lsdException w:name="Medium Shading 1 Accent 2" w:uiPriority="63"/>
+    <w:lsdException w:name="Medium Shading 2 Accent 2" w:uiPriority="64"/>
+    <w:lsdException w:name="Medium List 1 Accent 2" w:uiPriority="65"/>
+    <w:lsdException w:name="Medium List 2 Accent 2" w:uiPriority="66"/>
+    <w:lsdException w:name="Medium Grid 1 Accent 2" w:uiPriority="67"/>
+    <w:lsdException w:name="Medium Grid 2 Accent 2" w:uiPriority="68"/>
+    <w:lsdException w:name="Medium Grid 3 Accent 2" w:uiPriority="69"/>
+    <w:lsdException w:name="Dark List Accent 2" w:uiPriority="70"/>
+    <w:lsdException w:name="Colorful Shading Accent 2" w:uiPriority="71"/>
+    <w:lsdException w:name="Colorful List Accent 2" w:uiPriority="72"/>
+    <w:lsdException w:name="Colorful Grid Accent 2" w:uiPriority="73"/>
+    <w:lsdException w:name="Light Shading Accent 3" w:uiPriority="60"/>
+    <w:lsdException w:name="Light List Accent 3" w:uiPriority="61"/>
+    <w:lsdException w:name="Light Grid Accent 3" w:uiPriority="62"/>
+    <w:lsdException w:name="Medium Shading 1 Accent 3" w:uiPriority="63"/>
+    <w:lsdException w:name="Medium Shading 2 Accent 3" w:uiPriority="64"/>
+    <w:lsdException w:name="Medium List 1 Accent 3" w:uiPriority="65"/>
+    <w:lsdException w:name="Medium List 2 Accent 3" w:uiPriority="66"/>
+    <w:lsdException w:name="Medium Grid 1 Accent 3" w:uiPriority="67"/>
+    <w:lsdException w:name="Medium Grid 2 Accent 3" w:uiPriority="68"/>
+    <w:lsdException w:name="Medium Grid 3 Accent 3" w:uiPriority="69"/>
+    <w:lsdException w:name="Dark List Accent 3" w:uiPriority="70"/>
+    <w:lsdException w:name="Colorful Shading Accent 3" w:uiPriority="71"/>
+    <w:lsdException w:name="Colorful List Accent 3" w:uiPriority="72"/>
+    <w:lsdException w:name="Colorful Grid Accent 3" w:uiPriority="73"/>
+    <w:lsdException w:name="Light Shading Accent 4" w:uiPriority="60"/>
+    <w:lsdException w:name="Light List Accent 4" w:uiPriority="61"/>
+    <w:lsdException w:name="Light Grid Accent 4" w:uiPriority="62"/>
+    <w:lsdException w:name="Medium Shading 1 Accent 4" w:uiPriority="63"/>
+    <w:lsdException w:name="Medium Shading 2 Accent 4" w:uiPriority="64"/>
+    <w:lsdException w:name="Medium List 1 Accent 4" w:uiPriority="65"/>
+    <w:lsdException w:name="Medium List 2 Accent 4" w:uiPriority="66"/>
+    <w:lsdException w:name="Medium Grid 1 Accent 4" w:uiPriority="67"/>
+    <w:lsdException w:name="Medium Grid 2 Accent 4" w:uiPriority="68"/>
+    <w:lsdException w:name="Medium Grid 3 Accent 4" w:uiPriority="69"/>
+    <w:lsdException w:name="Dark List Accent 4" w:uiPriority="70"/>
+    <w:lsdException w:name="Colorful Shading Accent 4" w:uiPriority="71"/>
+    <w:lsdException w:name="Colorful List Accent 4" w:uiPriority="72"/>
+    <w:lsdException w:name="Colorful Grid Accent 4" w:uiPriority="73"/>
+    <w:lsdException w:name="Light Shading Accent 5" w:uiPriority="60"/>
+    <w:lsdException w:name="Light List Accent 5" w:uiPriority="61"/>
+    <w:lsdException w:name="Light Grid Accent 5" w:uiPriority="62"/>
+    <w:lsdException w:name="Medium Shading 1 Accent 5" w:uiPriority="63"/>
+    <w:lsdException w:name="Medium Shading 2 Accent 5" w:uiPriority="64"/>
+    <w:lsdException w:name="Medium List 1 Accent 5" w:uiPriority="65"/>
+    <w:lsdException w:name="Medium List 2 Accent 5" w:uiPriority="66"/>
+    <w:lsdException w:name="Medium Grid 1 Accent 5" w:uiPriority="67"/>
+    <w:lsdException w:name="Medium Grid 2 Accent 5" w:uiPriority="68"/>
+    <w:lsdException w:name="Medium Grid 3 Accent 5" w:uiPriority="69"/>
+    <w:lsdException w:name="Dark List Accent 5" w:uiPriority="70"/>
+    <w:lsdException w:name="Colorful Shading Accent 5" w:uiPriority="71"/>
+    <w:lsdException w:name="Colorful List Accent 5" w:uiPriority="72"/>
+    <w:lsdException w:name="Colorful Grid Accent 5" w:uiPriority="73"/>
+    <w:lsdException w:name="Light Shading Accent 6" w:uiPriority="60"/>
+    <w:lsdException w:name="Light List Accent 6" w:uiPriority="61"/>
+    <w:lsdException w:name="Light Grid Accent 6" w:uiPriority="62"/>
+    <w:lsdException w:name="Medium Shading 1 Accent 6" w:uiPriority="63"/>
+    <w:lsdException w:name="Medium Shading 2 Accent 6" w:uiPriority="64"/>
+    <w:lsdException w:name="Medium List 1 Accent 6" w:uiPriority="65"/>
+    <w:lsdException w:name="Medium List 2 Accent 6" w:uiPriority="66"/>
+    <w:lsdException w:name="Medium Grid 1 Accent 6" w:uiPriority="67"/>
+    <w:lsdException w:name="Medium Grid 2 Accent 6" w:uiPriority="68"/>
+    <w:lsdException w:name="Medium Grid 3 Accent 6" w:uiPriority="69"/>
+    <w:lsdException w:name="Dark List Accent 6" w:uiPriority="70"/>
+    <w:lsdException w:name="Colorful Shading Accent 6" w:uiPriority="71"/>
+    <w:lsdException w:name="Colorful List Accent 6" w:uiPriority="72"/>
+    <w:lsdException w:name="Colorful Grid Accent 6" w:uiPriority="73"/>
+    <w:lsdException w:name="Subtle Emphasis" w:uiPriority="19" w:qFormat="1"/>
+    <w:lsdException w:name="Intense Emphasis" w:uiPriority="21" w:qFormat="1"/>
+    <w:lsdException w:name="Subtle Reference" w:uiPriority="31" w:qFormat="1"/>
+    <w:lsdException w:name="Intense Reference" w:uiPriority="32" w:qFormat="1"/>
+    <w:lsdException w:name="Book Title" w:uiPriority="33" w:qFormat="1"/>
+    <w:lsdException w:name="Bibliography" w:semiHidden="1" w:uiPriority="37" w:unhideWhenUsed="1"/>
+    <w:lsdException w:name="TOC Heading" w:semiHidden="1" w:uiPriority="39" w:unhideWhenUsed="1" w:qFormat="1"/>
+    <w:lsdException w:name="Plain Table 1" w:uiPriority="41"/>
+    <w:lsdException w:name="Plain Table 2" w:uiPriority="42"/>
+    <w:lsdException w:name="Plain Table 3" w:uiPriority="43"/>
+    <w:lsdException w:name="Plain Table 4" w:uiPriority="44"/>
+    <w:lsdException w:name="Plain Table 5" w:uiPriority="45"/>
+    <w:lsdException w:name="Grid Table Light" w:uiPriority="40"/>
+    <w:lsdException w:name="Grid Table 1 Light" w:uiPriority="46"/>
+    <w:lsdException w:name="Grid Table 2" w:uiPriority="47"/>
+    <w:lsdException w:name="Grid Table 3" w:uiPriority="48"/>
+    <w:lsdException w:name="Grid Table 4" w:uiPriority="49"/>
+    <w:lsdException w:name="Grid Table 5 Dark" w:uiPriority="50"/>
+    <w:lsdException w:name="Grid Table 6 Colorful" w:uiPriority="51"/>
+    <w:lsdException w:name="Grid Table 7 Colorful" w:uiPriority="52"/>
+    <w:lsdException w:name="Grid Table 1 Light Accent 1" w:uiPriority="46"/>
+    <w:lsdException w:name="Grid Table 2 Accent 1" w:uiPriority="47"/>
+    <w:lsdException w:name="Grid Table 3 Accent 1" w:uiPriority="48"/>
+    <w:lsdException w:name="Grid Table 4 Accent 1" w:uiPriority="49"/>
+    <w:lsdException w:name="Grid Table 5 Dark Accent 1" w:uiPriority="50"/>
+    <w:lsdException w:name="Grid Table 6 Colorful Accent 1" w:uiPriority="51"/>
+    <w:lsdException w:name="Grid Table 7 Colorful Accent 1" w:uiPriority="52"/>
+    <w:lsdException w:name="Grid Table 1 Light Accent 2" w:uiPriority="46"/>
+    <w:lsdException w:name="Grid Table 2 Accent 2" w:uiPriority="47"/>
+    <w:lsdException w:name="Grid Table 3 Accent 2" w:uiPriority="48"/>
+    <w:lsdException w:name="Grid Table 4 Accent 2" w:uiPriority="49"/>
+    <w:lsdException w:name="Grid Table 5 Dark Accent 2" w:uiPriority="50"/>
+    <w:lsdException w:name="Grid Table 6 Colorful Accent 2" w:uiPriority="51"/>
+    <w:lsdException w:name="Grid Table 7 Colorful Accent 2" w:uiPriority="52"/>
+    <w:lsdException w:name="Grid Table 1 Light Accent 3" w:uiPriority="46"/>
+    <w:lsdException w:name="Grid Table 2 Accent 3" w:uiPriority="47"/>
+    <w:lsdException w:name="Grid Table 3 Accent 3" w:uiPriority="48"/>
+    <w:lsdException w:name="Grid Table 4 Accent 3" w:uiPriority="49"/>
+    <w:lsdException w:name="Grid Table 5 Dark Accent 3" w:uiPriority="50"/>
+    <w:lsdException w:name="Grid Table 6 Colorful Accent 3" w:uiPriority="51"/>
+    <w:lsdException w:name="Grid Table 7 Colorful Accent 3" w:uiPriority="52"/>
+    <w:lsdException w:name="Grid Table 1 Light Accent 4" w:uiPriority="46"/>
+    <w:lsdException w:name="Grid Table 2 Accent 4" w:uiPriority="47"/>
+    <w:lsdException w:name="Grid Table 3 Accent 4" w:uiPriority="48"/>
+    <w:lsdException w:name="Grid Table 4 Accent 4" w:uiPriority="49"/>
+    <w:lsdException w:name="Grid Table 5 Dark Accent 4" w:uiPriority="50"/>
+    <w:lsdException w:name="Grid Table 6 Colorful Accent 4" w:uiPriority="51"/>
+    <w:lsdException w:name="Grid Table 7 Colorful Accent 4" w:uiPriority="52"/>
+    <w:lsdException w:name="Grid Table 1 Light Accent 5" w:uiPriority="46"/>
+    <w:lsdException w:name="Grid Table 2 Accent 5" w:uiPriority="47"/>
+    <w:lsdException w:name="Grid Table 3 Accent 5" w:uiPriority="48"/>
+    <w:lsdException w:name="Grid Table 4 Accent 5" w:uiPriority="49"/>
+    <w:lsdException w:name="Grid Table 5 Dark Accent 5" w:uiPriority="50"/>
+    <w:lsdException w:name="Grid Table 6 Colorful Accent 5" w:uiPriority="51"/>
+    <w:lsdException w:name="Grid Table 7 Colorful Accent 5" w:uiPriority="52"/>
+    <w:lsdException w:name="Grid Table 1 Light Accent 6" w:uiPriority="46"/>
+    <w:lsdException w:name="Grid Table 2 Accent 6" w:uiPriority="47"/>
+    <w:lsdException w:name="Grid Table 3 Accent 6" w:uiPriority="48"/>
+    <w:lsdException w:name="Grid Table 4 Accent 6" w:uiPriority="49"/>
+    <w:lsdException w:name="Grid Table 5 Dark Accent 6" w:uiPriority="50"/>
+    <w:lsdException w:name="Grid Table 6 Colorful Accent 6" w:uiPriority="51"/>
+    <w:lsdException w:name="Grid Table 7 Colorful Accent 6" w:uiPriority="52"/>
+    <w:lsdException w:name="List Table 1 Light" w:uiPriority="46"/>
+    <w:lsdException w:name="List Table 2" w:uiPriority="47"/>
+    <w:lsdException w:name="List Table 3" w:uiPriority="48"/>
+    <w:lsdException w:name="List Table 4" w:uiPriority="49"/>
+    <w:lsdException w:name="List Table 5 Dark" w:uiPriority="50"/>
+    <w:lsdException w:name="List Table 6 Colorful" w:uiPriority="51"/>
+    <w:lsdException w:name="List Table 7 Colorful" w:uiPriority="52"/>
+    <w:lsdException w:name="List Table 1 Light Accent 1" w:uiPriority="46"/>
+    <w:lsdException w:name="List Table 2 Accent 1" w:uiPriority="47"/>
+    <w:lsdException w:name="List Table 3 Accent 1" w:uiPriority="48"/>
+    <w:lsdException w:name="List Table 4 Accent 1" w:uiPriority="49"/>
+    <w:lsdException w:name="List Table 5 Dark Accent 1" w:uiPriority="50"/>
+    <w:lsdException w:name="List Table 6 Colorful Accent 1" w:uiPriority="51"/>
+    <w:lsdException w:name="List Table 7 Colorful Accent 1" w:uiPriority="52"/>
+    <w:lsdException w:name="List Table 1 Light Accent 2" w:uiPriority="46"/>
+    <w:lsdException w:name="List Table 2 Accent 2" w:uiPriority="47"/>
+    <w:lsdException w:name="List Table 3 Accent 2" w:uiPriority="48"/>
+    <w:lsdException w:name="List Table 4 Accent 2" w:uiPriority="49"/>
+    <w:lsdException w:name="List Table 5 Dark Accent 2" w:uiPriority="50"/>
+    <w:lsdException w:name="List Table 6 Colorful Accent 2" w:uiPriority="51"/>
+    <w:lsdException w:name="List Table 7 Colorful Accent 2" w:uiPriority="52"/>
+    <w:lsdException w:name="List Table 1 Light Accent 3" w:uiPriority="46"/>
+    <w:lsdException w:name="List Table 2 Accent 3" w:uiPriority="47"/>
+    <w:lsdException w:name="List Table 3 Accent 3" w:uiPriority="48"/>
+    <w:lsdException w:name="List Table 4 Accent 3" w:uiPriority="49"/>
+    <w:lsdException w:name="List Table 5 Dark Accent 3" w:uiPriority="50"/>
+    <w:lsdException w:name="List Table 6 Colorful Accent 3" w:uiPriority="51"/>
+    <w:lsdException w:name="List Table 7 Colorful Accent 3" w:uiPriority="52"/>
+    <w:lsdException w:name="List Table 1 Light Accent 4" w:uiPriority="46"/>
+    <w:lsdException w:name="List Table 2 Accent 4" w:uiPriority="47"/>
+    <w:lsdException w:name="List Table 3 Accent 4" w:uiPriority="48"/>
+    <w:lsdException w:name="List Table 4 Accent 4" w:uiPriority="49"/>
+    <w:lsdException w:name="List Table 5 Dark Accent 4" w:uiPriority="50"/>
+    <w:lsdException w:name="List Table 6 Colorful Accent 4" w:uiPriority="51"/>
+    <w:lsdException w:name="List Table 7 Colorful Accent 4" w:uiPriority="52"/>
+    <w:lsdException w:name="List Table 1 Light Accent 5" w:uiPriority="46"/>
+    <w:lsdException w:name="List Table 2 Accent 5" w:uiPriority="47"/>
+    <w:lsdException w:name="List Table 3 Accent 5" w:uiPriority="48"/>
+    <w:lsdException w:name="List Table 4 Accent 5" w:uiPriority="49"/>
+    <w:lsdException w:name="List Table 5 Dark Accent 5" w:uiPriority="50"/>
+    <w:lsdException w:name="List Table 6 Colorful Accent 5" w:uiPriority="51"/>
+    <w:lsdException w:name="List Table 7 Colorful Accent 5" w:uiPriority="52"/>
+    <w:lsdException w:name="List Table 1 Light Accent 6" w:uiPriority="46"/>
+    <w:lsdException w:name="List Table 2 Accent 6" w:uiPriority="47"/>
+    <w:lsdException w:name="List Table 3 Accent 6" w:uiPriority="48"/>
+    <w:lsdException w:name="List Table 4 Accent 6" w:uiPriority="49"/>
+    <w:lsdException w:name="List Table 5 Dark Accent 6" w:uiPriority="50"/>
+    <w:lsdException w:name="List Table 6 Colorful Accent 6" w:uiPriority="51"/>
+    <w:lsdException w:name="List Table 7 Colorful Accent 6" w:uiPriority="52"/>
+    <w:lsdException w:name="Mention" w:semiHidden="1" w:unhideWhenUsed="1"/>
+    <w:lsdException w:name="Smart Hyperlink" w:semiHidden="1" w:unhideWhenUsed="1"/>
+    <w:lsdException w:name="Hashtag" w:semiHidden="1" w:unhideWhenUsed="1"/>
+    <w:lsdException w:name="Unresolved Mention" w:semiHidden="1" w:unhideWhenUsed="1"/>
+    <w:lsdException w:name="Smart Link" w:semiHidden="1" w:unhideWhenUsed="1"/>
+  </w:latentStyles>
+  <w:style w:type="paragraph" w:default="1" w:styleId="Normal">
+    <w:name w:val="Normal"/>
+    <w:qFormat/>
+  </w:style>
+  <w:style w:type="character" w:default="1" w:styleId="DefaultParagraphFont">
+    <w:name w:val="Default Paragraph Font"/>
+    <w:uiPriority w:val="1"/>
+    <w:semiHidden/>
+    <w:unhideWhenUsed/>
+  </w:style>
+  <w:style w:type="table" w:default="1" w:styleId="TableNormal">
+    <w:name w:val="Normal Table"/>
+    <w:uiPriority w:val="99"/>
+    <w:semiHidden/>
+    <w:unhideWhenUsed/>
+    <w:tblPr>
+      <w:tblInd w:w="0" w:type="dxa"/>
+      <w:tblCellMar>
+        <w:top w:w="0" w:type="dxa"/>
+        <w:left w:w="108" w:type="dxa"/>
+        <w:bottom w:w="0" w:type="dxa"/>
+        <w:right w:w="108" w:type="dxa"/>
+      </w:tblCellMar>
+    </w:tblPr>
+  </w:style>
+  <w:style w:type="numbering" w:default="1" w:styleId="NoList">
+    <w:name w:val="No List"/>
+    <w:uiPriority w:val="99"/>
+    <w:semiHidden/>
+    <w:unhideWhenUsed/>
+  </w:style>
+  <w:style w:type="character" w:styleId="PlaceholderText">
+    <w:name w:val="Placeholder Text"/>
+    <w:basedOn w:val="DefaultParagraphFont"/>
+    <w:uiPriority w:val="99"/>
+    <w:semiHidden/>
+    <w:rsid w:val="007C611A"/>
+    <w:rPr>
+      <w:color w:val="666666"/>
+    </w:rPr>
+  </w:style>
+</w:styles>
+</file>
+
+<file path=word/glossary/webSettings.xml><?xml version="1.0" encoding="utf-8"?>
+<w:webSettings xmlns:mc="http://schemas.openxmlformats.org/markup-compatibility/2006" xmlns:r="http://schemas.openxmlformats.org/officeDocument/2006/relationships" xmlns:w="http://schemas.openxmlformats.org/wordprocessingml/2006/main" xmlns:w14="http://schemas.microsoft.com/office/word/2010/wordml" xmlns:w15="http://schemas.microsoft.com/office/word/2012/wordml" xmlns:w16cex="http://schemas.microsoft.com/office/word/2018/wordml/cex" xmlns:w16cid="http://schemas.microsoft.com/office/word/2016/wordml/cid" xmlns:w16="http://schemas.microsoft.com/office/word/2018/wordml" xmlns:w16du="http://schemas.microsoft.com/office/word/2023/wordml/word16du" xmlns:w16sdtdh="http://schemas.microsoft.com/office/word/2020/wordml/sdtdatahash" xmlns:w16sdtfl="http://schemas.microsoft.com/office/word/2024/wordml/sdtformatlock" xmlns:w16se="http://schemas.microsoft.com/office/word/2015/wordml/symex" mc:Ignorable="w14 w15 w16se w16cid w16 w16cex w16sdtdh w16sdtfl w16du">
+  <w:optimizeForBrowser/>
+  <w:allowPNG/>
+</w:webSettings>
 </file>
 
 <file path=word/theme/theme1.xml><?xml version="1.0" encoding="utf-8"?>
@@ -6606,7 +9304,54 @@
 </file>
 
 <file path=customXml/item2.xml><?xml version="1.0" encoding="utf-8"?>
-<b:Sources xmlns:b="http://schemas.openxmlformats.org/officeDocument/2006/bibliography" xmlns="http://schemas.openxmlformats.org/officeDocument/2006/bibliography" SelectedStyle="\HarvardAnglia2008OfficeOnline.xsl" StyleName="Harvard - Anglia" Version="2008"/>
+<b:Sources xmlns:b="http://schemas.openxmlformats.org/officeDocument/2006/bibliography" xmlns="http://schemas.openxmlformats.org/officeDocument/2006/bibliography" SelectedStyle="\HarvardAnglia2008OfficeOnline.xsl" StyleName="Harvard - Anglia" Version="2008">
+  <b:Source>
+    <b:Tag>Gon20</b:Tag>
+    <b:SourceType>JournalArticle</b:SourceType>
+    <b:Guid>{0A3C65B7-702F-4E65-984C-DF112D7ABE97}</b:Guid>
+    <b:Author>
+      <b:Author>
+        <b:NameList>
+          <b:Person>
+            <b:Last>Gong</b:Last>
+            <b:First>Y.,</b:First>
+            <b:Middle>Yang, J. and Shi, X.</b:Middle>
+          </b:Person>
+        </b:NameList>
+      </b:Author>
+    </b:Author>
+    <b:Title>Towards a comprehensive understanding of digital transformation in government: Analysis of flexibility and enterprise architecture. </b:Title>
+    <b:JournalName>Government information quarterly</b:JournalName>
+    <b:Year>2020</b:Year>
+    <b:Pages>101487</b:Pages>
+    <b:Volume>37</b:Volume>
+    <b:Issue>3</b:Issue>
+    <b:RefOrder>1</b:RefOrder>
+  </b:Source>
+  <b:Source>
+    <b:Tag>Mer19</b:Tag>
+    <b:SourceType>JournalArticle</b:SourceType>
+    <b:Guid>{A903212D-CFC7-448D-9C51-874BDDD4EA7B}</b:Guid>
+    <b:Author>
+      <b:Author>
+        <b:NameList>
+          <b:Person>
+            <b:Last>Mergel</b:Last>
+            <b:First>I.,</b:First>
+            <b:Middle>Edelmann, N. and Haug, N.</b:Middle>
+          </b:Person>
+        </b:NameList>
+      </b:Author>
+    </b:Author>
+    <b:Title>Defining digital transformation: Results from expert interviews. </b:Title>
+    <b:JournalName>Government information quarterly</b:JournalName>
+    <b:Year>2019</b:Year>
+    <b:Pages>1101385</b:Pages>
+    <b:Volume>36</b:Volume>
+    <b:Issue>4</b:Issue>
+    <b:RefOrder>2</b:RefOrder>
+  </b:Source>
+</b:Sources>
 </file>
 
 <file path=customXml/itemProps1.xml><?xml version="1.0" encoding="utf-8"?>
@@ -6618,7 +9363,7 @@
 </file>
 
 <file path=customXml/itemProps2.xml><?xml version="1.0" encoding="utf-8"?>
-<ds:datastoreItem xmlns:ds="http://schemas.openxmlformats.org/officeDocument/2006/customXml" ds:itemID="{3680C1C8-C0F3-487B-A75D-9253521623E2}">
+<ds:datastoreItem xmlns:ds="http://schemas.openxmlformats.org/officeDocument/2006/customXml" ds:itemID="{2EE9A4CB-AD61-4AE6-8D1C-055A1E5F194C}">
   <ds:schemaRefs>
     <ds:schemaRef ds:uri="http://schemas.openxmlformats.org/officeDocument/2006/bibliography"/>
   </ds:schemaRefs>

</xml_diff>

<commit_message>
Added Scope on behalf of Keletso
Co-Authored-By: Keletso <261006876+Kelsey-tech@users.noreply.github.com>
</commit_message>
<xml_diff>
--- a/Docs/PED/PED v1.4.docx
+++ b/Docs/PED/PED v1.4.docx
@@ -25,7 +25,7 @@
             <mc:AlternateContent>
               <mc:Choice Requires="wps">
                 <w:drawing>
-                  <wp:anchor distT="0" distB="0" distL="182880" distR="182880" simplePos="0" relativeHeight="251660288" behindDoc="0" locked="0" layoutInCell="1" allowOverlap="1" wp14:anchorId="66DA0E2F" wp14:editId="2248BC73">
+                  <wp:anchor distT="0" distB="0" distL="182880" distR="182880" simplePos="0" relativeHeight="251658241" behindDoc="0" locked="0" layoutInCell="1" allowOverlap="1" wp14:anchorId="66DA0E2F" wp14:editId="2248BC73">
                     <wp:simplePos x="0" y="0"/>
                     <wp:positionH relativeFrom="margin">
                       <wp:align>center</wp:align>
@@ -172,6 +172,7 @@
                                     <w:dataBinding w:prefixMappings="xmlns:ns0='http://purl.org/dc/elements/1.1/' xmlns:ns1='http://schemas.openxmlformats.org/package/2006/metadata/core-properties' " w:xpath="/ns1:coreProperties[1]/ns0:creator[1]" w:storeItemID="{6C3C8BC8-F283-45AE-878A-BAB7291924A1}"/>
                                     <w:text/>
                                   </w:sdtPr>
+                                  <w:sdtEndPr/>
                                   <w:sdtContent>
                                     <w:r>
                                       <w:rPr>
@@ -211,7 +212,7 @@
                     <v:stroke joinstyle="miter"/>
                     <v:path gradientshapeok="t" o:connecttype="rect"/>
                   </v:shapetype>
-                  <v:shape id="Text Box 131" o:spid="_x0000_s1026" type="#_x0000_t202" style="position:absolute;margin-left:0;margin-top:460.2pt;width:388pt;height:529.2pt;z-index:251660288;visibility:visible;mso-wrap-style:square;mso-width-percent:0;mso-height-percent:350;mso-wrap-distance-left:14.4pt;mso-wrap-distance-top:0;mso-wrap-distance-right:14.4pt;mso-wrap-distance-bottom:0;mso-position-horizontal:center;mso-position-horizontal-relative:margin;mso-position-vertical:absolute;mso-position-vertical-relative:page;mso-width-percent:0;mso-height-percent:350;mso-width-relative:margin;mso-height-relative:page;v-text-anchor:middle" o:gfxdata="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" filled="f" stroked="f" strokeweight=".5pt">
+                  <v:shape id="Text Box 131" o:spid="_x0000_s1026" type="#_x0000_t202" style="position:absolute;margin-left:0;margin-top:460.2pt;width:388pt;height:529.2pt;z-index:251658241;visibility:visible;mso-wrap-style:square;mso-width-percent:0;mso-height-percent:350;mso-wrap-distance-left:14.4pt;mso-wrap-distance-top:0;mso-wrap-distance-right:14.4pt;mso-wrap-distance-bottom:0;mso-position-horizontal:center;mso-position-horizontal-relative:margin;mso-position-vertical:absolute;mso-position-vertical-relative:page;mso-width-percent:0;mso-height-percent:350;mso-width-relative:margin;mso-height-relative:page;v-text-anchor:middle" o:gfxdata="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" filled="f" stroked="f" strokeweight=".5pt">
                     <v:textbox style="mso-fit-shape-to-text:t" inset="0,0,0,0">
                       <w:txbxContent>
                         <w:p>
@@ -314,6 +315,7 @@
                               <w:dataBinding w:prefixMappings="xmlns:ns0='http://purl.org/dc/elements/1.1/' xmlns:ns1='http://schemas.openxmlformats.org/package/2006/metadata/core-properties' " w:xpath="/ns1:coreProperties[1]/ns0:creator[1]" w:storeItemID="{6C3C8BC8-F283-45AE-878A-BAB7291924A1}"/>
                               <w:text/>
                             </w:sdtPr>
+                            <w:sdtEndPr/>
                             <w:sdtContent>
                               <w:r>
                                 <w:rPr>
@@ -343,7 +345,7 @@
             <mc:AlternateContent>
               <mc:Choice Requires="wps">
                 <w:drawing>
-                  <wp:anchor distT="0" distB="0" distL="114300" distR="114300" simplePos="0" relativeHeight="251659264" behindDoc="0" locked="0" layoutInCell="1" allowOverlap="1" wp14:anchorId="17817584" wp14:editId="5C860040">
+                  <wp:anchor distT="0" distB="0" distL="114300" distR="114300" simplePos="0" relativeHeight="251658240" behindDoc="0" locked="0" layoutInCell="1" allowOverlap="1" wp14:anchorId="17817584" wp14:editId="5C860040">
                     <wp:simplePos x="0" y="0"/>
                     <wp:positionH relativeFrom="margin">
                       <wp:align>right</wp:align>
@@ -466,7 +468,7 @@
               </mc:Choice>
               <mc:Fallback>
                 <w:pict>
-                  <v:rect w14:anchorId="17817584" id="Rectangle 132" o:spid="_x0000_s1027" style="position:absolute;margin-left:-4.4pt;margin-top:0;width:46.8pt;height:77.75pt;z-index:251659264;visibility:visible;mso-wrap-style:square;mso-width-percent:76;mso-height-percent:98;mso-top-percent:23;mso-wrap-distance-left:9pt;mso-wrap-distance-top:0;mso-wrap-distance-right:9pt;mso-wrap-distance-bottom:0;mso-position-horizontal:right;mso-position-horizontal-relative:margin;mso-position-vertical-relative:page;mso-width-percent:76;mso-height-percent:98;mso-top-percent:23;mso-width-relative:page;mso-height-relative:page;v-text-anchor:bottom" o:gfxdata="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" fillcolor="#156082 [3204]" stroked="f" strokeweight="1pt">
+                  <v:rect w14:anchorId="17817584" id="Rectangle 132" o:spid="_x0000_s1027" style="position:absolute;margin-left:-4.4pt;margin-top:0;width:46.8pt;height:77.75pt;z-index:251658240;visibility:visible;mso-wrap-style:square;mso-width-percent:76;mso-height-percent:98;mso-top-percent:23;mso-wrap-distance-left:9pt;mso-wrap-distance-top:0;mso-wrap-distance-right:9pt;mso-wrap-distance-bottom:0;mso-position-horizontal:right;mso-position-horizontal-relative:margin;mso-position-vertical-relative:page;mso-width-percent:76;mso-height-percent:98;mso-top-percent:23;mso-width-relative:page;mso-height-relative:page;v-text-anchor:bottom" o:gfxdata="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" fillcolor="#156082 [3204]" stroked="f" strokeweight="1pt">
                     <o:lock v:ext="edit" aspectratio="t"/>
                     <v:textbox inset="3.6pt,,3.6pt">
                       <w:txbxContent>
@@ -547,6 +549,7 @@
           <w:b/>
           <w:bCs/>
           <w:noProof/>
+          <w:u w:val="none"/>
         </w:rPr>
       </w:sdtEndPr>
       <w:sdtContent>
@@ -870,7 +873,21 @@
                 <w:rStyle w:val="Hyperlink"/>
                 <w:noProof/>
               </w:rPr>
-              <w:t>Scope</w:t>
+              <w:t>S</w:t>
+            </w:r>
+            <w:r>
+              <w:rPr>
+                <w:rStyle w:val="Hyperlink"/>
+                <w:noProof/>
+              </w:rPr>
+              <w:t>c</w:t>
+            </w:r>
+            <w:r>
+              <w:rPr>
+                <w:rStyle w:val="Hyperlink"/>
+                <w:noProof/>
+              </w:rPr>
+              <w:t>ope</w:t>
             </w:r>
             <w:r>
               <w:rPr>
@@ -2233,13 +2250,8 @@
       <w:bookmarkEnd w:id="0"/>
     </w:p>
     <w:p>
-      <w:proofErr w:type="spellStart"/>
       <w:r>
-        <w:t>CivicConnect</w:t>
-      </w:r>
-      <w:proofErr w:type="spellEnd"/>
-      <w:r>
-        <w:t xml:space="preserve"> currently manages community service</w:t>
+        <w:t>CivicConnect currently manages community service</w:t>
       </w:r>
       <w:r>
         <w:t xml:space="preserve"> request</w:t>
@@ -2317,6 +2329,7 @@
           <w:id w:val="-977990515"/>
           <w:citation/>
         </w:sdtPr>
+        <w:sdtEndPr/>
         <w:sdtContent>
           <w:r>
             <w:fldChar w:fldCharType="begin"/>
@@ -2349,6 +2362,7 @@
           <w:id w:val="-2132241184"/>
           <w:citation/>
         </w:sdtPr>
+        <w:sdtEndPr/>
         <w:sdtContent>
           <w:r>
             <w:fldChar w:fldCharType="begin"/>
@@ -2385,16 +2399,7 @@
         <w:t>Thus,</w:t>
       </w:r>
       <w:r>
-        <w:t xml:space="preserve"> the</w:t>
-      </w:r>
-      <w:r>
-        <w:t xml:space="preserve"> underlying business need</w:t>
-      </w:r>
-      <w:r>
-        <w:t xml:space="preserve"> is</w:t>
-      </w:r>
-      <w:r>
-        <w:t xml:space="preserve"> not merely "a website to log requests," but a </w:t>
+        <w:t xml:space="preserve"> the underlying business need is not merely "a website to log requests," but a </w:t>
       </w:r>
       <w:r>
         <w:t>single, controlled record of the request lifecycle</w:t>
@@ -2414,11 +2419,9 @@
         <w:pStyle w:val="Heading1"/>
       </w:pPr>
       <w:bookmarkStart w:id="1" w:name="_Toc239871304"/>
-      <w:proofErr w:type="spellStart"/>
       <w:r>
         <w:t>CivicConnect</w:t>
       </w:r>
-      <w:proofErr w:type="spellEnd"/>
       <w:r>
         <w:t>:</w:t>
       </w:r>
@@ -2556,11 +2559,7 @@
           </w:tcPr>
           <w:p>
             <w:r>
-              <w:t xml:space="preserve">Community/staff member who logs a request (fault, equipment, security, IT, maintenance, lost property…). </w:t>
-            </w:r>
-            <w:r>
-              <w:lastRenderedPageBreak/>
-              <w:t>Primary user for these FR</w:t>
+              <w:t>Community/staff member who logs a request (fault, equipment, security, IT, maintenance, lost property…). Primary user for these FR</w:t>
             </w:r>
             <w:r>
               <w:t>’</w:t>
@@ -2576,7 +2575,6 @@
           </w:tcPr>
           <w:p>
             <w:r>
-              <w:lastRenderedPageBreak/>
               <w:t>Easy submit; receipt; status; history; feedback.</w:t>
             </w:r>
           </w:p>
@@ -2609,6 +2607,7 @@
           </w:tcPr>
           <w:p>
             <w:r>
+              <w:lastRenderedPageBreak/>
               <w:t>ST-2</w:t>
             </w:r>
           </w:p>
@@ -2879,7 +2878,6 @@
       </w:pPr>
       <w:bookmarkStart w:id="3" w:name="_Toc239871306"/>
       <w:r>
-        <w:lastRenderedPageBreak/>
         <w:t>Stakeholder Conflicts</w:t>
       </w:r>
       <w:bookmarkEnd w:id="3"/>
@@ -3027,6 +3025,7 @@
           </w:tcPr>
           <w:p>
             <w:r>
+              <w:lastRenderedPageBreak/>
               <w:t>C-2</w:t>
             </w:r>
           </w:p>
@@ -3197,16 +3196,345 @@
       </w:r>
       <w:bookmarkEnd w:id="4"/>
     </w:p>
+    <w:p>
+      <w:r>
+        <w:t xml:space="preserve">The baseline scope defines what CivicConnect will deliver as part of the M1 requirements baseline, what is excluded from this phase, and what has been left for a later milestone. This boundary helps guide the requirements, acceptance criteria and architecture work that follows. It does not change the CivicConnect </w:t>
+      </w:r>
+      <w:r>
+        <w:t>scenario but</w:t>
+      </w:r>
+      <w:r>
+        <w:t xml:space="preserve"> instead sets a clear point at which the M1 work ends.</w:t>
+      </w:r>
+    </w:p>
+    <w:p>
+      <w:pPr>
+        <w:pStyle w:val="Heading2"/>
+        <w:rPr>
+          <w:sz w:val="27"/>
+        </w:rPr>
+      </w:pPr>
+      <w:bookmarkStart w:id="5" w:name="_Toc239881924"/>
+      <w:r>
+        <w:t>In-Scope (M1 Baseline)</w:t>
+      </w:r>
+      <w:bookmarkEnd w:id="5"/>
+    </w:p>
+    <w:p>
+      <w:r>
+        <w:t>The M1 baseline includes the Requester (ST-1) request lifecycle. This covers submitting a new request (FR-001), selecting a category from a controlled list (FR-002), viewing the status of a request (FR-003), viewing previous requests (FR-004), searching and filtering request history (FR-005), and receiving feedback in the application when the status of a request changes (FR-007).</w:t>
+      </w:r>
+    </w:p>
+    <w:p>
+      <w:r>
+        <w:t>The category list will be controlled rather than allowing requesters to enter their own categories as free text. These categories will be maintained as reference data and will also support reporting by Management.</w:t>
+      </w:r>
+    </w:p>
+    <w:p>
+      <w:r>
+        <w:t>The requester will have a read-only view of the request status. Status changes will only be made by Service Staff. This helps keep the reported request information accurate and supports the resolution of conflict C-1.</w:t>
+      </w:r>
+    </w:p>
+    <w:p>
+      <w:r>
+        <w:lastRenderedPageBreak/>
+        <w:t>M1 also includes the main engineering baseline documents needed for the later stages of the project. These include the stakeholder analysis, technical constraint analysis, initial architecture direction and Engineering Decision Log.</w:t>
+      </w:r>
+    </w:p>
+    <w:p>
+      <w:pPr>
+        <w:pStyle w:val="Heading2"/>
+      </w:pPr>
+      <w:bookmarkStart w:id="6" w:name="_Toc239881925"/>
+      <w:r>
+        <w:t>Out-of-Scope (M1)</w:t>
+      </w:r>
+      <w:bookmarkEnd w:id="6"/>
+    </w:p>
+    <w:p>
+      <w:r>
+        <w:t>M1 does not include the final selection of the technology stack, detailed software architecture, database schema design, user interface implementation, API implementation, design-pattern implementation, CI pipeline implementation or production deployment. These activities are planned for M2 and later milestones. M1 only provides the initial direction for these areas.</w:t>
+      </w:r>
+    </w:p>
+    <w:p>
+      <w:r>
+        <w:t>Detailed functional requirements and acceptance criteria for Service Staff (ST-2), Management (ST-3) and Administrator (ST-4) are also outside the M1 scope. Their needs and responsibilities are considered during stakeholder analysis, but their specific workflows will be developed into detailed requirements at a later stage.</w:t>
+      </w:r>
+    </w:p>
+    <w:p>
+      <w:r>
+        <w:t>Authentication and detailed authorisation implementation are also excluded from M1. The requirement that a requester must not be able to access another requester's data is included in the baseline through NFR-003. However, the specific technical approach for implementing this will be decided in M2, as recorded in D-004.</w:t>
+      </w:r>
+    </w:p>
+    <w:p>
+      <w:pPr>
+        <w:pStyle w:val="Heading2"/>
+      </w:pPr>
+      <w:bookmarkStart w:id="7" w:name="_Toc239881926"/>
+      <w:r>
+        <w:t>Deferred / Future Scope</w:t>
+      </w:r>
+      <w:bookmarkEnd w:id="7"/>
+    </w:p>
+    <w:p>
+      <w:r>
+        <w:t>Email and SMS notifications are not included in the M1 baseline. In-app status feedback is included through FR-007, while additional notification channels will be considered later. This will depend on whether the ongoing costs can be supported within the Sponsor's (ST-5) constraints, particularly conflict C-4.</w:t>
+      </w:r>
+    </w:p>
+    <w:p>
+      <w:r>
+        <w:t>Full support for attachments under FR-006 is also deferred. Details such as permitted file types, file size limits and how files will be stored still need to be confirmed. Since these details are not yet finalised, the requirement remains at the Could priority level until it can be properly defined.</w:t>
+      </w:r>
+    </w:p>
+    <w:p>
+      <w:r>
+        <w:t>A complete Role-Based Access Control model for the Administrator (ST-4) is also deferred. The need for administrator access control has been identified, but the specific roles, permissions and management workflows still need to be defined in a later milestone.</w:t>
+      </w:r>
+    </w:p>
+    <w:tbl>
+      <w:tblPr>
+        <w:tblStyle w:val="TableGrid"/>
+        <w:tblW w:w="0" w:type="auto"/>
+        <w:jc w:val="center"/>
+        <w:tblLook w:val="04A0" w:firstRow="1" w:lastRow="0" w:firstColumn="1" w:lastColumn="0" w:noHBand="0" w:noVBand="1"/>
+      </w:tblPr>
+      <w:tblGrid>
+        <w:gridCol w:w="2200"/>
+        <w:gridCol w:w="3608"/>
+        <w:gridCol w:w="3208"/>
+      </w:tblGrid>
+      <w:tr>
+        <w:trPr>
+          <w:cantSplit/>
+          <w:tblHeader/>
+          <w:jc w:val="center"/>
+        </w:trPr>
+        <w:tc>
+          <w:tcPr>
+            <w:tcW w:w="2200" w:type="dxa"/>
+            <w:shd w:val="clear" w:color="auto" w:fill="83CAEB" w:themeFill="accent1" w:themeFillTint="66"/>
+            <w:vAlign w:val="center"/>
+          </w:tcPr>
+          <w:p>
+            <w:pPr>
+              <w:spacing w:before="60" w:after="60" w:line="240" w:lineRule="auto"/>
+            </w:pPr>
+            <w:r>
+              <w:rPr>
+                <w:b/>
+              </w:rPr>
+              <w:lastRenderedPageBreak/>
+              <w:t>Boundary</w:t>
+            </w:r>
+          </w:p>
+        </w:tc>
+        <w:tc>
+          <w:tcPr>
+            <w:tcW w:w="3608" w:type="dxa"/>
+            <w:shd w:val="clear" w:color="auto" w:fill="83CAEB" w:themeFill="accent1" w:themeFillTint="66"/>
+            <w:vAlign w:val="center"/>
+          </w:tcPr>
+          <w:p>
+            <w:pPr>
+              <w:spacing w:before="60" w:after="60" w:line="240" w:lineRule="auto"/>
+            </w:pPr>
+            <w:r>
+              <w:rPr>
+                <w:b/>
+              </w:rPr>
+              <w:t>Represents</w:t>
+            </w:r>
+          </w:p>
+        </w:tc>
+        <w:tc>
+          <w:tcPr>
+            <w:tcW w:w="3208" w:type="dxa"/>
+            <w:shd w:val="clear" w:color="auto" w:fill="83CAEB" w:themeFill="accent1" w:themeFillTint="66"/>
+            <w:vAlign w:val="center"/>
+          </w:tcPr>
+          <w:p>
+            <w:pPr>
+              <w:spacing w:before="60" w:after="60" w:line="240" w:lineRule="auto"/>
+            </w:pPr>
+            <w:r>
+              <w:rPr>
+                <w:b/>
+              </w:rPr>
+              <w:t>Controls</w:t>
+            </w:r>
+          </w:p>
+        </w:tc>
+      </w:tr>
+      <w:tr>
+        <w:trPr>
+          <w:cantSplit/>
+          <w:jc w:val="center"/>
+        </w:trPr>
+        <w:tc>
+          <w:tcPr>
+            <w:tcW w:w="2200" w:type="dxa"/>
+            <w:vAlign w:val="center"/>
+          </w:tcPr>
+          <w:p>
+            <w:pPr>
+              <w:spacing w:before="60" w:after="60" w:line="240" w:lineRule="auto"/>
+            </w:pPr>
+            <w:r>
+              <w:t>In-scope</w:t>
+            </w:r>
+          </w:p>
+        </w:tc>
+        <w:tc>
+          <w:tcPr>
+            <w:tcW w:w="3608" w:type="dxa"/>
+            <w:vAlign w:val="center"/>
+          </w:tcPr>
+          <w:p>
+            <w:pPr>
+              <w:spacing w:before="60" w:after="60" w:line="240" w:lineRule="auto"/>
+            </w:pPr>
+            <w:r>
+              <w:t>FR-001–FR-005, FR-007 and their acceptance criteria; controlled category list; read-only status model.</w:t>
+            </w:r>
+          </w:p>
+        </w:tc>
+        <w:tc>
+          <w:tcPr>
+            <w:tcW w:w="3208" w:type="dxa"/>
+            <w:vAlign w:val="center"/>
+          </w:tcPr>
+          <w:p>
+            <w:pPr>
+              <w:spacing w:before="60" w:after="60" w:line="240" w:lineRule="auto"/>
+            </w:pPr>
+            <w:r>
+              <w:t>What M1 commits to build and what later evidence (design, test, release) must trace to.</w:t>
+            </w:r>
+          </w:p>
+        </w:tc>
+      </w:tr>
+      <w:tr>
+        <w:trPr>
+          <w:cantSplit/>
+          <w:jc w:val="center"/>
+        </w:trPr>
+        <w:tc>
+          <w:tcPr>
+            <w:tcW w:w="2200" w:type="dxa"/>
+            <w:vAlign w:val="center"/>
+          </w:tcPr>
+          <w:p>
+            <w:pPr>
+              <w:spacing w:before="60" w:after="60" w:line="240" w:lineRule="auto"/>
+            </w:pPr>
+            <w:r>
+              <w:t>Out-of-scope</w:t>
+            </w:r>
+          </w:p>
+        </w:tc>
+        <w:tc>
+          <w:tcPr>
+            <w:tcW w:w="3608" w:type="dxa"/>
+            <w:vAlign w:val="center"/>
+          </w:tcPr>
+          <w:p>
+            <w:pPr>
+              <w:spacing w:before="60" w:after="60" w:line="240" w:lineRule="auto"/>
+            </w:pPr>
+            <w:r>
+              <w:t>Architecture, technology, schema, UI/API/CI implementation; ST-2/ST-3/ST-4 detailed FRs; authentication mechanism.</w:t>
+            </w:r>
+          </w:p>
+        </w:tc>
+        <w:tc>
+          <w:tcPr>
+            <w:tcW w:w="3208" w:type="dxa"/>
+            <w:vAlign w:val="center"/>
+          </w:tcPr>
+          <w:p>
+            <w:pPr>
+              <w:spacing w:before="60" w:after="60" w:line="240" w:lineRule="auto"/>
+            </w:pPr>
+            <w:r>
+              <w:t>What is not assessed as an M1 deliverable and must not be prematurely implemented.</w:t>
+            </w:r>
+          </w:p>
+        </w:tc>
+      </w:tr>
+      <w:tr>
+        <w:trPr>
+          <w:cantSplit/>
+          <w:jc w:val="center"/>
+        </w:trPr>
+        <w:tc>
+          <w:tcPr>
+            <w:tcW w:w="2200" w:type="dxa"/>
+            <w:vAlign w:val="center"/>
+          </w:tcPr>
+          <w:p>
+            <w:pPr>
+              <w:spacing w:before="60" w:after="60" w:line="240" w:lineRule="auto"/>
+            </w:pPr>
+            <w:r>
+              <w:t>Deferred</w:t>
+            </w:r>
+          </w:p>
+        </w:tc>
+        <w:tc>
+          <w:tcPr>
+            <w:tcW w:w="3608" w:type="dxa"/>
+            <w:vAlign w:val="center"/>
+          </w:tcPr>
+          <w:p>
+            <w:pPr>
+              <w:spacing w:before="60" w:after="60" w:line="240" w:lineRule="auto"/>
+            </w:pPr>
+            <w:r>
+              <w:t>Notification channels beyond in-app feedback; FR-006 attachment handling; full Administrator RBAC.</w:t>
+            </w:r>
+          </w:p>
+        </w:tc>
+        <w:tc>
+          <w:tcPr>
+            <w:tcW w:w="3208" w:type="dxa"/>
+            <w:vAlign w:val="center"/>
+          </w:tcPr>
+          <w:p>
+            <w:pPr>
+              <w:spacing w:before="60" w:after="60" w:line="240" w:lineRule="auto"/>
+            </w:pPr>
+            <w:r>
+              <w:t>What is preserved as a future option pending evidence, not silently dropped.</w:t>
+            </w:r>
+          </w:p>
+        </w:tc>
+      </w:tr>
+    </w:tbl>
     <w:p/>
+    <w:p>
+      <w:pPr>
+        <w:pStyle w:val="Heading2"/>
+      </w:pPr>
+      <w:bookmarkStart w:id="8" w:name="_Toc239881927"/>
+      <w:r>
+        <w:t>Defence of a Deliberate Deferment</w:t>
+      </w:r>
+      <w:bookmarkEnd w:id="8"/>
+    </w:p>
+    <w:p>
+      <w:r>
+        <w:t>The team deliberately defers email/SMS notifications beyond the baselined in-app feedback (FR-007). Conflict C-4 identifies a direct tension between the Requester's preference for rich, multi-channel notifications and the Sponsor's (ST-5) need for a sustainable cost/scope footprint. Committing to email/SMS at M1 would introduce third-party integration, delivery, and privacy considerations before the team has evidence of actual demand or budget approval. In-app feedback satisfies the Must-priority need for the requester to know a request's outcome (AC-007.1, AC-007.2) without that added risk. This deferment is recorded as a formal decision, with owner and trigger for re-scoping, in the Engineering Decision Log rather than left as an implicit gap.</w:t>
+      </w:r>
+    </w:p>
     <w:p>
       <w:pPr>
         <w:pStyle w:val="Heading1"/>
       </w:pPr>
-      <w:bookmarkStart w:id="5" w:name="_Toc239871308"/>
+      <w:bookmarkStart w:id="9" w:name="_Toc239871308"/>
       <w:r>
         <w:t>Requester Functional Requirements</w:t>
       </w:r>
-      <w:bookmarkEnd w:id="5"/>
+      <w:bookmarkEnd w:id="9"/>
     </w:p>
     <w:tbl>
       <w:tblPr>
@@ -3302,11 +3630,7 @@
           </w:tcPr>
           <w:p>
             <w:r>
-              <w:t xml:space="preserve">Submit a new service request with </w:t>
-            </w:r>
-            <w:r>
-              <w:lastRenderedPageBreak/>
-              <w:t>the information needed to action it.</w:t>
+              <w:t>Submit a new service request with the information needed to action it.</w:t>
             </w:r>
           </w:p>
         </w:tc>
@@ -3316,7 +3640,6 @@
           </w:tcPr>
           <w:p>
             <w:r>
-              <w:lastRenderedPageBreak/>
               <w:t>ST-1</w:t>
             </w:r>
           </w:p>
@@ -3343,11 +3666,7 @@
               <w:t>, etc</w:t>
             </w:r>
             <w:r>
-              <w:t xml:space="preserve">), when submitted, then saved with a </w:t>
-            </w:r>
-            <w:r>
-              <w:lastRenderedPageBreak/>
-              <w:t xml:space="preserve">unique reference ID </w:t>
+              <w:t xml:space="preserve">), when submitted, then saved with a unique reference ID </w:t>
             </w:r>
             <w:r>
               <w:t>with</w:t>
@@ -3569,7 +3888,6 @@
           </w:p>
           <w:p>
             <w:r>
-              <w:lastRenderedPageBreak/>
               <w:t>AC-004.2 Given requester</w:t>
             </w:r>
             <w:r>
@@ -3588,7 +3906,6 @@
           </w:tcPr>
           <w:p>
             <w:r>
-              <w:lastRenderedPageBreak/>
               <w:t>FR-005</w:t>
             </w:r>
           </w:p>
@@ -3693,7 +4010,11 @@
           </w:tcPr>
           <w:p>
             <w:r>
-              <w:t>AC-006.1 Given an allowed type/size, when attached, then stored and linked; a disallowed type/size is rejected with a message. (File-handling risk may be deferred.)</w:t>
+              <w:t xml:space="preserve">AC-006.1 Given an allowed type/size, when attached, then stored and linked; a disallowed type/size is rejected with a </w:t>
+            </w:r>
+            <w:r>
+              <w:lastRenderedPageBreak/>
+              <w:t>message. (File-handling risk may be deferred.)</w:t>
             </w:r>
           </w:p>
         </w:tc>
@@ -3705,6 +4026,7 @@
           </w:tcPr>
           <w:p>
             <w:r>
+              <w:lastRenderedPageBreak/>
               <w:t>FR-007</w:t>
             </w:r>
           </w:p>
@@ -3761,11 +4083,11 @@
       <w:pPr>
         <w:pStyle w:val="Heading2"/>
       </w:pPr>
-      <w:bookmarkStart w:id="6" w:name="_Toc239871309"/>
+      <w:bookmarkStart w:id="10" w:name="_Toc239871309"/>
       <w:r>
         <w:t>Requester NFR candidates and open items</w:t>
       </w:r>
-      <w:bookmarkEnd w:id="6"/>
+      <w:bookmarkEnd w:id="10"/>
     </w:p>
     <w:p>
       <w:pPr>
@@ -3841,7 +4163,7 @@
       <w:pPr>
         <w:pStyle w:val="Heading2"/>
       </w:pPr>
-      <w:bookmarkStart w:id="7" w:name="_Toc239871310"/>
+      <w:bookmarkStart w:id="11" w:name="_Toc239871310"/>
       <w:r>
         <w:t xml:space="preserve">Confirm </w:t>
       </w:r>
@@ -3851,7 +4173,7 @@
       <w:r>
         <w:t>:</w:t>
       </w:r>
-      <w:bookmarkEnd w:id="7"/>
+      <w:bookmarkEnd w:id="11"/>
     </w:p>
     <w:p>
       <w:pPr>
@@ -3876,7 +4198,6 @@
         <w:spacing w:before="60" w:after="60" w:line="240" w:lineRule="auto"/>
       </w:pPr>
       <w:r>
-        <w:lastRenderedPageBreak/>
         <w:t>Confirm the controlled category list.</w:t>
       </w:r>
     </w:p>
@@ -3900,8 +4221,8 @@
       <w:pPr>
         <w:pStyle w:val="Heading1"/>
       </w:pPr>
-      <w:bookmarkStart w:id="8" w:name="_Hlk239779181"/>
-      <w:bookmarkStart w:id="9" w:name="_Toc239871311"/>
+      <w:bookmarkStart w:id="12" w:name="_Toc239871311"/>
+      <w:bookmarkStart w:id="13" w:name="_Hlk239779181"/>
       <w:r>
         <w:t>CivicConnect</w:t>
       </w:r>
@@ -3911,7 +4232,7 @@
       <w:r>
         <w:t xml:space="preserve"> Requirements Traceability Matrix (RTM)</w:t>
       </w:r>
-      <w:bookmarkEnd w:id="9"/>
+      <w:bookmarkEnd w:id="12"/>
     </w:p>
     <w:tbl>
       <w:tblPr>
@@ -4091,7 +4412,11 @@
           </w:tcPr>
           <w:p>
             <w:r>
-              <w:t>Categorise the request from a controlled category list (not free text).</w:t>
+              <w:t xml:space="preserve">Categorise the request from a </w:t>
+            </w:r>
+            <w:r>
+              <w:lastRenderedPageBreak/>
+              <w:t>controlled category list (not free text).</w:t>
             </w:r>
           </w:p>
         </w:tc>
@@ -4101,6 +4426,7 @@
           </w:tcPr>
           <w:p>
             <w:r>
+              <w:lastRenderedPageBreak/>
               <w:t>AC-002.1; AC-002.2</w:t>
             </w:r>
           </w:p>
@@ -4319,7 +4645,6 @@
           </w:tcPr>
           <w:p>
             <w:r>
-              <w:lastRenderedPageBreak/>
               <w:t>FR-006</w:t>
             </w:r>
           </w:p>
@@ -4470,7 +4795,11 @@
               <w:t>5</w:t>
             </w:r>
             <w:r>
-              <w:t xml:space="preserve"> steps </w:t>
+              <w:t xml:space="preserve"> </w:t>
+            </w:r>
+            <w:r>
+              <w:lastRenderedPageBreak/>
+              <w:t xml:space="preserve">steps </w:t>
             </w:r>
             <w:r>
               <w:t xml:space="preserve">and </w:t>
@@ -4492,7 +4821,12 @@
           </w:tcPr>
           <w:p>
             <w:r>
-              <w:t>Submission completes in ≤ 5 steps (enter info → select category → complete required fields → submit → confirmation) and ≤ 5 min, verified in usability testing.</w:t>
+              <w:lastRenderedPageBreak/>
+              <w:t xml:space="preserve">Submission completes in ≤ 5 steps (enter info → </w:t>
+            </w:r>
+            <w:r>
+              <w:lastRenderedPageBreak/>
+              <w:t>select category → complete required fields → submit → confirmation) and ≤ 5 min, verified in usability testing.</w:t>
             </w:r>
           </w:p>
         </w:tc>
@@ -4502,6 +4836,7 @@
           </w:tcPr>
           <w:p>
             <w:r>
+              <w:lastRenderedPageBreak/>
               <w:t>Should</w:t>
             </w:r>
           </w:p>
@@ -4524,7 +4859,6 @@
           </w:tcPr>
           <w:p>
             <w:r>
-              <w:lastRenderedPageBreak/>
               <w:t>NFR-002</w:t>
             </w:r>
           </w:p>
@@ -4647,11 +4981,11 @@
       <w:pPr>
         <w:pStyle w:val="Heading2"/>
       </w:pPr>
-      <w:bookmarkStart w:id="10" w:name="_Toc239871312"/>
+      <w:bookmarkStart w:id="14" w:name="_Toc239871312"/>
       <w:r>
         <w:t>Legend:</w:t>
       </w:r>
-      <w:bookmarkEnd w:id="10"/>
+      <w:bookmarkEnd w:id="14"/>
     </w:p>
     <w:p>
       <w:r>
@@ -4665,6 +4999,7 @@
     </w:p>
     <w:p>
       <w:r>
+        <w:lastRenderedPageBreak/>
         <w:t>Source IDs: ST-1 Requester, ST-2 Service Staff, ST-3 Management, ST-4 Administrator, ST-5 Sponsor</w:t>
       </w:r>
     </w:p>
@@ -4677,7 +5012,7 @@
       <w:r>
         <w:t xml:space="preserve">Status: Baseline candidate = proposed for M1 sign-off, Baselined = approved &amp; under change control, Candidate/may defer = </w:t>
       </w:r>
-      <w:bookmarkEnd w:id="8"/>
+      <w:bookmarkEnd w:id="13"/>
       <w:r>
         <w:t>can be decided on later as more evidence is produced or could be removed all together.</w:t>
       </w:r>
@@ -4686,12 +5021,11 @@
       <w:pPr>
         <w:pStyle w:val="Heading1"/>
       </w:pPr>
-      <w:bookmarkStart w:id="11" w:name="_Toc239871313"/>
+      <w:bookmarkStart w:id="15" w:name="_Toc239871313"/>
       <w:r>
-        <w:lastRenderedPageBreak/>
         <w:t>Technical Constraints and Assumptions</w:t>
       </w:r>
-      <w:bookmarkEnd w:id="11"/>
+      <w:bookmarkEnd w:id="15"/>
     </w:p>
     <w:p>
       <w:pPr>
@@ -4730,14 +5064,14 @@
           <w:szCs w:val="22"/>
         </w:rPr>
       </w:pPr>
-      <w:bookmarkStart w:id="12" w:name="_Toc239871314"/>
+      <w:bookmarkStart w:id="16" w:name="_Toc239871314"/>
       <w:r>
         <w:rPr>
           <w:szCs w:val="24"/>
         </w:rPr>
         <w:t>Initial Architecture Strategy</w:t>
       </w:r>
-      <w:bookmarkEnd w:id="12"/>
+      <w:bookmarkEnd w:id="16"/>
     </w:p>
     <w:p>
       <w:pPr>
@@ -4765,11 +5099,12 @@
       <w:pPr>
         <w:pStyle w:val="Heading2"/>
       </w:pPr>
-      <w:bookmarkStart w:id="13" w:name="_Toc239871315"/>
+      <w:bookmarkStart w:id="17" w:name="_Toc239871315"/>
       <w:r>
+        <w:lastRenderedPageBreak/>
         <w:t>Engineering Decision Log</w:t>
       </w:r>
-      <w:bookmarkEnd w:id="13"/>
+      <w:bookmarkEnd w:id="17"/>
     </w:p>
     <w:tbl>
       <w:tblPr>
@@ -5099,12 +5434,11 @@
       <w:pPr>
         <w:pStyle w:val="Heading2"/>
       </w:pPr>
-      <w:bookmarkStart w:id="14" w:name="_Toc239871316"/>
+      <w:bookmarkStart w:id="18" w:name="_Toc239871316"/>
       <w:r>
-        <w:lastRenderedPageBreak/>
         <w:t>Technical Constraints</w:t>
       </w:r>
-      <w:bookmarkEnd w:id="14"/>
+      <w:bookmarkEnd w:id="18"/>
     </w:p>
     <w:tbl>
       <w:tblPr>
@@ -5251,11 +5585,12 @@
       <w:pPr>
         <w:pStyle w:val="Heading1"/>
       </w:pPr>
-      <w:bookmarkStart w:id="15" w:name="_Toc239871317"/>
+      <w:bookmarkStart w:id="19" w:name="_Toc239871317"/>
       <w:r>
+        <w:lastRenderedPageBreak/>
         <w:t>Risk</w:t>
       </w:r>
-      <w:bookmarkEnd w:id="15"/>
+      <w:bookmarkEnd w:id="19"/>
     </w:p>
     <w:tbl>
       <w:tblPr>
@@ -5381,13 +5716,13 @@
             <w:pPr>
               <w:pStyle w:val="Heading2"/>
             </w:pPr>
-            <w:bookmarkStart w:id="16" w:name="_Toc239800795"/>
-            <w:bookmarkStart w:id="17" w:name="_Toc239871318"/>
+            <w:bookmarkStart w:id="20" w:name="_Toc239800795"/>
+            <w:bookmarkStart w:id="21" w:name="_Toc239871318"/>
             <w:r>
               <w:t>RSK-001</w:t>
             </w:r>
-            <w:bookmarkEnd w:id="16"/>
-            <w:bookmarkEnd w:id="17"/>
+            <w:bookmarkEnd w:id="20"/>
+            <w:bookmarkEnd w:id="21"/>
           </w:p>
         </w:tc>
         <w:tc>
@@ -5471,6 +5806,7 @@
                   <w14:uncheckedState w14:val="2610" w14:font="MS Gothic"/>
                 </w14:checkbox>
               </w:sdtPr>
+              <w:sdtEndPr/>
               <w:sdtContent>
                 <w:r>
                   <w:rPr>
@@ -5494,6 +5830,7 @@
                   <w14:uncheckedState w14:val="2610" w14:font="MS Gothic"/>
                 </w14:checkbox>
               </w:sdtPr>
+              <w:sdtEndPr/>
               <w:sdtContent>
                 <w:r>
                   <w:rPr>
@@ -5517,6 +5854,7 @@
                   <w14:uncheckedState w14:val="2610" w14:font="MS Gothic"/>
                 </w14:checkbox>
               </w:sdtPr>
+              <w:sdtEndPr/>
               <w:sdtContent>
                 <w:r>
                   <w:rPr>
@@ -5556,13 +5894,13 @@
             <w:pPr>
               <w:pStyle w:val="Heading2"/>
             </w:pPr>
-            <w:bookmarkStart w:id="18" w:name="_Toc239800796"/>
-            <w:bookmarkStart w:id="19" w:name="_Toc239871319"/>
+            <w:bookmarkStart w:id="22" w:name="_Toc239800796"/>
+            <w:bookmarkStart w:id="23" w:name="_Toc239871319"/>
             <w:r>
               <w:t>RSK-002</w:t>
             </w:r>
-            <w:bookmarkEnd w:id="18"/>
-            <w:bookmarkEnd w:id="19"/>
+            <w:bookmarkEnd w:id="22"/>
+            <w:bookmarkEnd w:id="23"/>
           </w:p>
         </w:tc>
         <w:tc>
@@ -5618,11 +5956,7 @@
           </w:tcPr>
           <w:p>
             <w:r>
-              <w:t xml:space="preserve">Enforce strict 24-hour pull request reviews, modularise document sections by author, and mandate two </w:t>
-            </w:r>
-            <w:r>
-              <w:lastRenderedPageBreak/>
-              <w:t>peer approvals on GitHub before merging.</w:t>
+              <w:t>Enforce strict 24-hour pull request reviews, modularise document sections by author, and mandate two peer approvals on GitHub before merging.</w:t>
             </w:r>
           </w:p>
         </w:tc>
@@ -5632,7 +5966,6 @@
           </w:tcPr>
           <w:p>
             <w:r>
-              <w:lastRenderedPageBreak/>
               <w:t>All team members</w:t>
             </w:r>
           </w:p>
@@ -5651,6 +5984,7 @@
                   <w14:uncheckedState w14:val="2610" w14:font="MS Gothic"/>
                 </w14:checkbox>
               </w:sdtPr>
+              <w:sdtEndPr/>
               <w:sdtContent>
                 <w:r>
                   <w:rPr>
@@ -5674,6 +6008,7 @@
                   <w14:uncheckedState w14:val="2610" w14:font="MS Gothic"/>
                 </w14:checkbox>
               </w:sdtPr>
+              <w:sdtEndPr/>
               <w:sdtContent>
                 <w:r>
                   <w:rPr>
@@ -5697,6 +6032,7 @@
                   <w14:uncheckedState w14:val="2610" w14:font="MS Gothic"/>
                 </w14:checkbox>
               </w:sdtPr>
+              <w:sdtEndPr/>
               <w:sdtContent>
                 <w:r>
                   <w:rPr>
@@ -5736,13 +6072,13 @@
             <w:pPr>
               <w:pStyle w:val="Heading2"/>
             </w:pPr>
-            <w:bookmarkStart w:id="20" w:name="_Toc239800797"/>
-            <w:bookmarkStart w:id="21" w:name="_Toc239871320"/>
+            <w:bookmarkStart w:id="24" w:name="_Toc239800797"/>
+            <w:bookmarkStart w:id="25" w:name="_Toc239871320"/>
             <w:r>
               <w:t>RSK-003</w:t>
             </w:r>
-            <w:bookmarkEnd w:id="20"/>
-            <w:bookmarkEnd w:id="21"/>
+            <w:bookmarkEnd w:id="24"/>
+            <w:bookmarkEnd w:id="25"/>
           </w:p>
         </w:tc>
         <w:tc>
@@ -5768,12 +6104,19 @@
               <w:rPr>
                 <w:lang w:eastAsia="en-ZA"/>
               </w:rPr>
-              <w:t xml:space="preserve"> Attempting to build overly complex custom features beyond the minimum</w:t>
+              <w:t xml:space="preserve"> Attempting to build overly complex custom features beyond the </w:t>
             </w:r>
             <w:r>
               <w:rPr>
                 <w:lang w:eastAsia="en-ZA"/>
               </w:rPr>
+              <w:lastRenderedPageBreak/>
+              <w:t>minimum</w:t>
+            </w:r>
+            <w:r>
+              <w:rPr>
+                <w:lang w:eastAsia="en-ZA"/>
+              </w:rPr>
               <w:t xml:space="preserve"> </w:t>
             </w:r>
             <w:r>
@@ -5790,6 +6133,7 @@
           </w:tcPr>
           <w:p>
             <w:r>
+              <w:lastRenderedPageBreak/>
               <w:t>Medium</w:t>
             </w:r>
           </w:p>
@@ -5821,7 +6165,11 @@
           </w:tcPr>
           <w:p>
             <w:r>
-              <w:t>Strictly baseline core requirements in M1 and enforce formal Change Request &amp; Impact Analysis procedures for any requested scope additions.</w:t>
+              <w:t xml:space="preserve">Strictly baseline core requirements in M1 and enforce formal Change Request &amp; </w:t>
+            </w:r>
+            <w:r>
+              <w:lastRenderedPageBreak/>
+              <w:t>Impact Analysis procedures for any requested scope additions.</w:t>
             </w:r>
           </w:p>
         </w:tc>
@@ -5831,6 +6179,7 @@
           </w:tcPr>
           <w:p>
             <w:r>
+              <w:lastRenderedPageBreak/>
               <w:t>All team members</w:t>
             </w:r>
           </w:p>
@@ -5849,6 +6198,7 @@
                   <w14:uncheckedState w14:val="2610" w14:font="MS Gothic"/>
                 </w14:checkbox>
               </w:sdtPr>
+              <w:sdtEndPr/>
               <w:sdtContent>
                 <w:r>
                   <w:rPr>
@@ -5872,6 +6222,7 @@
                   <w14:uncheckedState w14:val="2610" w14:font="MS Gothic"/>
                 </w14:checkbox>
               </w:sdtPr>
+              <w:sdtEndPr/>
               <w:sdtContent>
                 <w:r>
                   <w:rPr>
@@ -5896,6 +6247,7 @@
                   <w14:uncheckedState w14:val="2610" w14:font="MS Gothic"/>
                 </w14:checkbox>
               </w:sdtPr>
+              <w:sdtEndPr/>
               <w:sdtContent>
                 <w:r>
                   <w:rPr>
@@ -5936,13 +6288,13 @@
             <w:pPr>
               <w:pStyle w:val="Heading2"/>
             </w:pPr>
-            <w:bookmarkStart w:id="22" w:name="_Toc239800798"/>
-            <w:bookmarkStart w:id="23" w:name="_Toc239871321"/>
+            <w:bookmarkStart w:id="26" w:name="_Toc239800798"/>
+            <w:bookmarkStart w:id="27" w:name="_Toc239871321"/>
             <w:r>
               <w:t>RSK-004</w:t>
             </w:r>
-            <w:bookmarkEnd w:id="22"/>
-            <w:bookmarkEnd w:id="23"/>
+            <w:bookmarkEnd w:id="26"/>
+            <w:bookmarkEnd w:id="27"/>
           </w:p>
         </w:tc>
         <w:tc>
@@ -6036,6 +6388,7 @@
                   <w14:uncheckedState w14:val="2610" w14:font="MS Gothic"/>
                 </w14:checkbox>
               </w:sdtPr>
+              <w:sdtEndPr/>
               <w:sdtContent>
                 <w:r>
                   <w:rPr>
@@ -6059,6 +6412,7 @@
                   <w14:uncheckedState w14:val="2610" w14:font="MS Gothic"/>
                 </w14:checkbox>
               </w:sdtPr>
+              <w:sdtEndPr/>
               <w:sdtContent>
                 <w:r>
                   <w:rPr>
@@ -6082,6 +6436,7 @@
                   <w14:uncheckedState w14:val="2610" w14:font="MS Gothic"/>
                 </w14:checkbox>
               </w:sdtPr>
+              <w:sdtEndPr/>
               <w:sdtContent>
                 <w:r>
                   <w:rPr>
@@ -6121,14 +6476,13 @@
             <w:pPr>
               <w:pStyle w:val="Heading2"/>
             </w:pPr>
-            <w:bookmarkStart w:id="24" w:name="_Toc239800799"/>
-            <w:bookmarkStart w:id="25" w:name="_Toc239871322"/>
-            <w:r>
-              <w:lastRenderedPageBreak/>
+            <w:bookmarkStart w:id="28" w:name="_Toc239800799"/>
+            <w:bookmarkStart w:id="29" w:name="_Toc239871322"/>
+            <w:r>
               <w:t>RSK-005</w:t>
             </w:r>
-            <w:bookmarkEnd w:id="24"/>
-            <w:bookmarkEnd w:id="25"/>
+            <w:bookmarkEnd w:id="28"/>
+            <w:bookmarkEnd w:id="29"/>
           </w:p>
         </w:tc>
         <w:tc>
@@ -6197,17 +6551,8 @@
                 <w:rStyle w:val="HTMLCode"/>
                 <w:rFonts w:eastAsiaTheme="minorHAnsi"/>
               </w:rPr>
-              <w:t>.</w:t>
-            </w:r>
-            <w:proofErr w:type="spellStart"/>
-            <w:r>
-              <w:rPr>
-                <w:rStyle w:val="HTMLCode"/>
-                <w:rFonts w:eastAsiaTheme="minorHAnsi"/>
-              </w:rPr>
-              <w:t>gitignore</w:t>
-            </w:r>
-            <w:proofErr w:type="spellEnd"/>
+              <w:t>.gitignore</w:t>
+            </w:r>
             <w:r>
               <w:t xml:space="preserve"> from day one, use environment variables,  and run automated secret-scanning pre-commit checks.</w:t>
             </w:r>
@@ -6237,6 +6582,7 @@
                   <w14:uncheckedState w14:val="2610" w14:font="MS Gothic"/>
                 </w14:checkbox>
               </w:sdtPr>
+              <w:sdtEndPr/>
               <w:sdtContent>
                 <w:r>
                   <w:rPr>
@@ -6260,6 +6606,7 @@
                   <w14:uncheckedState w14:val="2610" w14:font="MS Gothic"/>
                 </w14:checkbox>
               </w:sdtPr>
+              <w:sdtEndPr/>
               <w:sdtContent>
                 <w:r>
                   <w:rPr>
@@ -6283,6 +6630,7 @@
                   <w14:uncheckedState w14:val="2610" w14:font="MS Gothic"/>
                 </w14:checkbox>
               </w:sdtPr>
+              <w:sdtEndPr/>
               <w:sdtContent>
                 <w:r>
                   <w:rPr>
@@ -6322,13 +6670,13 @@
             <w:pPr>
               <w:pStyle w:val="Heading2"/>
             </w:pPr>
-            <w:bookmarkStart w:id="26" w:name="_Toc239800800"/>
-            <w:bookmarkStart w:id="27" w:name="_Toc239871323"/>
+            <w:bookmarkStart w:id="30" w:name="_Toc239800800"/>
+            <w:bookmarkStart w:id="31" w:name="_Toc239871323"/>
             <w:r>
               <w:t>RSK-006</w:t>
             </w:r>
-            <w:bookmarkEnd w:id="26"/>
-            <w:bookmarkEnd w:id="27"/>
+            <w:bookmarkEnd w:id="30"/>
+            <w:bookmarkEnd w:id="31"/>
           </w:p>
         </w:tc>
         <w:tc>
@@ -6350,7 +6698,11 @@
               <w:t>Inconsistent Environment:</w:t>
             </w:r>
             <w:r>
-              <w:t xml:space="preserve"> Code runs correctly on a developer's local machine but fails in Staging or Production environments due to configuration drift.</w:t>
+              <w:t xml:space="preserve"> Code runs correctly </w:t>
+            </w:r>
+            <w:r>
+              <w:lastRenderedPageBreak/>
+              <w:t>on a developer's local machine but fails in Staging or Production environments due to configuration drift.</w:t>
             </w:r>
           </w:p>
         </w:tc>
@@ -6360,6 +6712,7 @@
           </w:tcPr>
           <w:p>
             <w:r>
+              <w:lastRenderedPageBreak/>
               <w:t>Medium</w:t>
             </w:r>
           </w:p>
@@ -6390,7 +6743,11 @@
           </w:tcPr>
           <w:p>
             <w:r>
-              <w:t>Containerise application dependencies using Docker or maintain strict environment configuration files early in M2/M3.</w:t>
+              <w:t xml:space="preserve">Containerise application dependencies </w:t>
+            </w:r>
+            <w:r>
+              <w:lastRenderedPageBreak/>
+              <w:t>using Docker or maintain strict environment configuration files early in M2/M3.</w:t>
             </w:r>
           </w:p>
         </w:tc>
@@ -6400,6 +6757,7 @@
           </w:tcPr>
           <w:p>
             <w:r>
+              <w:lastRenderedPageBreak/>
               <w:t>All team members</w:t>
             </w:r>
           </w:p>
@@ -6418,6 +6776,7 @@
                   <w14:uncheckedState w14:val="2610" w14:font="MS Gothic"/>
                 </w14:checkbox>
               </w:sdtPr>
+              <w:sdtEndPr/>
               <w:sdtContent>
                 <w:r>
                   <w:rPr>
@@ -6441,6 +6800,7 @@
                   <w14:uncheckedState w14:val="2610" w14:font="MS Gothic"/>
                 </w14:checkbox>
               </w:sdtPr>
+              <w:sdtEndPr/>
               <w:sdtContent>
                 <w:r>
                   <w:rPr>
@@ -6464,6 +6824,7 @@
                   <w14:uncheckedState w14:val="2610" w14:font="MS Gothic"/>
                 </w14:checkbox>
               </w:sdtPr>
+              <w:sdtEndPr/>
               <w:sdtContent>
                 <w:r>
                   <w:rPr>
@@ -6505,20 +6866,278 @@
       <w:pPr>
         <w:pStyle w:val="Heading1"/>
       </w:pPr>
-      <w:bookmarkStart w:id="28" w:name="_Toc239871324"/>
+      <w:bookmarkStart w:id="32" w:name="_Toc239871324"/>
       <w:r>
         <w:lastRenderedPageBreak/>
         <w:t>Process</w:t>
       </w:r>
-      <w:bookmarkEnd w:id="28"/>
+      <w:bookmarkEnd w:id="32"/>
     </w:p>
+    <w:p/>
+    <w:p>
+      <w:pPr>
+        <w:pStyle w:val="Heading1"/>
+      </w:pPr>
+      <w:r>
+        <w:t>Baseline Sign-Off</w:t>
+      </w:r>
+    </w:p>
+    <w:tbl>
+      <w:tblPr>
+        <w:tblStyle w:val="TableGrid"/>
+        <w:tblW w:w="0" w:type="auto"/>
+        <w:tblLook w:val="04A0" w:firstRow="1" w:lastRow="0" w:firstColumn="1" w:lastColumn="0" w:noHBand="0" w:noVBand="1"/>
+      </w:tblPr>
+      <w:tblGrid>
+        <w:gridCol w:w="4508"/>
+        <w:gridCol w:w="4508"/>
+      </w:tblGrid>
+      <w:tr>
+        <w:trPr>
+          <w:cantSplit/>
+        </w:trPr>
+        <w:tc>
+          <w:tcPr>
+            <w:tcW w:w="4508" w:type="dxa"/>
+          </w:tcPr>
+          <w:p>
+            <w:r>
+              <w:rPr>
+                <w:szCs w:val="22"/>
+                <w:lang w:val="en-ZA"/>
+              </w:rPr>
+              <w:t>Project</w:t>
+            </w:r>
+          </w:p>
+        </w:tc>
+        <w:tc>
+          <w:tcPr>
+            <w:tcW w:w="4508" w:type="dxa"/>
+          </w:tcPr>
+          <w:p>
+            <w:r>
+              <w:t>CivicConnect</w:t>
+            </w:r>
+          </w:p>
+        </w:tc>
+      </w:tr>
+      <w:tr>
+        <w:trPr>
+          <w:cantSplit/>
+        </w:trPr>
+        <w:tc>
+          <w:tcPr>
+            <w:tcW w:w="4508" w:type="dxa"/>
+          </w:tcPr>
+          <w:p>
+            <w:r>
+              <w:t>Baseline Type</w:t>
+            </w:r>
+          </w:p>
+        </w:tc>
+        <w:tc>
+          <w:tcPr>
+            <w:tcW w:w="4508" w:type="dxa"/>
+          </w:tcPr>
+          <w:p>
+            <w:r>
+              <w:t>Milestone 1</w:t>
+            </w:r>
+          </w:p>
+        </w:tc>
+      </w:tr>
+      <w:tr>
+        <w:trPr>
+          <w:cantSplit/>
+        </w:trPr>
+        <w:tc>
+          <w:tcPr>
+            <w:tcW w:w="4508" w:type="dxa"/>
+          </w:tcPr>
+          <w:p>
+            <w:r>
+              <w:t>Version</w:t>
+            </w:r>
+          </w:p>
+        </w:tc>
+        <w:tc>
+          <w:tcPr>
+            <w:tcW w:w="4508" w:type="dxa"/>
+          </w:tcPr>
+          <w:p>
+            <w:r>
+              <w:t>v</w:t>
+            </w:r>
+            <w:r>
+              <w:t>1.5</w:t>
+            </w:r>
+          </w:p>
+        </w:tc>
+      </w:tr>
+      <w:tr>
+        <w:trPr>
+          <w:cantSplit/>
+        </w:trPr>
+        <w:tc>
+          <w:tcPr>
+            <w:tcW w:w="4508" w:type="dxa"/>
+          </w:tcPr>
+          <w:p>
+            <w:r>
+              <w:t>Date</w:t>
+            </w:r>
+          </w:p>
+        </w:tc>
+        <w:tc>
+          <w:tcPr>
+            <w:tcW w:w="4508" w:type="dxa"/>
+          </w:tcPr>
+          <w:p>
+            <w:r>
+              <w:t>09/09/2026</w:t>
+            </w:r>
+          </w:p>
+        </w:tc>
+      </w:tr>
+      <w:tr>
+        <w:trPr>
+          <w:cantSplit/>
+        </w:trPr>
+        <w:tc>
+          <w:tcPr>
+            <w:tcW w:w="4508" w:type="dxa"/>
+          </w:tcPr>
+          <w:p>
+            <w:r>
+              <w:t>Scope Reviewed</w:t>
+            </w:r>
+          </w:p>
+        </w:tc>
+        <w:tc>
+          <w:tcPr>
+            <w:tcW w:w="4508" w:type="dxa"/>
+          </w:tcPr>
+          <w:p>
+            <w:r>
+              <w:t>Yes</w:t>
+            </w:r>
+          </w:p>
+        </w:tc>
+      </w:tr>
+      <w:tr>
+        <w:trPr>
+          <w:cantSplit/>
+        </w:trPr>
+        <w:tc>
+          <w:tcPr>
+            <w:tcW w:w="4508" w:type="dxa"/>
+          </w:tcPr>
+          <w:p>
+            <w:r>
+              <w:t>Requirements / Trac</w:t>
+            </w:r>
+            <w:r>
+              <w:t>e</w:t>
+            </w:r>
+            <w:r>
+              <w:t>abilities checked</w:t>
+            </w:r>
+          </w:p>
+        </w:tc>
+        <w:tc>
+          <w:tcPr>
+            <w:tcW w:w="4508" w:type="dxa"/>
+          </w:tcPr>
+          <w:p>
+            <w:r>
+              <w:t>Yes</w:t>
+            </w:r>
+          </w:p>
+        </w:tc>
+      </w:tr>
+      <w:tr>
+        <w:trPr>
+          <w:cantSplit/>
+        </w:trPr>
+        <w:tc>
+          <w:tcPr>
+            <w:tcW w:w="4508" w:type="dxa"/>
+          </w:tcPr>
+          <w:p>
+            <w:r>
+              <w:t>Risk Review Completed</w:t>
+            </w:r>
+          </w:p>
+        </w:tc>
+        <w:tc>
+          <w:tcPr>
+            <w:tcW w:w="4508" w:type="dxa"/>
+          </w:tcPr>
+          <w:p>
+            <w:r>
+              <w:t>Yes</w:t>
+            </w:r>
+          </w:p>
+        </w:tc>
+      </w:tr>
+      <w:tr>
+        <w:trPr>
+          <w:cantSplit/>
+        </w:trPr>
+        <w:tc>
+          <w:tcPr>
+            <w:tcW w:w="4508" w:type="dxa"/>
+          </w:tcPr>
+          <w:p>
+            <w:r>
+              <w:t>Repository / Governance controls checked</w:t>
+            </w:r>
+          </w:p>
+        </w:tc>
+        <w:tc>
+          <w:tcPr>
+            <w:tcW w:w="4508" w:type="dxa"/>
+          </w:tcPr>
+          <w:p>
+            <w:r>
+              <w:t>Yes</w:t>
+            </w:r>
+          </w:p>
+        </w:tc>
+      </w:tr>
+      <w:tr>
+        <w:trPr>
+          <w:cantSplit/>
+        </w:trPr>
+        <w:tc>
+          <w:tcPr>
+            <w:tcW w:w="4508" w:type="dxa"/>
+          </w:tcPr>
+          <w:p>
+            <w:r>
+              <w:t>Outcome</w:t>
+            </w:r>
+          </w:p>
+        </w:tc>
+        <w:tc>
+          <w:tcPr>
+            <w:tcW w:w="4508" w:type="dxa"/>
+          </w:tcPr>
+          <w:p>
+            <w:r>
+              <w:t>Accepted</w:t>
+            </w:r>
+          </w:p>
+        </w:tc>
+      </w:tr>
+    </w:tbl>
     <w:p/>
     <w:p>
       <w:r>
         <w:br w:type="page"/>
       </w:r>
     </w:p>
-    <w:bookmarkStart w:id="29" w:name="_Toc239871325" w:displacedByCustomXml="next"/>
+    <w:bookmarkStart w:id="33" w:name="_Toc239871325" w:displacedByCustomXml="next"/>
     <w:sdt>
       <w:sdtPr>
         <w:rPr>
@@ -6532,7 +7151,11 @@
           <w:docPartUnique/>
         </w:docPartObj>
       </w:sdtPr>
-      <w:sdtEndPr/>
+      <w:sdtEndPr>
+        <w:rPr>
+          <w:u w:val="none"/>
+        </w:rPr>
+      </w:sdtEndPr>
       <w:sdtContent>
         <w:p>
           <w:pPr>
@@ -6541,7 +7164,7 @@
           <w:r>
             <w:t>References</w:t>
           </w:r>
-          <w:bookmarkEnd w:id="29"/>
+          <w:bookmarkEnd w:id="33"/>
         </w:p>
         <w:sdt>
           <w:sdtPr>
@@ -6655,7 +7278,7 @@
   <w:endnote w:type="separator" w:id="-1">
     <w:p>
       <w:pPr>
-        <w:spacing w:before="0" w:after="0" w:line="240" w:lineRule="auto"/>
+        <w:spacing w:line="240" w:lineRule="auto"/>
       </w:pPr>
       <w:r>
         <w:separator/>
@@ -6665,7 +7288,7 @@
   <w:endnote w:type="continuationSeparator" w:id="0">
     <w:p>
       <w:pPr>
-        <w:spacing w:before="0" w:after="0" w:line="240" w:lineRule="auto"/>
+        <w:spacing w:line="240" w:lineRule="auto"/>
       </w:pPr>
       <w:r>
         <w:continuationSeparator/>
@@ -6730,6 +7353,7 @@
           <w:dataBinding w:prefixMappings="xmlns:ns0='http://purl.org/dc/elements/1.1/' xmlns:ns1='http://schemas.openxmlformats.org/package/2006/metadata/core-properties' " w:xpath="/ns1:coreProperties[1]/ns0:creator[1]" w:storeItemID="{6C3C8BC8-F283-45AE-878A-BAB7291924A1}"/>
           <w:text/>
         </w:sdtPr>
+        <w:sdtEndPr/>
         <w:sdtContent>
           <w:tc>
             <w:tcPr>
@@ -6810,7 +7434,7 @@
   <w:footnote w:type="separator" w:id="-1">
     <w:p>
       <w:pPr>
-        <w:spacing w:before="0" w:after="0" w:line="240" w:lineRule="auto"/>
+        <w:spacing w:line="240" w:lineRule="auto"/>
       </w:pPr>
       <w:r>
         <w:separator/>
@@ -6820,7 +7444,7 @@
   <w:footnote w:type="continuationSeparator" w:id="0">
     <w:p>
       <w:pPr>
-        <w:spacing w:before="0" w:after="0" w:line="240" w:lineRule="auto"/>
+        <w:spacing w:line="240" w:lineRule="auto"/>
       </w:pPr>
       <w:r>
         <w:continuationSeparator/>
@@ -7582,9 +8206,9 @@
   <w:style w:type="paragraph" w:default="1" w:styleId="Normal">
     <w:name w:val="Normal"/>
     <w:qFormat/>
-    <w:rsid w:val="00A16726"/>
+    <w:rsid w:val="00BA0885"/>
     <w:pPr>
-      <w:spacing w:before="120" w:after="120" w:line="360" w:lineRule="auto"/>
+      <w:spacing w:before="0" w:after="0" w:line="360" w:lineRule="auto"/>
     </w:pPr>
     <w:rPr>
       <w:rFonts w:ascii="Times New Roman" w:hAnsi="Times New Roman"/>
@@ -7598,16 +8222,18 @@
     <w:link w:val="Heading1Char"/>
     <w:uiPriority w:val="9"/>
     <w:qFormat/>
-    <w:rsid w:val="00051408"/>
+    <w:rsid w:val="00BA0885"/>
     <w:pPr>
       <w:keepNext/>
       <w:keepLines/>
+      <w:spacing w:before="120" w:after="120"/>
       <w:outlineLvl w:val="0"/>
     </w:pPr>
     <w:rPr>
       <w:rFonts w:eastAsiaTheme="majorEastAsia" w:cstheme="majorBidi"/>
       <w:sz w:val="32"/>
       <w:szCs w:val="40"/>
+      <w:u w:val="single"/>
     </w:rPr>
   </w:style>
   <w:style w:type="paragraph" w:styleId="Heading2">
@@ -7618,7 +8244,7 @@
     <w:uiPriority w:val="9"/>
     <w:unhideWhenUsed/>
     <w:qFormat/>
-    <w:rsid w:val="00F97AE4"/>
+    <w:rsid w:val="00BA0885"/>
     <w:pPr>
       <w:outlineLvl w:val="1"/>
     </w:pPr>
@@ -7707,7 +8333,7 @@
     <w:pPr>
       <w:keepNext/>
       <w:keepLines/>
-      <w:spacing w:before="40" w:after="0"/>
+      <w:spacing w:before="40"/>
       <w:outlineLvl w:val="5"/>
     </w:pPr>
     <w:rPr>
@@ -7730,7 +8356,7 @@
     <w:pPr>
       <w:keepNext/>
       <w:keepLines/>
-      <w:spacing w:before="40" w:after="0"/>
+      <w:spacing w:before="40"/>
       <w:outlineLvl w:val="6"/>
     </w:pPr>
     <w:rPr>
@@ -7751,7 +8377,6 @@
     <w:pPr>
       <w:keepNext/>
       <w:keepLines/>
-      <w:spacing w:before="0" w:after="0"/>
       <w:outlineLvl w:val="7"/>
     </w:pPr>
     <w:rPr>
@@ -7774,7 +8399,6 @@
     <w:pPr>
       <w:keepNext/>
       <w:keepLines/>
-      <w:spacing w:before="0" w:after="0"/>
       <w:outlineLvl w:val="8"/>
     </w:pPr>
     <w:rPr>
@@ -7814,11 +8438,12 @@
     <w:basedOn w:val="DefaultParagraphFont"/>
     <w:link w:val="Heading2"/>
     <w:uiPriority w:val="9"/>
-    <w:rsid w:val="00F97AE4"/>
+    <w:rsid w:val="00BA0885"/>
     <w:rPr>
-      <w:rFonts w:ascii="Arial" w:eastAsiaTheme="majorEastAsia" w:hAnsi="Arial" w:cs="Arial"/>
+      <w:rFonts w:ascii="Times New Roman" w:eastAsiaTheme="majorEastAsia" w:hAnsi="Times New Roman" w:cs="Arial"/>
       <w:sz w:val="24"/>
       <w:szCs w:val="32"/>
+      <w:u w:val="single"/>
     </w:rPr>
   </w:style>
   <w:style w:type="character" w:customStyle="1" w:styleId="Heading1Char">
@@ -7826,11 +8451,12 @@
     <w:basedOn w:val="DefaultParagraphFont"/>
     <w:link w:val="Heading1"/>
     <w:uiPriority w:val="9"/>
-    <w:rsid w:val="00051408"/>
+    <w:rsid w:val="00BA0885"/>
     <w:rPr>
-      <w:rFonts w:ascii="Arial" w:eastAsiaTheme="majorEastAsia" w:hAnsi="Arial" w:cstheme="majorBidi"/>
+      <w:rFonts w:ascii="Times New Roman" w:eastAsiaTheme="majorEastAsia" w:hAnsi="Times New Roman" w:cstheme="majorBidi"/>
       <w:sz w:val="32"/>
       <w:szCs w:val="40"/>
+      <w:u w:val="single"/>
     </w:rPr>
   </w:style>
   <w:style w:type="character" w:customStyle="1" w:styleId="Heading3Char">
@@ -7939,7 +8565,7 @@
     <w:qFormat/>
     <w:rsid w:val="00B46809"/>
     <w:pPr>
-      <w:spacing w:before="0" w:after="80" w:line="240" w:lineRule="auto"/>
+      <w:spacing w:after="80" w:line="240" w:lineRule="auto"/>
       <w:contextualSpacing/>
     </w:pPr>
     <w:rPr>
@@ -8354,7 +8980,7 @@
         <w:tab w:val="center" w:pos="4513"/>
         <w:tab w:val="right" w:pos="9026"/>
       </w:tabs>
-      <w:spacing w:before="0" w:after="0" w:line="240" w:lineRule="auto"/>
+      <w:spacing w:line="240" w:lineRule="auto"/>
     </w:pPr>
   </w:style>
   <w:style w:type="character" w:customStyle="1" w:styleId="HeaderChar">
@@ -8380,7 +9006,7 @@
         <w:tab w:val="center" w:pos="4513"/>
         <w:tab w:val="right" w:pos="9026"/>
       </w:tabs>
-      <w:spacing w:before="0" w:after="0" w:line="240" w:lineRule="auto"/>
+      <w:spacing w:line="240" w:lineRule="auto"/>
     </w:pPr>
   </w:style>
   <w:style w:type="character" w:customStyle="1" w:styleId="FooterChar">
@@ -8411,6 +9037,21 @@
     <w:uiPriority w:val="37"/>
     <w:unhideWhenUsed/>
     <w:rsid w:val="00880D7D"/>
+  </w:style>
+  <w:style w:type="paragraph" w:customStyle="1" w:styleId="isselectedend">
+    <w:name w:val="isselectedend"/>
+    <w:basedOn w:val="Normal"/>
+    <w:rsid w:val="00BA0885"/>
+    <w:pPr>
+      <w:spacing w:before="100" w:beforeAutospacing="1" w:after="100" w:afterAutospacing="1" w:line="240" w:lineRule="auto"/>
+    </w:pPr>
+    <w:rPr>
+      <w:rFonts w:eastAsia="Times New Roman" w:cs="Times New Roman"/>
+      <w:kern w:val="0"/>
+      <w:szCs w:val="24"/>
+      <w:lang w:eastAsia="en-ZA"/>
+      <w14:ligatures w14:val="none"/>
+    </w:rPr>
   </w:style>
 </w:styles>
 </file>
@@ -8524,6 +9165,8 @@
   </w:compat>
   <w:rsids>
     <w:rsidRoot w:val="007C611A"/>
+    <w:rsid w:val="000E4D79"/>
+    <w:rsid w:val="005C1382"/>
     <w:rsid w:val="007C611A"/>
     <w:rsid w:val="00C30A39"/>
     <w:rsid w:val="00D44B7F"/>

</xml_diff>